<commit_message>
Atualização da Documentação - Atualização dos tópicos Wireframe e Protótipo, Identidade Visual e Cronograma
</commit_message>
<xml_diff>
--- a/Documentação/Segunda Edição/TCC - Documentação.docx
+++ b/Documentação/Segunda Edição/TCC - Documentação.docx
@@ -1,6 +1,6 @@
 
 <file path=word/document.xml><?xml version="1.0" encoding="utf-8"?>
-<w:document xmlns:wpc="http://schemas.microsoft.com/office/word/2010/wordprocessingCanvas" xmlns:cx="http://schemas.microsoft.com/office/drawing/2014/chartex" xmlns:cx1="http://schemas.microsoft.com/office/drawing/2015/9/8/chartex" xmlns:cx2="http://schemas.microsoft.com/office/drawing/2015/10/21/chartex" xmlns:cx3="http://schemas.microsoft.com/office/drawing/2016/5/9/chartex" xmlns:cx4="http://schemas.microsoft.com/office/drawing/2016/5/10/chartex" xmlns:cx5="http://schemas.microsoft.com/office/drawing/2016/5/11/chartex" xmlns:cx6="http://schemas.microsoft.com/office/drawing/2016/5/12/chartex" xmlns:cx7="http://schemas.microsoft.com/office/drawing/2016/5/13/chartex" xmlns:cx8="http://schemas.microsoft.com/office/drawing/2016/5/14/chartex" xmlns:mc="http://schemas.openxmlformats.org/markup-compatibility/2006" xmlns:aink="http://schemas.microsoft.com/office/drawing/2016/ink" xmlns:am3d="http://schemas.microsoft.com/office/drawing/2017/model3d" xmlns:o="urn:schemas-microsoft-com:office:office" xmlns:oel="http://schemas.microsoft.com/office/2019/extlst" xmlns:r="http://schemas.openxmlformats.org/officeDocument/2006/relationships" xmlns:m="http://schemas.openxmlformats.org/officeDocument/2006/math" xmlns:v="urn:schemas-microsoft-com:vml" xmlns:wp14="http://schemas.microsoft.com/office/word/2010/wordprocessingDrawing" xmlns:wp="http://schemas.openxmlformats.org/drawingml/2006/wordprocessingDrawing" xmlns:w10="urn:schemas-microsoft-com:office:word" xmlns:w="http://schemas.openxmlformats.org/wordprocessingml/2006/main" xmlns:w14="http://schemas.microsoft.com/office/word/2010/wordml" xmlns:w15="http://schemas.microsoft.com/office/word/2012/wordml" xmlns:w16cex="http://schemas.microsoft.com/office/word/2018/wordml/cex" xmlns:w16cid="http://schemas.microsoft.com/office/word/2016/wordml/cid" xmlns:w16="http://schemas.microsoft.com/office/word/2018/wordml" xmlns:w16du="http://schemas.microsoft.com/office/word/2023/wordml/word16du" xmlns:w16sdtdh="http://schemas.microsoft.com/office/word/2020/wordml/sdtdatahash" xmlns:w16sdtfl="http://schemas.microsoft.com/office/word/2024/wordml/sdtformatlock" xmlns:w16se="http://schemas.microsoft.com/office/word/2015/wordml/symex" xmlns:wpg="http://schemas.microsoft.com/office/word/2010/wordprocessingGroup" xmlns:wpi="http://schemas.microsoft.com/office/word/2010/wordprocessingInk" xmlns:wne="http://schemas.microsoft.com/office/word/2006/wordml" xmlns:wps="http://schemas.microsoft.com/office/word/2010/wordprocessingShape" mc:Ignorable="w14 w15 w16se w16cid w16 w16cex w16sdtdh w16sdtfl w16du wp14">
+<w:document xmlns:wpc="http://schemas.microsoft.com/office/word/2010/wordprocessingCanvas" xmlns:cx="http://schemas.microsoft.com/office/drawing/2014/chartex" xmlns:mc="http://schemas.openxmlformats.org/markup-compatibility/2006" xmlns:o="urn:schemas-microsoft-com:office:office" xmlns:r="http://schemas.openxmlformats.org/officeDocument/2006/relationships" xmlns:m="http://schemas.openxmlformats.org/officeDocument/2006/math" xmlns:v="urn:schemas-microsoft-com:vml" xmlns:wp14="http://schemas.microsoft.com/office/word/2010/wordprocessingDrawing" xmlns:wp="http://schemas.openxmlformats.org/drawingml/2006/wordprocessingDrawing" xmlns:w10="urn:schemas-microsoft-com:office:word" xmlns:w="http://schemas.openxmlformats.org/wordprocessingml/2006/main" xmlns:w14="http://schemas.microsoft.com/office/word/2010/wordml" xmlns:w15="http://schemas.microsoft.com/office/word/2012/wordml" xmlns:w16se="http://schemas.microsoft.com/office/word/2015/wordml/symex" xmlns:wpg="http://schemas.microsoft.com/office/word/2010/wordprocessingGroup" xmlns:wpi="http://schemas.microsoft.com/office/word/2010/wordprocessingInk" xmlns:wne="http://schemas.microsoft.com/office/word/2006/wordml" xmlns:wps="http://schemas.microsoft.com/office/word/2010/wordprocessingShape" mc:Ignorable="w14 w15 w16se wp14">
   <w:body>
     <w:p>
       <w:pPr>
@@ -100,7 +100,13 @@
         <w:rPr>
           <w:szCs w:val="24"/>
         </w:rPr>
-        <w:t>IGOR DE OLIVEIRA BERNARDO</w:t>
+        <w:t>IG</w:t>
+      </w:r>
+      <w:r>
+        <w:rPr>
+          <w:szCs w:val="24"/>
+        </w:rPr>
+        <w:t>OR DE OLIVEIRA BERNARDO</w:t>
       </w:r>
     </w:p>
     <w:p>
@@ -608,7 +614,35 @@
         <w:rPr>
           <w:szCs w:val="24"/>
         </w:rPr>
-        <w:t xml:space="preserve"> Escola Técnica Estadual Ilza Nascimento Pintus como requisito para conclusão do curso de Desenvolvimento de Sistemas</w:t>
+        <w:t xml:space="preserve"> Escola Técnica Estadual </w:t>
+      </w:r>
+      <w:proofErr w:type="spellStart"/>
+      <w:r>
+        <w:rPr>
+          <w:szCs w:val="24"/>
+        </w:rPr>
+        <w:t>Ilza</w:t>
+      </w:r>
+      <w:proofErr w:type="spellEnd"/>
+      <w:r>
+        <w:rPr>
+          <w:szCs w:val="24"/>
+        </w:rPr>
+        <w:t xml:space="preserve"> Nascimento </w:t>
+      </w:r>
+      <w:proofErr w:type="spellStart"/>
+      <w:r>
+        <w:rPr>
+          <w:szCs w:val="24"/>
+        </w:rPr>
+        <w:t>Pintus</w:t>
+      </w:r>
+      <w:proofErr w:type="spellEnd"/>
+      <w:r>
+        <w:rPr>
+          <w:szCs w:val="24"/>
+        </w:rPr>
+        <w:t xml:space="preserve"> como requisito para conclusão do curso de Desenvolvimento de Sistemas</w:t>
       </w:r>
     </w:p>
     <w:p>
@@ -632,7 +666,21 @@
         <w:rPr>
           <w:szCs w:val="24"/>
         </w:rPr>
-        <w:t>Orientador: Prof. Cláudio Lopes Ferrini Garcia</w:t>
+        <w:t xml:space="preserve">Orientador: Prof. Cláudio Lopes </w:t>
+      </w:r>
+      <w:proofErr w:type="spellStart"/>
+      <w:r>
+        <w:rPr>
+          <w:szCs w:val="24"/>
+        </w:rPr>
+        <w:t>Ferrini</w:t>
+      </w:r>
+      <w:proofErr w:type="spellEnd"/>
+      <w:r>
+        <w:rPr>
+          <w:szCs w:val="24"/>
+        </w:rPr>
+        <w:t xml:space="preserve"> Garcia</w:t>
       </w:r>
     </w:p>
     <w:p>
@@ -873,7 +921,49 @@
         <w:rPr>
           <w:szCs w:val="24"/>
         </w:rPr>
-        <w:t xml:space="preserve">o exploratório, o descritivo e o aplicado, combinando pesquisas bibliográficas com o desenvolvimento incremental do sistema. O projeto adota tecnologias como Node.js com Express.js no back-end, HTML, CSS e JavaScript no front-end, e MySQL como banco de dados. </w:t>
+        <w:t xml:space="preserve">o exploratório, o descritivo e o aplicado, combinando pesquisas bibliográficas com o desenvolvimento incremental do sistema. O projeto adota tecnologias como Node.js com Express.js no </w:t>
+      </w:r>
+      <w:proofErr w:type="spellStart"/>
+      <w:r>
+        <w:rPr>
+          <w:szCs w:val="24"/>
+        </w:rPr>
+        <w:t>back-end</w:t>
+      </w:r>
+      <w:proofErr w:type="spellEnd"/>
+      <w:r>
+        <w:rPr>
+          <w:szCs w:val="24"/>
+        </w:rPr>
+        <w:t xml:space="preserve">, HTML, CSS e </w:t>
+      </w:r>
+      <w:proofErr w:type="spellStart"/>
+      <w:r>
+        <w:rPr>
+          <w:szCs w:val="24"/>
+        </w:rPr>
+        <w:t>JavaScript</w:t>
+      </w:r>
+      <w:proofErr w:type="spellEnd"/>
+      <w:r>
+        <w:rPr>
+          <w:szCs w:val="24"/>
+        </w:rPr>
+        <w:t xml:space="preserve"> no front-</w:t>
+      </w:r>
+      <w:proofErr w:type="spellStart"/>
+      <w:r>
+        <w:rPr>
+          <w:szCs w:val="24"/>
+        </w:rPr>
+        <w:t>end</w:t>
+      </w:r>
+      <w:proofErr w:type="spellEnd"/>
+      <w:r>
+        <w:rPr>
+          <w:szCs w:val="24"/>
+        </w:rPr>
+        <w:t xml:space="preserve">, e MySQL como banco de dados. </w:t>
       </w:r>
       <w:r>
         <w:rPr>
@@ -1822,6 +1912,14 @@
           <w:szCs w:val="24"/>
         </w:rPr>
         <w:t>13 WIREFRAMES</w:t>
+      </w:r>
+      <w:r>
+        <w:rPr>
+          <w:b/>
+          <w:bCs/>
+          <w:szCs w:val="24"/>
+        </w:rPr>
+        <w:t xml:space="preserve"> E PROTOTIPAÇÃO</w:t>
       </w:r>
       <w:r>
         <w:rPr>
@@ -2129,7 +2227,35 @@
         <w:rPr>
           <w:szCs w:val="24"/>
         </w:rPr>
-        <w:t>O sistema foi idealizado para substituir os processos manuais por uma solução digital acessível, segura e de fácil utilização. Além da versão web, está prevista a adaptação da aplicação para dispositivos móveis por meio do conceito de Progressive Web App (PWA), tornando o sistema ainda mais acessível para equipes que atuam em campo.</w:t>
+        <w:t xml:space="preserve">O sistema foi idealizado para substituir os processos manuais por uma solução digital acessível, segura e de fácil utilização. Além da versão web, está prevista a adaptação da aplicação para dispositivos móveis por meio do conceito de </w:t>
+      </w:r>
+      <w:proofErr w:type="spellStart"/>
+      <w:r>
+        <w:rPr>
+          <w:szCs w:val="24"/>
+        </w:rPr>
+        <w:t>Progressive</w:t>
+      </w:r>
+      <w:proofErr w:type="spellEnd"/>
+      <w:r>
+        <w:rPr>
+          <w:szCs w:val="24"/>
+        </w:rPr>
+        <w:t xml:space="preserve"> Web </w:t>
+      </w:r>
+      <w:proofErr w:type="spellStart"/>
+      <w:r>
+        <w:rPr>
+          <w:szCs w:val="24"/>
+        </w:rPr>
+        <w:t>App</w:t>
+      </w:r>
+      <w:proofErr w:type="spellEnd"/>
+      <w:r>
+        <w:rPr>
+          <w:szCs w:val="24"/>
+        </w:rPr>
+        <w:t xml:space="preserve"> (PWA), tornando o sistema ainda mais acessível para equipes que atuam em campo.</w:t>
       </w:r>
     </w:p>
     <w:p>
@@ -2259,7 +2385,35 @@
         <w:rPr>
           <w:szCs w:val="24"/>
         </w:rPr>
-        <w:t>Davi Delmondes Machado - Scrum Master</w:t>
+        <w:t xml:space="preserve">Davi </w:t>
+      </w:r>
+      <w:proofErr w:type="spellStart"/>
+      <w:r>
+        <w:rPr>
+          <w:szCs w:val="24"/>
+        </w:rPr>
+        <w:t>Delmondes</w:t>
+      </w:r>
+      <w:proofErr w:type="spellEnd"/>
+      <w:r>
+        <w:rPr>
+          <w:szCs w:val="24"/>
+        </w:rPr>
+        <w:t xml:space="preserve"> Machado - </w:t>
+      </w:r>
+      <w:proofErr w:type="spellStart"/>
+      <w:r>
+        <w:rPr>
+          <w:szCs w:val="24"/>
+        </w:rPr>
+        <w:t>Scrum</w:t>
+      </w:r>
+      <w:proofErr w:type="spellEnd"/>
+      <w:r>
+        <w:rPr>
+          <w:szCs w:val="24"/>
+        </w:rPr>
+        <w:t xml:space="preserve"> Master</w:t>
       </w:r>
     </w:p>
     <w:p>
@@ -2299,8 +2453,16 @@
         <w:rPr>
           <w:szCs w:val="24"/>
         </w:rPr>
-        <w:t>Igor de Oliveira Bernardo - Developer</w:t>
-      </w:r>
+        <w:t xml:space="preserve">Igor de Oliveira Bernardo - </w:t>
+      </w:r>
+      <w:proofErr w:type="spellStart"/>
+      <w:r>
+        <w:rPr>
+          <w:szCs w:val="24"/>
+        </w:rPr>
+        <w:t>Developer</w:t>
+      </w:r>
+      <w:proofErr w:type="spellEnd"/>
     </w:p>
     <w:p>
       <w:pPr>
@@ -2351,14 +2513,30 @@
         <w:rPr>
           <w:szCs w:val="24"/>
         </w:rPr>
-        <w:t>- Product</w:t>
-      </w:r>
-      <w:r>
-        <w:rPr>
-          <w:szCs w:val="24"/>
-        </w:rPr>
-        <w:t xml:space="preserve"> Owner</w:t>
-      </w:r>
+        <w:t xml:space="preserve">- </w:t>
+      </w:r>
+      <w:proofErr w:type="spellStart"/>
+      <w:r>
+        <w:rPr>
+          <w:szCs w:val="24"/>
+        </w:rPr>
+        <w:t>Product</w:t>
+      </w:r>
+      <w:proofErr w:type="spellEnd"/>
+      <w:r>
+        <w:rPr>
+          <w:szCs w:val="24"/>
+        </w:rPr>
+        <w:t xml:space="preserve"> </w:t>
+      </w:r>
+      <w:proofErr w:type="spellStart"/>
+      <w:r>
+        <w:rPr>
+          <w:szCs w:val="24"/>
+        </w:rPr>
+        <w:t>Owner</w:t>
+      </w:r>
+      <w:proofErr w:type="spellEnd"/>
     </w:p>
     <w:p>
       <w:pPr>
@@ -2373,32 +2551,54 @@
         <w:rPr>
           <w:szCs w:val="24"/>
         </w:rPr>
-        <w:t>Responsável pela criação do protótipo, participação ativa no desenvolvimento front-end da aplicação web e mobile, além de realizar pesquisas sobre tecnologias atuais e seguras, contribuindo também na implementação de mecanismos de segurança da aplicação.</w:t>
-      </w:r>
-    </w:p>
-    <w:p>
-      <w:pPr>
-        <w:spacing w:line="360" w:lineRule="auto"/>
-        <w:jc w:val="both"/>
-        <w:rPr>
-          <w:szCs w:val="24"/>
-        </w:rPr>
-      </w:pPr>
-    </w:p>
-    <w:p>
-      <w:pPr>
-        <w:spacing w:line="360" w:lineRule="auto"/>
-        <w:jc w:val="both"/>
-        <w:rPr>
-          <w:szCs w:val="24"/>
-        </w:rPr>
-      </w:pPr>
-      <w:r>
-        <w:rPr>
-          <w:szCs w:val="24"/>
-        </w:rPr>
-        <w:t>Joaquim Pereira Lima - Developer</w:t>
-      </w:r>
+        <w:t>Responsável pela criação do protótipo, participação ativa no desenvolvimento front-</w:t>
+      </w:r>
+      <w:proofErr w:type="spellStart"/>
+      <w:r>
+        <w:rPr>
+          <w:szCs w:val="24"/>
+        </w:rPr>
+        <w:t>end</w:t>
+      </w:r>
+      <w:proofErr w:type="spellEnd"/>
+      <w:r>
+        <w:rPr>
+          <w:szCs w:val="24"/>
+        </w:rPr>
+        <w:t xml:space="preserve"> da aplicação web e mobile, além de realizar pesquisas sobre tecnologias atuais e seguras, contribuindo também na implementação de mecanismos de segurança da aplicação.</w:t>
+      </w:r>
+    </w:p>
+    <w:p>
+      <w:pPr>
+        <w:spacing w:line="360" w:lineRule="auto"/>
+        <w:jc w:val="both"/>
+        <w:rPr>
+          <w:szCs w:val="24"/>
+        </w:rPr>
+      </w:pPr>
+    </w:p>
+    <w:p>
+      <w:pPr>
+        <w:spacing w:line="360" w:lineRule="auto"/>
+        <w:jc w:val="both"/>
+        <w:rPr>
+          <w:szCs w:val="24"/>
+        </w:rPr>
+      </w:pPr>
+      <w:r>
+        <w:rPr>
+          <w:szCs w:val="24"/>
+        </w:rPr>
+        <w:t xml:space="preserve">Joaquim Pereira Lima - </w:t>
+      </w:r>
+      <w:proofErr w:type="spellStart"/>
+      <w:r>
+        <w:rPr>
+          <w:szCs w:val="24"/>
+        </w:rPr>
+        <w:t>Developer</w:t>
+      </w:r>
+      <w:proofErr w:type="spellEnd"/>
     </w:p>
     <w:p>
       <w:pPr>
@@ -2413,7 +2613,21 @@
         <w:rPr>
           <w:szCs w:val="24"/>
         </w:rPr>
-        <w:t>Responsável pelo suporte na prototipagem do sistema, participação ativa no desenvolvimento back-end da aplicação web e mobile, implementação de recursos de segurança da aplicação, além da elaboração dos slides para a apresentação do TCC.</w:t>
+        <w:t xml:space="preserve">Responsável pelo suporte na prototipagem do sistema, participação ativa no desenvolvimento </w:t>
+      </w:r>
+      <w:proofErr w:type="spellStart"/>
+      <w:r>
+        <w:rPr>
+          <w:szCs w:val="24"/>
+        </w:rPr>
+        <w:t>back-end</w:t>
+      </w:r>
+      <w:proofErr w:type="spellEnd"/>
+      <w:r>
+        <w:rPr>
+          <w:szCs w:val="24"/>
+        </w:rPr>
+        <w:t xml:space="preserve"> da aplicação web e mobile, implementação de recursos de segurança da aplicação, além da elaboração dos slides para a apresentação do TCC.</w:t>
       </w:r>
     </w:p>
     <w:p>
@@ -2885,7 +3099,21 @@
         <w:rPr>
           <w:szCs w:val="24"/>
         </w:rPr>
-        <w:t>Desenvolver um painel administrativo (dashboard) que apresente informações relevantes, como EPIs mais utilizados, EPIs com necessidade de reposição e status de validade dos equipamentos.</w:t>
+        <w:t>Desenvolver um painel administrativo (</w:t>
+      </w:r>
+      <w:proofErr w:type="spellStart"/>
+      <w:r>
+        <w:rPr>
+          <w:szCs w:val="24"/>
+        </w:rPr>
+        <w:t>dashboard</w:t>
+      </w:r>
+      <w:proofErr w:type="spellEnd"/>
+      <w:r>
+        <w:rPr>
+          <w:szCs w:val="24"/>
+        </w:rPr>
+        <w:t>) que apresente informações relevantes, como EPIs mais utilizados, EPIs com necessidade de reposição e status de validade dos equipamentos.</w:t>
       </w:r>
     </w:p>
     <w:p>
@@ -2966,7 +3194,35 @@
         <w:rPr>
           <w:szCs w:val="24"/>
         </w:rPr>
-        <w:t>Desenvolver o sistema de forma responsiva, permitindo sua utilização em dispositivos móveis por meio de Progressive Web App (PWA).</w:t>
+        <w:t xml:space="preserve">Desenvolver o sistema de forma responsiva, permitindo sua utilização em dispositivos móveis por meio de </w:t>
+      </w:r>
+      <w:proofErr w:type="spellStart"/>
+      <w:r>
+        <w:rPr>
+          <w:szCs w:val="24"/>
+        </w:rPr>
+        <w:t>Progressive</w:t>
+      </w:r>
+      <w:proofErr w:type="spellEnd"/>
+      <w:r>
+        <w:rPr>
+          <w:szCs w:val="24"/>
+        </w:rPr>
+        <w:t xml:space="preserve"> Web </w:t>
+      </w:r>
+      <w:proofErr w:type="spellStart"/>
+      <w:r>
+        <w:rPr>
+          <w:szCs w:val="24"/>
+        </w:rPr>
+        <w:t>App</w:t>
+      </w:r>
+      <w:proofErr w:type="spellEnd"/>
+      <w:r>
+        <w:rPr>
+          <w:szCs w:val="24"/>
+        </w:rPr>
+        <w:t xml:space="preserve"> (PWA).</w:t>
       </w:r>
     </w:p>
     <w:p>
@@ -3091,7 +3347,21 @@
         <w:rPr>
           <w:szCs w:val="24"/>
         </w:rPr>
-        <w:t>O projeto SIGEPI será desenvolvido com base em metodologias ágeis, com foco na estrutura do Scrum. Essa escolha se justifica pela necessidade de organizar as atividades entre quatro integrantes com funções distintas e de acompanhar o progresso do desenvolvimento de forma transparente, com entregas incrementais e revisões contínuas.</w:t>
+        <w:t xml:space="preserve">O projeto SIGEPI será desenvolvido com base em metodologias ágeis, com foco na estrutura do </w:t>
+      </w:r>
+      <w:proofErr w:type="spellStart"/>
+      <w:r>
+        <w:rPr>
+          <w:szCs w:val="24"/>
+        </w:rPr>
+        <w:t>Scrum</w:t>
+      </w:r>
+      <w:proofErr w:type="spellEnd"/>
+      <w:r>
+        <w:rPr>
+          <w:szCs w:val="24"/>
+        </w:rPr>
+        <w:t>. Essa escolha se justifica pela necessidade de organizar as atividades entre quatro integrantes com funções distintas e de acompanhar o progresso do desenvolvimento de forma transparente, com entregas incrementais e revisões contínuas.</w:t>
       </w:r>
     </w:p>
     <w:p>
@@ -3107,7 +3377,49 @@
         <w:rPr>
           <w:szCs w:val="24"/>
         </w:rPr>
-        <w:t>No Scrum, as atividades são divididas em sprints, que são ciclos curtos de desenvolvimento com objetivos definidos. Ao final de cada sprint, a equipe revisa o que foi produzido, identifica melhorias e define as tarefas do ciclo seguinte. Essa dinâmica foi adotada para garantir que o sistema seja construído de forma organizada, reduzindo o risco de retrabalho e mantendo o alinhamento entre os membros da equipe.</w:t>
+        <w:t xml:space="preserve">No </w:t>
+      </w:r>
+      <w:proofErr w:type="spellStart"/>
+      <w:r>
+        <w:rPr>
+          <w:szCs w:val="24"/>
+        </w:rPr>
+        <w:t>Scrum</w:t>
+      </w:r>
+      <w:proofErr w:type="spellEnd"/>
+      <w:r>
+        <w:rPr>
+          <w:szCs w:val="24"/>
+        </w:rPr>
+        <w:t xml:space="preserve">, as atividades são divididas em </w:t>
+      </w:r>
+      <w:proofErr w:type="spellStart"/>
+      <w:r>
+        <w:rPr>
+          <w:szCs w:val="24"/>
+        </w:rPr>
+        <w:t>sprints</w:t>
+      </w:r>
+      <w:proofErr w:type="spellEnd"/>
+      <w:r>
+        <w:rPr>
+          <w:szCs w:val="24"/>
+        </w:rPr>
+        <w:t xml:space="preserve">, que são ciclos curtos de desenvolvimento com objetivos definidos. Ao final de cada </w:t>
+      </w:r>
+      <w:proofErr w:type="spellStart"/>
+      <w:r>
+        <w:rPr>
+          <w:szCs w:val="24"/>
+        </w:rPr>
+        <w:t>sprint</w:t>
+      </w:r>
+      <w:proofErr w:type="spellEnd"/>
+      <w:r>
+        <w:rPr>
+          <w:szCs w:val="24"/>
+        </w:rPr>
+        <w:t>, a equipe revisa o que foi produzido, identifica melhorias e define as tarefas do ciclo seguinte. Essa dinâmica foi adotada para garantir que o sistema seja construído de forma organizada, reduzindo o risco de retrabalho e mantendo o alinhamento entre os membros da equipe.</w:t>
       </w:r>
     </w:p>
     <w:p>
@@ -3123,13 +3435,35 @@
         <w:rPr>
           <w:szCs w:val="24"/>
         </w:rPr>
-        <w:t>Antes do início do desenvolvimento, foi realizada a etapa de prototipação das telas do Figma</w:t>
-      </w:r>
-      <w:r>
-        <w:rPr>
-          <w:szCs w:val="24"/>
-        </w:rPr>
-        <w:t>. Essa ferramenta permitiu visualizar a estrutura da interface e validar o fluxo de navegação do sistema antes de qualquer visual durante o desenvolvimento front-end, facilitando a implementação ao design planejado.</w:t>
+        <w:t xml:space="preserve">Antes do início do desenvolvimento, foi realizada a etapa de prototipação das telas do </w:t>
+      </w:r>
+      <w:proofErr w:type="spellStart"/>
+      <w:r>
+        <w:rPr>
+          <w:szCs w:val="24"/>
+        </w:rPr>
+        <w:t>Figma</w:t>
+      </w:r>
+      <w:proofErr w:type="spellEnd"/>
+      <w:r>
+        <w:rPr>
+          <w:szCs w:val="24"/>
+        </w:rPr>
+        <w:t>. Essa ferramenta permitiu visualizar a estrutura da interface e validar o fluxo de navegação do sistema antes de qualquer visual durante o desenvolvimento front-</w:t>
+      </w:r>
+      <w:proofErr w:type="spellStart"/>
+      <w:r>
+        <w:rPr>
+          <w:szCs w:val="24"/>
+        </w:rPr>
+        <w:t>end</w:t>
+      </w:r>
+      <w:proofErr w:type="spellEnd"/>
+      <w:r>
+        <w:rPr>
+          <w:szCs w:val="24"/>
+        </w:rPr>
+        <w:t>, facilitando a implementação ao design planejado.</w:t>
       </w:r>
     </w:p>
     <w:p>
@@ -3145,7 +3479,21 @@
         <w:rPr>
           <w:szCs w:val="24"/>
         </w:rPr>
-        <w:t xml:space="preserve">O desenvolvimento será realizado de forma incremental, começando pelas funcionalidades mais essenciais do sistema, como o login, o cadastro de funcionários e EPIs e o controle de estoque. À medida que essas funcionalidades forem concluídas e testadas, novas </w:t>
+        <w:t xml:space="preserve">O desenvolvimento será realizado de forma incremental, começando pelas funcionalidades mais essenciais do sistema, como o </w:t>
+      </w:r>
+      <w:proofErr w:type="spellStart"/>
+      <w:r>
+        <w:rPr>
+          <w:szCs w:val="24"/>
+        </w:rPr>
+        <w:t>login</w:t>
+      </w:r>
+      <w:proofErr w:type="spellEnd"/>
+      <w:r>
+        <w:rPr>
+          <w:szCs w:val="24"/>
+        </w:rPr>
+        <w:t xml:space="preserve">, o cadastro de funcionários e EPIs e o controle de estoque. À medida que essas funcionalidades forem concluídas e testadas, novas </w:t>
       </w:r>
       <w:r>
         <w:rPr>
@@ -3157,7 +3505,21 @@
         <w:rPr>
           <w:szCs w:val="24"/>
         </w:rPr>
-        <w:t xml:space="preserve"> serão implementadas, como o painel de dashboard, geração de relatórios e os alertas de validade.</w:t>
+        <w:t xml:space="preserve"> serão implementadas, como o painel de </w:t>
+      </w:r>
+      <w:proofErr w:type="spellStart"/>
+      <w:r>
+        <w:rPr>
+          <w:szCs w:val="24"/>
+        </w:rPr>
+        <w:t>dashboard</w:t>
+      </w:r>
+      <w:proofErr w:type="spellEnd"/>
+      <w:r>
+        <w:rPr>
+          <w:szCs w:val="24"/>
+        </w:rPr>
+        <w:t>, geração de relatórios e os alertas de validade.</w:t>
       </w:r>
     </w:p>
     <w:p>
@@ -3298,7 +3660,35 @@
         <w:rPr>
           <w:szCs w:val="24"/>
         </w:rPr>
-        <w:t>. No front-end, serão utilizados HTML, CSS e JavaScript, linguagens que a equipe já domina e que são amplamente suportadas por todos os navegadores modernos.</w:t>
+        <w:t>. No front-</w:t>
+      </w:r>
+      <w:proofErr w:type="spellStart"/>
+      <w:r>
+        <w:rPr>
+          <w:szCs w:val="24"/>
+        </w:rPr>
+        <w:t>end</w:t>
+      </w:r>
+      <w:proofErr w:type="spellEnd"/>
+      <w:r>
+        <w:rPr>
+          <w:szCs w:val="24"/>
+        </w:rPr>
+        <w:t xml:space="preserve">, serão utilizados HTML, CSS e </w:t>
+      </w:r>
+      <w:proofErr w:type="spellStart"/>
+      <w:r>
+        <w:rPr>
+          <w:szCs w:val="24"/>
+        </w:rPr>
+        <w:t>JavaScript</w:t>
+      </w:r>
+      <w:proofErr w:type="spellEnd"/>
+      <w:r>
+        <w:rPr>
+          <w:szCs w:val="24"/>
+        </w:rPr>
+        <w:t>, linguagens que a equipe já domina e que são amplamente suportadas por todos os navegadores modernos.</w:t>
       </w:r>
     </w:p>
     <w:p>
@@ -3314,7 +3704,21 @@
         <w:rPr>
           <w:szCs w:val="24"/>
         </w:rPr>
-        <w:t>No back-end, será utilizado</w:t>
+        <w:t xml:space="preserve">No </w:t>
+      </w:r>
+      <w:proofErr w:type="spellStart"/>
+      <w:r>
+        <w:rPr>
+          <w:szCs w:val="24"/>
+        </w:rPr>
+        <w:t>back-end</w:t>
+      </w:r>
+      <w:proofErr w:type="spellEnd"/>
+      <w:r>
+        <w:rPr>
+          <w:szCs w:val="24"/>
+        </w:rPr>
+        <w:t>, será utilizado</w:t>
       </w:r>
       <w:r>
         <w:rPr>
@@ -3352,7 +3756,49 @@
         <w:rPr>
           <w:szCs w:val="24"/>
         </w:rPr>
-        <w:t>Além disso, a equipe utilizará ferramentas consolidadas no mercado de desenvolvimento, como o Visual Studio Code como editor de código, o Figma para prototipação de telas e o Postman para testes de rotas de API. Esse conjunto de ferramentas é gratuito, bem documentado e já utilizado pela equipe em atividades anteriores do curso, o que reduz a curva de aprendizado e favorece a produtividade.</w:t>
+        <w:t xml:space="preserve">Além disso, a equipe utilizará ferramentas consolidadas no mercado de desenvolvimento, como o Visual Studio </w:t>
+      </w:r>
+      <w:proofErr w:type="spellStart"/>
+      <w:r>
+        <w:rPr>
+          <w:szCs w:val="24"/>
+        </w:rPr>
+        <w:t>Code</w:t>
+      </w:r>
+      <w:proofErr w:type="spellEnd"/>
+      <w:r>
+        <w:rPr>
+          <w:szCs w:val="24"/>
+        </w:rPr>
+        <w:t xml:space="preserve"> como editor de código, o </w:t>
+      </w:r>
+      <w:proofErr w:type="spellStart"/>
+      <w:r>
+        <w:rPr>
+          <w:szCs w:val="24"/>
+        </w:rPr>
+        <w:t>Figma</w:t>
+      </w:r>
+      <w:proofErr w:type="spellEnd"/>
+      <w:r>
+        <w:rPr>
+          <w:szCs w:val="24"/>
+        </w:rPr>
+        <w:t xml:space="preserve"> para prototipação de telas e o </w:t>
+      </w:r>
+      <w:proofErr w:type="spellStart"/>
+      <w:r>
+        <w:rPr>
+          <w:szCs w:val="24"/>
+        </w:rPr>
+        <w:t>Postman</w:t>
+      </w:r>
+      <w:proofErr w:type="spellEnd"/>
+      <w:r>
+        <w:rPr>
+          <w:szCs w:val="24"/>
+        </w:rPr>
+        <w:t xml:space="preserve"> para testes de rotas de API. Esse conjunto de ferramentas é gratuito, bem documentado e já utilizado pela equipe em atividades anteriores do curso, o que reduz a curva de aprendizado e favorece a produtividade.</w:t>
       </w:r>
     </w:p>
     <w:p>
@@ -3396,7 +3842,49 @@
         <w:rPr>
           <w:szCs w:val="24"/>
         </w:rPr>
-        <w:t>O projeto apresenta alta viabilidade financeira. Todas as tecnologias e ferramentas previstas para o desenvolvimento são gratuitas ou de código aberto: Node.js, Express.js, MySQL, Visual Studio Code, Figma (plano gratuito) e Postman são exemplos disso.</w:t>
+        <w:t xml:space="preserve">O projeto apresenta alta viabilidade financeira. Todas as tecnologias e ferramentas previstas para o desenvolvimento são gratuitas ou de código aberto: Node.js, Express.js, MySQL, Visual Studio </w:t>
+      </w:r>
+      <w:proofErr w:type="spellStart"/>
+      <w:r>
+        <w:rPr>
+          <w:szCs w:val="24"/>
+        </w:rPr>
+        <w:t>Code</w:t>
+      </w:r>
+      <w:proofErr w:type="spellEnd"/>
+      <w:r>
+        <w:rPr>
+          <w:szCs w:val="24"/>
+        </w:rPr>
+        <w:t xml:space="preserve">, </w:t>
+      </w:r>
+      <w:proofErr w:type="spellStart"/>
+      <w:r>
+        <w:rPr>
+          <w:szCs w:val="24"/>
+        </w:rPr>
+        <w:t>Figma</w:t>
+      </w:r>
+      <w:proofErr w:type="spellEnd"/>
+      <w:r>
+        <w:rPr>
+          <w:szCs w:val="24"/>
+        </w:rPr>
+        <w:t xml:space="preserve"> (plano gratuito) e </w:t>
+      </w:r>
+      <w:proofErr w:type="spellStart"/>
+      <w:r>
+        <w:rPr>
+          <w:szCs w:val="24"/>
+        </w:rPr>
+        <w:t>Postman</w:t>
+      </w:r>
+      <w:proofErr w:type="spellEnd"/>
+      <w:r>
+        <w:rPr>
+          <w:szCs w:val="24"/>
+        </w:rPr>
+        <w:t xml:space="preserve"> são exemplos disso.</w:t>
       </w:r>
     </w:p>
     <w:p>
@@ -3469,7 +3957,21 @@
           <w:szCs w:val="24"/>
         </w:rPr>
         <w:lastRenderedPageBreak/>
-        <w:t>níveis de acesso e capacidade. O Plano 1, no valor de R$89,90 por mês, é voltado para pequenas empresas e permite o cadastro de até 50 funcionários e 1 administrador. O Plano 2, no valor de R$169,90 por mês, amplia os limites para até 200 funcionários e 3 administradores, incluindo funcionalidades avançadas como geração de relatórios em PDF e dashboard completo. O Plano 3, no valor de R$210,90 por mês, oferece acesso ilimitado a todas as funcionalidades do sistema, sem restrição de funcionários ou administradores. Essa estrutura de planos garante a sustentabilidade financeira do projeto após sua implantação, sem comprometer a acessibilidade para empresas de menor porte.</w:t>
+        <w:t xml:space="preserve">níveis de acesso e capacidade. O Plano 1, no valor de R$89,90 por mês, é voltado para pequenas empresas e permite o cadastro de até 50 funcionários e 1 administrador. O Plano 2, no valor de R$169,90 por mês, amplia os limites para até 200 funcionários e 3 administradores, incluindo funcionalidades avançadas como geração de relatórios em PDF e </w:t>
+      </w:r>
+      <w:proofErr w:type="spellStart"/>
+      <w:r>
+        <w:rPr>
+          <w:szCs w:val="24"/>
+        </w:rPr>
+        <w:t>dashboard</w:t>
+      </w:r>
+      <w:proofErr w:type="spellEnd"/>
+      <w:r>
+        <w:rPr>
+          <w:szCs w:val="24"/>
+        </w:rPr>
+        <w:t xml:space="preserve"> completo. O Plano 3, no valor de R$210,90 por mês, oferece acesso ilimitado a todas as funcionalidades do sistema, sem restrição de funcionários ou administradores. Essa estrutura de planos garante a sustentabilidade financeira do projeto após sua implantação, sem comprometer a acessibilidade para empresas de menor porte.</w:t>
       </w:r>
     </w:p>
     <w:p>
@@ -3812,8 +4314,16 @@
               <w:rPr>
                 <w:szCs w:val="24"/>
               </w:rPr>
-              <w:t>Efetuar Login</w:t>
-            </w:r>
+              <w:t xml:space="preserve">Efetuar </w:t>
+            </w:r>
+            <w:proofErr w:type="spellStart"/>
+            <w:r>
+              <w:rPr>
+                <w:szCs w:val="24"/>
+              </w:rPr>
+              <w:t>Login</w:t>
+            </w:r>
+            <w:proofErr w:type="spellEnd"/>
           </w:p>
         </w:tc>
       </w:tr>
@@ -4009,60 +4519,70 @@
                 <w:szCs w:val="24"/>
               </w:rPr>
             </w:pPr>
+            <w:proofErr w:type="spellStart"/>
             <w:r>
               <w:rPr>
                 <w:b/>
                 <w:bCs/>
                 <w:szCs w:val="24"/>
               </w:rPr>
-              <w:t>Cód-Nome</w:t>
-            </w:r>
-          </w:p>
-        </w:tc>
-        <w:tc>
-          <w:tcPr>
-            <w:tcW w:w="3254" w:type="dxa"/>
-          </w:tcPr>
-          <w:p>
-            <w:pPr>
-              <w:spacing w:line="360" w:lineRule="auto"/>
-              <w:jc w:val="center"/>
+              <w:t>Cód</w:t>
+            </w:r>
+            <w:proofErr w:type="spellEnd"/>
+            <w:r>
               <w:rPr>
                 <w:b/>
                 <w:bCs/>
                 <w:szCs w:val="24"/>
               </w:rPr>
-            </w:pPr>
-            <w:r>
+              <w:t>-Nome</w:t>
+            </w:r>
+          </w:p>
+        </w:tc>
+        <w:tc>
+          <w:tcPr>
+            <w:tcW w:w="3254" w:type="dxa"/>
+          </w:tcPr>
+          <w:p>
+            <w:pPr>
+              <w:spacing w:line="360" w:lineRule="auto"/>
+              <w:jc w:val="center"/>
               <w:rPr>
                 <w:b/>
                 <w:bCs/>
                 <w:szCs w:val="24"/>
               </w:rPr>
-              <w:t>Descrição</w:t>
-            </w:r>
-          </w:p>
-        </w:tc>
-        <w:tc>
-          <w:tcPr>
-            <w:tcW w:w="2541" w:type="dxa"/>
-          </w:tcPr>
-          <w:p>
-            <w:pPr>
-              <w:spacing w:line="360" w:lineRule="auto"/>
-              <w:jc w:val="center"/>
+            </w:pPr>
+            <w:r>
               <w:rPr>
                 <w:b/>
                 <w:bCs/>
                 <w:szCs w:val="24"/>
               </w:rPr>
-            </w:pPr>
-            <w:r>
+              <w:t>Descrição</w:t>
+            </w:r>
+          </w:p>
+        </w:tc>
+        <w:tc>
+          <w:tcPr>
+            <w:tcW w:w="2541" w:type="dxa"/>
+          </w:tcPr>
+          <w:p>
+            <w:pPr>
+              <w:spacing w:line="360" w:lineRule="auto"/>
+              <w:jc w:val="center"/>
               <w:rPr>
                 <w:b/>
                 <w:bCs/>
                 <w:szCs w:val="24"/>
               </w:rPr>
+            </w:pPr>
+            <w:r>
+              <w:rPr>
+                <w:b/>
+                <w:bCs/>
+                <w:szCs w:val="24"/>
+              </w:rPr>
               <w:t>Categoria</w:t>
             </w:r>
           </w:p>
@@ -4151,8 +4671,16 @@
               <w:rPr>
                 <w:szCs w:val="24"/>
               </w:rPr>
-              <w:t>NF1.2 Validar Captcha</w:t>
-            </w:r>
+              <w:t xml:space="preserve">NF1.2 Validar </w:t>
+            </w:r>
+            <w:proofErr w:type="spellStart"/>
+            <w:r>
+              <w:rPr>
+                <w:szCs w:val="24"/>
+              </w:rPr>
+              <w:t>Captcha</w:t>
+            </w:r>
+            <w:proofErr w:type="spellEnd"/>
           </w:p>
         </w:tc>
         <w:tc>
@@ -4170,7 +4698,21 @@
               <w:rPr>
                 <w:szCs w:val="24"/>
               </w:rPr>
-              <w:t>O usuário deve confirmar captcha para evitar acessos automatizados/robôs</w:t>
+              <w:t xml:space="preserve">O usuário deve confirmar </w:t>
+            </w:r>
+            <w:proofErr w:type="spellStart"/>
+            <w:r>
+              <w:rPr>
+                <w:szCs w:val="24"/>
+              </w:rPr>
+              <w:t>captcha</w:t>
+            </w:r>
+            <w:proofErr w:type="spellEnd"/>
+            <w:r>
+              <w:rPr>
+                <w:szCs w:val="24"/>
+              </w:rPr>
+              <w:t xml:space="preserve"> para evitar acessos automatizados/robôs</w:t>
             </w:r>
             <w:r>
               <w:rPr>
@@ -4541,13 +5083,23 @@
                 <w:szCs w:val="24"/>
               </w:rPr>
             </w:pPr>
+            <w:proofErr w:type="spellStart"/>
             <w:r>
               <w:rPr>
                 <w:b/>
                 <w:bCs/>
                 <w:szCs w:val="24"/>
               </w:rPr>
-              <w:t>Cód-Nome</w:t>
+              <w:t>Cód</w:t>
+            </w:r>
+            <w:proofErr w:type="spellEnd"/>
+            <w:r>
+              <w:rPr>
+                <w:b/>
+                <w:bCs/>
+                <w:szCs w:val="24"/>
+              </w:rPr>
+              <w:t>-Nome</w:t>
             </w:r>
           </w:p>
         </w:tc>
@@ -5009,13 +5561,23 @@
                 <w:szCs w:val="24"/>
               </w:rPr>
             </w:pPr>
+            <w:proofErr w:type="spellStart"/>
             <w:r>
               <w:rPr>
                 <w:b/>
                 <w:bCs/>
                 <w:szCs w:val="24"/>
               </w:rPr>
-              <w:t>Cód-Nome</w:t>
+              <w:t>Cód</w:t>
+            </w:r>
+            <w:proofErr w:type="spellEnd"/>
+            <w:r>
+              <w:rPr>
+                <w:b/>
+                <w:bCs/>
+                <w:szCs w:val="24"/>
+              </w:rPr>
+              <w:t>-Nome</w:t>
             </w:r>
           </w:p>
         </w:tc>
@@ -5473,13 +6035,23 @@
                 <w:szCs w:val="24"/>
               </w:rPr>
             </w:pPr>
+            <w:proofErr w:type="spellStart"/>
             <w:r>
               <w:rPr>
                 <w:b/>
                 <w:bCs/>
                 <w:szCs w:val="24"/>
               </w:rPr>
-              <w:t>Cód-Nome</w:t>
+              <w:t>Cód</w:t>
+            </w:r>
+            <w:proofErr w:type="spellEnd"/>
+            <w:r>
+              <w:rPr>
+                <w:b/>
+                <w:bCs/>
+                <w:szCs w:val="24"/>
+              </w:rPr>
+              <w:t>-Nome</w:t>
             </w:r>
           </w:p>
         </w:tc>
@@ -5995,13 +6567,23 @@
                 <w:szCs w:val="24"/>
               </w:rPr>
             </w:pPr>
+            <w:proofErr w:type="spellStart"/>
             <w:r>
               <w:rPr>
                 <w:b/>
                 <w:bCs/>
                 <w:szCs w:val="24"/>
               </w:rPr>
-              <w:t>Cód-Nome</w:t>
+              <w:t>Cód</w:t>
+            </w:r>
+            <w:proofErr w:type="spellEnd"/>
+            <w:r>
+              <w:rPr>
+                <w:b/>
+                <w:bCs/>
+                <w:szCs w:val="24"/>
+              </w:rPr>
+              <w:t>-Nome</w:t>
             </w:r>
           </w:p>
         </w:tc>
@@ -6463,13 +7045,23 @@
                 <w:szCs w:val="24"/>
               </w:rPr>
             </w:pPr>
+            <w:proofErr w:type="spellStart"/>
             <w:r>
               <w:rPr>
                 <w:b/>
                 <w:bCs/>
                 <w:szCs w:val="24"/>
               </w:rPr>
-              <w:t>Cód-Nome</w:t>
+              <w:t>Cód</w:t>
+            </w:r>
+            <w:proofErr w:type="spellEnd"/>
+            <w:r>
+              <w:rPr>
+                <w:b/>
+                <w:bCs/>
+                <w:szCs w:val="24"/>
+              </w:rPr>
+              <w:t>-Nome</w:t>
             </w:r>
           </w:p>
         </w:tc>
@@ -6966,60 +7558,70 @@
                 <w:szCs w:val="24"/>
               </w:rPr>
             </w:pPr>
+            <w:proofErr w:type="spellStart"/>
             <w:r>
               <w:rPr>
                 <w:b/>
                 <w:bCs/>
                 <w:szCs w:val="24"/>
               </w:rPr>
-              <w:t>Cód-Nome</w:t>
-            </w:r>
-          </w:p>
-        </w:tc>
-        <w:tc>
-          <w:tcPr>
-            <w:tcW w:w="3254" w:type="dxa"/>
-          </w:tcPr>
-          <w:p>
-            <w:pPr>
-              <w:spacing w:line="360" w:lineRule="auto"/>
-              <w:jc w:val="center"/>
+              <w:t>Cód</w:t>
+            </w:r>
+            <w:proofErr w:type="spellEnd"/>
+            <w:r>
               <w:rPr>
                 <w:b/>
                 <w:bCs/>
                 <w:szCs w:val="24"/>
               </w:rPr>
-            </w:pPr>
-            <w:r>
+              <w:t>-Nome</w:t>
+            </w:r>
+          </w:p>
+        </w:tc>
+        <w:tc>
+          <w:tcPr>
+            <w:tcW w:w="3254" w:type="dxa"/>
+          </w:tcPr>
+          <w:p>
+            <w:pPr>
+              <w:spacing w:line="360" w:lineRule="auto"/>
+              <w:jc w:val="center"/>
               <w:rPr>
                 <w:b/>
                 <w:bCs/>
                 <w:szCs w:val="24"/>
               </w:rPr>
-              <w:t>Descrição</w:t>
-            </w:r>
-          </w:p>
-        </w:tc>
-        <w:tc>
-          <w:tcPr>
-            <w:tcW w:w="2541" w:type="dxa"/>
-          </w:tcPr>
-          <w:p>
-            <w:pPr>
-              <w:spacing w:line="360" w:lineRule="auto"/>
-              <w:jc w:val="center"/>
+            </w:pPr>
+            <w:r>
               <w:rPr>
                 <w:b/>
                 <w:bCs/>
                 <w:szCs w:val="24"/>
               </w:rPr>
-            </w:pPr>
-            <w:r>
+              <w:t>Descrição</w:t>
+            </w:r>
+          </w:p>
+        </w:tc>
+        <w:tc>
+          <w:tcPr>
+            <w:tcW w:w="2541" w:type="dxa"/>
+          </w:tcPr>
+          <w:p>
+            <w:pPr>
+              <w:spacing w:line="360" w:lineRule="auto"/>
+              <w:jc w:val="center"/>
               <w:rPr>
                 <w:b/>
                 <w:bCs/>
                 <w:szCs w:val="24"/>
               </w:rPr>
+            </w:pPr>
+            <w:r>
+              <w:rPr>
+                <w:b/>
+                <w:bCs/>
+                <w:szCs w:val="24"/>
+              </w:rPr>
               <w:t>Categoria</w:t>
             </w:r>
           </w:p>
@@ -7391,7 +7993,7 @@
     <w:p>
       <w:pPr>
         <w:spacing w:line="360" w:lineRule="auto"/>
-        <w:jc w:val="both"/>
+        <w:jc w:val="center"/>
         <w:rPr>
           <w:b/>
           <w:bCs/>
@@ -7406,10 +8008,10 @@
           <w:szCs w:val="24"/>
         </w:rPr>
         <w:drawing>
-          <wp:inline distT="0" distB="0" distL="0" distR="0" wp14:anchorId="0ECEAC21" wp14:editId="794FFD53">
-            <wp:extent cx="5757545" cy="7592695"/>
-            <wp:effectExtent l="0" t="0" r="0" b="8255"/>
-            <wp:docPr id="195894449" name="Imagem 1"/>
+          <wp:inline distT="0" distB="0" distL="0" distR="0" wp14:anchorId="0744E792" wp14:editId="125CEECB">
+            <wp:extent cx="6455317" cy="4168140"/>
+            <wp:effectExtent l="0" t="0" r="3175" b="3810"/>
+            <wp:docPr id="1" name="Imagem 1"/>
             <wp:cNvGraphicFramePr>
               <a:graphicFrameLocks xmlns:a="http://schemas.openxmlformats.org/drawingml/2006/main" noChangeAspect="1"/>
             </wp:cNvGraphicFramePr>
@@ -7417,10 +8019,8 @@
               <a:graphicData uri="http://schemas.openxmlformats.org/drawingml/2006/picture">
                 <pic:pic xmlns:pic="http://schemas.openxmlformats.org/drawingml/2006/picture">
                   <pic:nvPicPr>
-                    <pic:cNvPr id="0" name="Picture 1"/>
-                    <pic:cNvPicPr>
-                      <a:picLocks noChangeAspect="1" noChangeArrowheads="1"/>
-                    </pic:cNvPicPr>
+                    <pic:cNvPr id="1" name="Diagrama de Casos de Uso - UML SIGEPI.png"/>
+                    <pic:cNvPicPr/>
                   </pic:nvPicPr>
                   <pic:blipFill>
                     <a:blip r:embed="rId7" cstate="print">
@@ -7430,23 +8030,18 @@
                         </a:ext>
                       </a:extLst>
                     </a:blip>
-                    <a:srcRect/>
                     <a:stretch>
                       <a:fillRect/>
                     </a:stretch>
                   </pic:blipFill>
-                  <pic:spPr bwMode="auto">
+                  <pic:spPr>
                     <a:xfrm>
                       <a:off x="0" y="0"/>
-                      <a:ext cx="5757545" cy="7592695"/>
+                      <a:ext cx="6455317" cy="4168140"/>
                     </a:xfrm>
                     <a:prstGeom prst="rect">
                       <a:avLst/>
                     </a:prstGeom>
-                    <a:noFill/>
-                    <a:ln>
-                      <a:noFill/>
-                    </a:ln>
                   </pic:spPr>
                 </pic:pic>
               </a:graphicData>
@@ -7509,12 +8104,145 @@
           <w:szCs w:val="24"/>
         </w:rPr>
       </w:pPr>
-      <w:r>
-        <w:rPr>
-          <w:b/>
-          <w:bCs/>
-          <w:szCs w:val="24"/>
-        </w:rPr>
+    </w:p>
+    <w:p>
+      <w:pPr>
+        <w:spacing w:line="360" w:lineRule="auto"/>
+        <w:jc w:val="both"/>
+        <w:rPr>
+          <w:b/>
+          <w:bCs/>
+          <w:szCs w:val="24"/>
+        </w:rPr>
+      </w:pPr>
+    </w:p>
+    <w:p>
+      <w:pPr>
+        <w:spacing w:line="360" w:lineRule="auto"/>
+        <w:jc w:val="both"/>
+        <w:rPr>
+          <w:b/>
+          <w:bCs/>
+          <w:szCs w:val="24"/>
+        </w:rPr>
+      </w:pPr>
+    </w:p>
+    <w:p>
+      <w:pPr>
+        <w:spacing w:line="360" w:lineRule="auto"/>
+        <w:jc w:val="both"/>
+        <w:rPr>
+          <w:b/>
+          <w:bCs/>
+          <w:szCs w:val="24"/>
+        </w:rPr>
+      </w:pPr>
+    </w:p>
+    <w:p>
+      <w:pPr>
+        <w:spacing w:line="360" w:lineRule="auto"/>
+        <w:jc w:val="both"/>
+        <w:rPr>
+          <w:b/>
+          <w:bCs/>
+          <w:szCs w:val="24"/>
+        </w:rPr>
+      </w:pPr>
+    </w:p>
+    <w:p>
+      <w:pPr>
+        <w:spacing w:line="360" w:lineRule="auto"/>
+        <w:jc w:val="both"/>
+        <w:rPr>
+          <w:b/>
+          <w:bCs/>
+          <w:szCs w:val="24"/>
+        </w:rPr>
+      </w:pPr>
+    </w:p>
+    <w:p>
+      <w:pPr>
+        <w:spacing w:line="360" w:lineRule="auto"/>
+        <w:jc w:val="both"/>
+        <w:rPr>
+          <w:b/>
+          <w:bCs/>
+          <w:szCs w:val="24"/>
+        </w:rPr>
+      </w:pPr>
+    </w:p>
+    <w:p>
+      <w:pPr>
+        <w:spacing w:line="360" w:lineRule="auto"/>
+        <w:jc w:val="both"/>
+        <w:rPr>
+          <w:b/>
+          <w:bCs/>
+          <w:szCs w:val="24"/>
+        </w:rPr>
+      </w:pPr>
+    </w:p>
+    <w:p>
+      <w:pPr>
+        <w:spacing w:line="360" w:lineRule="auto"/>
+        <w:jc w:val="both"/>
+        <w:rPr>
+          <w:b/>
+          <w:bCs/>
+          <w:szCs w:val="24"/>
+        </w:rPr>
+      </w:pPr>
+    </w:p>
+    <w:p>
+      <w:pPr>
+        <w:spacing w:line="360" w:lineRule="auto"/>
+        <w:jc w:val="both"/>
+        <w:rPr>
+          <w:b/>
+          <w:bCs/>
+          <w:szCs w:val="24"/>
+        </w:rPr>
+      </w:pPr>
+    </w:p>
+    <w:p>
+      <w:pPr>
+        <w:spacing w:line="360" w:lineRule="auto"/>
+        <w:jc w:val="both"/>
+        <w:rPr>
+          <w:b/>
+          <w:bCs/>
+          <w:szCs w:val="24"/>
+        </w:rPr>
+      </w:pPr>
+    </w:p>
+    <w:p>
+      <w:pPr>
+        <w:spacing w:line="360" w:lineRule="auto"/>
+        <w:jc w:val="both"/>
+        <w:rPr>
+          <w:b/>
+          <w:bCs/>
+          <w:szCs w:val="24"/>
+        </w:rPr>
+      </w:pPr>
+    </w:p>
+    <w:p>
+      <w:pPr>
+        <w:spacing w:line="360" w:lineRule="auto"/>
+        <w:jc w:val="both"/>
+        <w:rPr>
+          <w:b/>
+          <w:bCs/>
+          <w:szCs w:val="24"/>
+        </w:rPr>
+      </w:pPr>
+      <w:r>
+        <w:rPr>
+          <w:b/>
+          <w:bCs/>
+          <w:szCs w:val="24"/>
+        </w:rPr>
+        <w:lastRenderedPageBreak/>
         <w:t>9 TECNOLOGIAS ADOTADAS</w:t>
       </w:r>
     </w:p>
@@ -7559,8 +8287,18 @@
           <w:bCs/>
           <w:szCs w:val="24"/>
         </w:rPr>
-        <w:t>Front-end</w:t>
-      </w:r>
+        <w:t>Front-</w:t>
+      </w:r>
+      <w:proofErr w:type="spellStart"/>
+      <w:r>
+        <w:rPr>
+          <w:b/>
+          <w:bCs/>
+          <w:szCs w:val="24"/>
+        </w:rPr>
+        <w:t>end</w:t>
+      </w:r>
+      <w:proofErr w:type="spellEnd"/>
     </w:p>
     <w:p>
       <w:pPr>
@@ -7581,36 +8319,88 @@
         <w:rPr>
           <w:szCs w:val="24"/>
         </w:rPr>
-        <w:t>será construída com HTML, CSS e JavaScript puro. Essa combinação foi escolhida por ser a base do desenvolvimento web e por já ter sido trabalhada pela equipe durante o curso. O JavaScript será utilizado para a manipulação dinâmica da interface e para a comunicação com a API do back-end por meio de requisições assíncronas.</w:t>
-      </w:r>
-    </w:p>
-    <w:p>
-      <w:pPr>
-        <w:spacing w:line="360" w:lineRule="auto"/>
-        <w:jc w:val="both"/>
-        <w:rPr>
-          <w:szCs w:val="24"/>
-        </w:rPr>
-      </w:pPr>
-    </w:p>
-    <w:p>
-      <w:pPr>
-        <w:spacing w:line="360" w:lineRule="auto"/>
-        <w:jc w:val="both"/>
-        <w:rPr>
-          <w:b/>
-          <w:bCs/>
-          <w:szCs w:val="24"/>
-        </w:rPr>
-      </w:pPr>
-      <w:r>
-        <w:rPr>
-          <w:b/>
-          <w:bCs/>
-          <w:szCs w:val="24"/>
-        </w:rPr>
-        <w:t>Back-end</w:t>
-      </w:r>
+        <w:t xml:space="preserve">será construída com HTML, CSS e </w:t>
+      </w:r>
+      <w:proofErr w:type="spellStart"/>
+      <w:r>
+        <w:rPr>
+          <w:szCs w:val="24"/>
+        </w:rPr>
+        <w:t>JavaScript</w:t>
+      </w:r>
+      <w:proofErr w:type="spellEnd"/>
+      <w:r>
+        <w:rPr>
+          <w:szCs w:val="24"/>
+        </w:rPr>
+        <w:t xml:space="preserve"> puro. Essa combinação foi escolhida por ser a base do desenvolvimento web e por já ter sido trabalhada pela equipe durante o curso. O </w:t>
+      </w:r>
+      <w:proofErr w:type="spellStart"/>
+      <w:r>
+        <w:rPr>
+          <w:szCs w:val="24"/>
+        </w:rPr>
+        <w:t>JavaScript</w:t>
+      </w:r>
+      <w:proofErr w:type="spellEnd"/>
+      <w:r>
+        <w:rPr>
+          <w:szCs w:val="24"/>
+        </w:rPr>
+        <w:t xml:space="preserve"> será utilizado para a manipulação dinâmica da interface e para a comunicação com a API do </w:t>
+      </w:r>
+      <w:proofErr w:type="spellStart"/>
+      <w:r>
+        <w:rPr>
+          <w:szCs w:val="24"/>
+        </w:rPr>
+        <w:t>back-end</w:t>
+      </w:r>
+      <w:proofErr w:type="spellEnd"/>
+      <w:r>
+        <w:rPr>
+          <w:szCs w:val="24"/>
+        </w:rPr>
+        <w:t xml:space="preserve"> por meio de requisições assíncronas.</w:t>
+      </w:r>
+    </w:p>
+    <w:p>
+      <w:pPr>
+        <w:spacing w:line="360" w:lineRule="auto"/>
+        <w:jc w:val="both"/>
+        <w:rPr>
+          <w:szCs w:val="24"/>
+        </w:rPr>
+      </w:pPr>
+    </w:p>
+    <w:p>
+      <w:pPr>
+        <w:spacing w:line="360" w:lineRule="auto"/>
+        <w:jc w:val="both"/>
+        <w:rPr>
+          <w:b/>
+          <w:bCs/>
+          <w:szCs w:val="24"/>
+        </w:rPr>
+      </w:pPr>
+      <w:r>
+        <w:rPr>
+          <w:b/>
+          <w:bCs/>
+          <w:szCs w:val="24"/>
+        </w:rPr>
+        <w:t>Back-</w:t>
+      </w:r>
+      <w:proofErr w:type="spellStart"/>
+      <w:r>
+        <w:rPr>
+          <w:b/>
+          <w:bCs/>
+          <w:szCs w:val="24"/>
+        </w:rPr>
+        <w:t>end</w:t>
+      </w:r>
+      <w:proofErr w:type="spellEnd"/>
     </w:p>
     <w:p>
       <w:pPr>
@@ -7625,13 +8415,83 @@
         <w:rPr>
           <w:szCs w:val="24"/>
         </w:rPr>
-        <w:t>O back-end da aplicação será desenvolvida</w:t>
-      </w:r>
-      <w:r>
-        <w:rPr>
-          <w:szCs w:val="24"/>
-        </w:rPr>
-        <w:t xml:space="preserve"> com Node.js, uma plataforma que permite executar JavaScript no servidor, e o framework Express.js, que simplifica a criação de APIs. O Express.js foi escolhido por sua leveza, flexibilidade e pela grande quantidade de bibliotecas disponíveis no ecossistema Node.js, como bcrypt para criptografia de senhas e jsonwebtoken para autenticação.</w:t>
+        <w:t xml:space="preserve">O </w:t>
+      </w:r>
+      <w:proofErr w:type="spellStart"/>
+      <w:r>
+        <w:rPr>
+          <w:szCs w:val="24"/>
+        </w:rPr>
+        <w:t>back-end</w:t>
+      </w:r>
+      <w:proofErr w:type="spellEnd"/>
+      <w:r>
+        <w:rPr>
+          <w:szCs w:val="24"/>
+        </w:rPr>
+        <w:t xml:space="preserve"> da aplicação será desenvolvida</w:t>
+      </w:r>
+      <w:r>
+        <w:rPr>
+          <w:szCs w:val="24"/>
+        </w:rPr>
+        <w:t xml:space="preserve"> com Node.js, uma plataforma que permite executar </w:t>
+      </w:r>
+      <w:proofErr w:type="spellStart"/>
+      <w:r>
+        <w:rPr>
+          <w:szCs w:val="24"/>
+        </w:rPr>
+        <w:t>JavaScript</w:t>
+      </w:r>
+      <w:proofErr w:type="spellEnd"/>
+      <w:r>
+        <w:rPr>
+          <w:szCs w:val="24"/>
+        </w:rPr>
+        <w:t xml:space="preserve"> no servidor, e o framework Express.js, que simplifica a criação de </w:t>
+      </w:r>
+      <w:proofErr w:type="spellStart"/>
+      <w:r>
+        <w:rPr>
+          <w:szCs w:val="24"/>
+        </w:rPr>
+        <w:t>APIs</w:t>
+      </w:r>
+      <w:proofErr w:type="spellEnd"/>
+      <w:r>
+        <w:rPr>
+          <w:szCs w:val="24"/>
+        </w:rPr>
+        <w:t xml:space="preserve">. O Express.js foi escolhido por sua leveza, flexibilidade e pela grande quantidade de bibliotecas disponíveis no ecossistema Node.js, como </w:t>
+      </w:r>
+      <w:proofErr w:type="spellStart"/>
+      <w:r>
+        <w:rPr>
+          <w:szCs w:val="24"/>
+        </w:rPr>
+        <w:t>bcrypt</w:t>
+      </w:r>
+      <w:proofErr w:type="spellEnd"/>
+      <w:r>
+        <w:rPr>
+          <w:szCs w:val="24"/>
+        </w:rPr>
+        <w:t xml:space="preserve"> para criptografia de senhas e </w:t>
+      </w:r>
+      <w:proofErr w:type="spellStart"/>
+      <w:r>
+        <w:rPr>
+          <w:szCs w:val="24"/>
+        </w:rPr>
+        <w:t>jsonwebtoken</w:t>
+      </w:r>
+      <w:proofErr w:type="spellEnd"/>
+      <w:r>
+        <w:rPr>
+          <w:szCs w:val="24"/>
+        </w:rPr>
+        <w:t xml:space="preserve"> para autenticação.</w:t>
       </w:r>
     </w:p>
     <w:p>
@@ -7719,33 +8579,97 @@
           <w:szCs w:val="24"/>
         </w:rPr>
         <w:tab/>
-        <w:t xml:space="preserve">Para o desenvolvimento do código, a equipe utilizará o Visual Studio Code, editor gratuito e amplamente adotado na indústria. A prototipação das telas foi realizada no Figma, que permitiu criar e validar as interfaces antes do </w:t>
-      </w:r>
-      <w:r>
-        <w:rPr>
+        <w:t xml:space="preserve">Para o desenvolvimento do código, a equipe utilizará o Visual Studio </w:t>
+      </w:r>
+      <w:proofErr w:type="spellStart"/>
+      <w:r>
+        <w:rPr>
+          <w:szCs w:val="24"/>
+        </w:rPr>
+        <w:t>Code</w:t>
+      </w:r>
+      <w:proofErr w:type="spellEnd"/>
+      <w:r>
+        <w:rPr>
+          <w:szCs w:val="24"/>
+        </w:rPr>
+        <w:t xml:space="preserve">, editor gratuito e amplamente adotado na indústria. A prototipação das telas foi realizada no </w:t>
+      </w:r>
+      <w:proofErr w:type="spellStart"/>
+      <w:r>
+        <w:rPr>
+          <w:szCs w:val="24"/>
+        </w:rPr>
+        <w:t>Figma</w:t>
+      </w:r>
+      <w:proofErr w:type="spellEnd"/>
+      <w:r>
+        <w:rPr>
+          <w:szCs w:val="24"/>
+        </w:rPr>
+        <w:t xml:space="preserve">, que permitiu criar e validar as interfaces antes do desenvolvimento. Para testes de rotas da API, será utilizado o </w:t>
+      </w:r>
+      <w:proofErr w:type="spellStart"/>
+      <w:r>
+        <w:rPr>
+          <w:szCs w:val="24"/>
+        </w:rPr>
+        <w:t>Postman</w:t>
+      </w:r>
+      <w:proofErr w:type="spellEnd"/>
+      <w:r>
+        <w:rPr>
+          <w:szCs w:val="24"/>
+        </w:rPr>
+        <w:t>, ferramenta que facilita o envio de requisições HTTP e a verificação das respostas do servidor.</w:t>
+      </w:r>
+    </w:p>
+    <w:p>
+      <w:pPr>
+        <w:spacing w:line="360" w:lineRule="auto"/>
+        <w:jc w:val="both"/>
+        <w:rPr>
+          <w:b/>
+          <w:bCs/>
+          <w:szCs w:val="24"/>
+        </w:rPr>
+      </w:pPr>
+      <w:proofErr w:type="spellStart"/>
+      <w:r>
+        <w:rPr>
+          <w:b/>
+          <w:bCs/>
           <w:szCs w:val="24"/>
         </w:rPr>
         <w:lastRenderedPageBreak/>
-        <w:t>desenvolvimento. Para testes de rotas da API, será utilizado o Postman, ferramenta que facilita o envio de requisições HTTP e a verificação das respostas do servidor.</w:t>
-      </w:r>
-    </w:p>
-    <w:p>
-      <w:pPr>
-        <w:spacing w:line="360" w:lineRule="auto"/>
-        <w:jc w:val="both"/>
-        <w:rPr>
-          <w:b/>
-          <w:bCs/>
-          <w:szCs w:val="24"/>
-        </w:rPr>
-      </w:pPr>
-      <w:r>
-        <w:rPr>
-          <w:b/>
-          <w:bCs/>
-          <w:szCs w:val="24"/>
-        </w:rPr>
-        <w:t>Progressive Web App (PWA)</w:t>
+        <w:t>Progressive</w:t>
+      </w:r>
+      <w:proofErr w:type="spellEnd"/>
+      <w:r>
+        <w:rPr>
+          <w:b/>
+          <w:bCs/>
+          <w:szCs w:val="24"/>
+        </w:rPr>
+        <w:t xml:space="preserve"> Web </w:t>
+      </w:r>
+      <w:proofErr w:type="spellStart"/>
+      <w:r>
+        <w:rPr>
+          <w:b/>
+          <w:bCs/>
+          <w:szCs w:val="24"/>
+        </w:rPr>
+        <w:t>App</w:t>
+      </w:r>
+      <w:proofErr w:type="spellEnd"/>
+      <w:r>
+        <w:rPr>
+          <w:b/>
+          <w:bCs/>
+          <w:szCs w:val="24"/>
+        </w:rPr>
+        <w:t xml:space="preserve"> (PWA)</w:t>
       </w:r>
     </w:p>
     <w:p>
@@ -7761,8 +8685,124 @@
           <w:szCs w:val="24"/>
         </w:rPr>
         <w:tab/>
-        <w:t>Após a conclusão da versão web, o sistema será adaptado para funcionar como um Progressive Web App. Essa abordagem permite que o SIGEPI seja instalado em dispositivos móveis como se fosse um aplicativo nativo, sem a necessidade de publicação de lojas como Google Play ou App Store. O PWA utiliza recursos como Service Workers e Web App Manifest para oferecer uma experiência próxima à de um aplicativo móvel, mantendo a mesma base de código da versão web.</w:t>
-      </w:r>
+        <w:t xml:space="preserve">Após a conclusão da versão web, o sistema será adaptado para funcionar como um </w:t>
+      </w:r>
+      <w:proofErr w:type="spellStart"/>
+      <w:r>
+        <w:rPr>
+          <w:szCs w:val="24"/>
+        </w:rPr>
+        <w:t>Progressive</w:t>
+      </w:r>
+      <w:proofErr w:type="spellEnd"/>
+      <w:r>
+        <w:rPr>
+          <w:szCs w:val="24"/>
+        </w:rPr>
+        <w:t xml:space="preserve"> Web </w:t>
+      </w:r>
+      <w:proofErr w:type="spellStart"/>
+      <w:r>
+        <w:rPr>
+          <w:szCs w:val="24"/>
+        </w:rPr>
+        <w:t>App</w:t>
+      </w:r>
+      <w:proofErr w:type="spellEnd"/>
+      <w:r>
+        <w:rPr>
+          <w:szCs w:val="24"/>
+        </w:rPr>
+        <w:t xml:space="preserve">. Essa abordagem permite que o SIGEPI seja instalado em dispositivos móveis como se fosse um aplicativo nativo, sem a necessidade de publicação de lojas como Google Play ou </w:t>
+      </w:r>
+      <w:proofErr w:type="spellStart"/>
+      <w:r>
+        <w:rPr>
+          <w:szCs w:val="24"/>
+        </w:rPr>
+        <w:t>App</w:t>
+      </w:r>
+      <w:proofErr w:type="spellEnd"/>
+      <w:r>
+        <w:rPr>
+          <w:szCs w:val="24"/>
+        </w:rPr>
+        <w:t xml:space="preserve"> </w:t>
+      </w:r>
+      <w:proofErr w:type="spellStart"/>
+      <w:r>
+        <w:rPr>
+          <w:szCs w:val="24"/>
+        </w:rPr>
+        <w:t>Store</w:t>
+      </w:r>
+      <w:proofErr w:type="spellEnd"/>
+      <w:r>
+        <w:rPr>
+          <w:szCs w:val="24"/>
+        </w:rPr>
+        <w:t xml:space="preserve">. O PWA utiliza recursos como Service </w:t>
+      </w:r>
+      <w:proofErr w:type="spellStart"/>
+      <w:r>
+        <w:rPr>
+          <w:szCs w:val="24"/>
+        </w:rPr>
+        <w:t>Workers</w:t>
+      </w:r>
+      <w:proofErr w:type="spellEnd"/>
+      <w:r>
+        <w:rPr>
+          <w:szCs w:val="24"/>
+        </w:rPr>
+        <w:t xml:space="preserve"> e Web </w:t>
+      </w:r>
+      <w:proofErr w:type="spellStart"/>
+      <w:r>
+        <w:rPr>
+          <w:szCs w:val="24"/>
+        </w:rPr>
+        <w:t>App</w:t>
+      </w:r>
+      <w:proofErr w:type="spellEnd"/>
+      <w:r>
+        <w:rPr>
+          <w:szCs w:val="24"/>
+        </w:rPr>
+        <w:t xml:space="preserve"> </w:t>
+      </w:r>
+      <w:proofErr w:type="spellStart"/>
+      <w:r>
+        <w:rPr>
+          <w:szCs w:val="24"/>
+        </w:rPr>
+        <w:t>Manifest</w:t>
+      </w:r>
+      <w:proofErr w:type="spellEnd"/>
+      <w:r>
+        <w:rPr>
+          <w:szCs w:val="24"/>
+        </w:rPr>
+        <w:t xml:space="preserve"> para oferecer uma experiência próxima à de um aplicativo móvel, mantendo a mesma base de código da versão web.</w:t>
+      </w:r>
+    </w:p>
+    <w:p>
+      <w:pPr>
+        <w:spacing w:line="360" w:lineRule="auto"/>
+        <w:jc w:val="both"/>
+        <w:rPr>
+          <w:szCs w:val="24"/>
+        </w:rPr>
+      </w:pPr>
+    </w:p>
+    <w:p>
+      <w:pPr>
+        <w:spacing w:line="360" w:lineRule="auto"/>
+        <w:jc w:val="both"/>
+        <w:rPr>
+          <w:szCs w:val="24"/>
+        </w:rPr>
+      </w:pPr>
     </w:p>
     <w:p>
       <w:pPr>
@@ -8207,13 +9247,23 @@
           <w:szCs w:val="24"/>
         </w:rPr>
       </w:pPr>
-      <w:r>
-        <w:rPr>
-          <w:b/>
-          <w:bCs/>
-          <w:szCs w:val="24"/>
-        </w:rPr>
-        <w:lastRenderedPageBreak/>
+    </w:p>
+    <w:p>
+      <w:pPr>
+        <w:spacing w:line="360" w:lineRule="auto"/>
+        <w:jc w:val="both"/>
+        <w:rPr>
+          <w:b/>
+          <w:bCs/>
+          <w:szCs w:val="24"/>
+        </w:rPr>
+      </w:pPr>
+      <w:r>
+        <w:rPr>
+          <w:b/>
+          <w:bCs/>
+          <w:szCs w:val="24"/>
+        </w:rPr>
         <w:t>11 CRONOGRAMA</w:t>
       </w:r>
     </w:p>
@@ -8230,6 +9280,11 @@
           <w:szCs w:val="24"/>
         </w:rPr>
         <w:tab/>
+      </w:r>
+      <w:r>
+        <w:rPr>
+          <w:szCs w:val="24"/>
+        </w:rPr>
         <w:t>O desenvolvimento do SIGEPI está organizado em etapas ao longo do primeiro semestre de 2026, com previsão de apresentação final em dezembro do mesmo ano.</w:t>
       </w:r>
     </w:p>
@@ -8246,7 +9301,21 @@
           <w:szCs w:val="24"/>
         </w:rPr>
         <w:tab/>
-        <w:t>Entre fevereiro e março de 2026, a equipe concentrou esforços na fase de planejamento: levantamento de requisitos, definição das regras de negócio, elaboração da documentação inicial e criação do protótipo das telas do Figma. Esta etapa já foi concluída.</w:t>
+        <w:t xml:space="preserve">Entre fevereiro e março de 2026, a equipe concentrou esforços na fase de planejamento: levantamento de requisitos, definição das regras de negócio, elaboração da documentação inicial e criação do protótipo das telas do </w:t>
+      </w:r>
+      <w:proofErr w:type="spellStart"/>
+      <w:r>
+        <w:rPr>
+          <w:szCs w:val="24"/>
+        </w:rPr>
+        <w:t>Figma</w:t>
+      </w:r>
+      <w:proofErr w:type="spellEnd"/>
+      <w:r>
+        <w:rPr>
+          <w:szCs w:val="24"/>
+        </w:rPr>
+        <w:t>. Esta etapa já foi concluída.</w:t>
       </w:r>
     </w:p>
     <w:p>
@@ -8262,13 +9331,105 @@
           <w:szCs w:val="24"/>
         </w:rPr>
         <w:tab/>
-        <w:t xml:space="preserve">Em abril de 2026, está previsto o início do desenvolvimento prático do sistema. A equipe começará pelo </w:t>
-      </w:r>
-      <w:r>
-        <w:rPr>
-          <w:szCs w:val="24"/>
-        </w:rPr>
-        <w:t>desenvolvimento das telas do front-end, com base no protótipo do Figma. Paralelamente, com o desenvolvimento do back-end, com a implementação das rotas de autenticação, cadastro de funcionários e EPIs, e controle de estoque.</w:t>
+        <w:t>Em abril de 2026, teve início o desenvolvimento prático do sistema. A equipe concluiu o desenvolvimento de todas as 18 telas do front-</w:t>
+      </w:r>
+      <w:proofErr w:type="spellStart"/>
+      <w:r>
+        <w:rPr>
+          <w:szCs w:val="24"/>
+        </w:rPr>
+        <w:t>end</w:t>
+      </w:r>
+      <w:proofErr w:type="spellEnd"/>
+      <w:r>
+        <w:rPr>
+          <w:szCs w:val="24"/>
+        </w:rPr>
+        <w:t xml:space="preserve">, com base no protótipo do </w:t>
+      </w:r>
+      <w:proofErr w:type="spellStart"/>
+      <w:r>
+        <w:rPr>
+          <w:szCs w:val="24"/>
+        </w:rPr>
+        <w:t>Figma</w:t>
+      </w:r>
+      <w:proofErr w:type="spellEnd"/>
+      <w:r>
+        <w:rPr>
+          <w:szCs w:val="24"/>
+        </w:rPr>
+        <w:t xml:space="preserve">, sem uso de CSS </w:t>
+      </w:r>
+      <w:proofErr w:type="spellStart"/>
+      <w:r>
+        <w:rPr>
+          <w:szCs w:val="24"/>
+        </w:rPr>
+        <w:t>inline</w:t>
+      </w:r>
+      <w:proofErr w:type="spellEnd"/>
+      <w:r>
+        <w:rPr>
+          <w:szCs w:val="24"/>
+        </w:rPr>
+        <w:t xml:space="preserve"> e com script externo unificado. Em paralelo, foi iniciado o desenvolvimento do </w:t>
+      </w:r>
+      <w:proofErr w:type="spellStart"/>
+      <w:r>
+        <w:rPr>
+          <w:szCs w:val="24"/>
+        </w:rPr>
+        <w:t>back-end</w:t>
+      </w:r>
+      <w:proofErr w:type="spellEnd"/>
+      <w:r>
+        <w:rPr>
+          <w:szCs w:val="24"/>
+        </w:rPr>
+        <w:t xml:space="preserve"> com Node.js e Express.js, com as rotas de autenticação (cadastro e </w:t>
+      </w:r>
+      <w:proofErr w:type="spellStart"/>
+      <w:r>
+        <w:rPr>
+          <w:szCs w:val="24"/>
+        </w:rPr>
+        <w:t>login</w:t>
+      </w:r>
+      <w:proofErr w:type="spellEnd"/>
+      <w:r>
+        <w:rPr>
+          <w:szCs w:val="24"/>
+        </w:rPr>
+        <w:t xml:space="preserve"> com JWT e </w:t>
+      </w:r>
+      <w:proofErr w:type="spellStart"/>
+      <w:r>
+        <w:rPr>
+          <w:szCs w:val="24"/>
+        </w:rPr>
+        <w:t>bcrypt</w:t>
+      </w:r>
+      <w:proofErr w:type="spellEnd"/>
+      <w:r>
+        <w:rPr>
+          <w:szCs w:val="24"/>
+        </w:rPr>
+        <w:t xml:space="preserve">) e cadastro de empresa já implementadas e testadas via </w:t>
+      </w:r>
+      <w:proofErr w:type="spellStart"/>
+      <w:r>
+        <w:rPr>
+          <w:szCs w:val="24"/>
+        </w:rPr>
+        <w:t>Postman</w:t>
+      </w:r>
+      <w:proofErr w:type="spellEnd"/>
+      <w:r>
+        <w:rPr>
+          <w:szCs w:val="24"/>
+        </w:rPr>
+        <w:t>.</w:t>
       </w:r>
     </w:p>
     <w:p>
@@ -8284,7 +9445,35 @@
           <w:szCs w:val="24"/>
         </w:rPr>
         <w:tab/>
-        <w:t>Entre maio e julho de 2026, serão implementadas as funcionalidades restantes da versão web: registro de entregas e devoluções, painel de dashboard, geração de relatórios em PDF e sistemas de alertas para EPIs com validade próxima do vencimento. Ao final desse período, a versão web do sistema deverá estar funcional.</w:t>
+        <w:t xml:space="preserve">Entre maio e julho de 2026, estão sendo implementadas as funcionalidades restantes do </w:t>
+      </w:r>
+      <w:proofErr w:type="spellStart"/>
+      <w:r>
+        <w:rPr>
+          <w:szCs w:val="24"/>
+        </w:rPr>
+        <w:t>back-end</w:t>
+      </w:r>
+      <w:proofErr w:type="spellEnd"/>
+      <w:r>
+        <w:rPr>
+          <w:szCs w:val="24"/>
+        </w:rPr>
+        <w:t xml:space="preserve">: cadastro de setores, vinculação de funcionários à empresa, cadastro de EPIs, registro de entregas e devoluções, painel de </w:t>
+      </w:r>
+      <w:proofErr w:type="spellStart"/>
+      <w:r>
+        <w:rPr>
+          <w:szCs w:val="24"/>
+        </w:rPr>
+        <w:t>dashboard</w:t>
+      </w:r>
+      <w:proofErr w:type="spellEnd"/>
+      <w:r>
+        <w:rPr>
+          <w:szCs w:val="24"/>
+        </w:rPr>
+        <w:t xml:space="preserve"> e geração de relatórios em PDF. O banco de dados relacional foi finalizado com 14 tabelas, trigger de atualização automática de estoque (FIFO) e código SQL completo.</w:t>
       </w:r>
     </w:p>
     <w:p>
@@ -8300,7 +9489,91 @@
           <w:szCs w:val="24"/>
         </w:rPr>
         <w:tab/>
-        <w:t>Em agosto de 2026, será iniciada a adaptação para dispositivos móveis por meio do Progressive Web App (PWA). Essa fase incluirá a configuração do Service Worker, do Web App Manifest e os ajustes de layout necessários para garantir boa usabilidade em telas menores.</w:t>
+        <w:t xml:space="preserve">Em agosto de 2026, será iniciada a adaptação para dispositivos móveis por meio do </w:t>
+      </w:r>
+      <w:proofErr w:type="spellStart"/>
+      <w:r>
+        <w:rPr>
+          <w:szCs w:val="24"/>
+        </w:rPr>
+        <w:t>Progressive</w:t>
+      </w:r>
+      <w:proofErr w:type="spellEnd"/>
+      <w:r>
+        <w:rPr>
+          <w:szCs w:val="24"/>
+        </w:rPr>
+        <w:t xml:space="preserve"> Web </w:t>
+      </w:r>
+      <w:proofErr w:type="spellStart"/>
+      <w:r>
+        <w:rPr>
+          <w:szCs w:val="24"/>
+        </w:rPr>
+        <w:t>App</w:t>
+      </w:r>
+      <w:proofErr w:type="spellEnd"/>
+      <w:r>
+        <w:rPr>
+          <w:szCs w:val="24"/>
+        </w:rPr>
+        <w:t xml:space="preserve"> (PWA). Essa fase incluirá a configuração do Service </w:t>
+      </w:r>
+      <w:proofErr w:type="spellStart"/>
+      <w:r>
+        <w:rPr>
+          <w:szCs w:val="24"/>
+        </w:rPr>
+        <w:t>Worker</w:t>
+      </w:r>
+      <w:proofErr w:type="spellEnd"/>
+      <w:r>
+        <w:rPr>
+          <w:szCs w:val="24"/>
+        </w:rPr>
+        <w:t xml:space="preserve">, do Web </w:t>
+      </w:r>
+      <w:proofErr w:type="spellStart"/>
+      <w:r>
+        <w:rPr>
+          <w:szCs w:val="24"/>
+        </w:rPr>
+        <w:t>App</w:t>
+      </w:r>
+      <w:proofErr w:type="spellEnd"/>
+      <w:r>
+        <w:rPr>
+          <w:szCs w:val="24"/>
+        </w:rPr>
+        <w:t xml:space="preserve"> </w:t>
+      </w:r>
+      <w:proofErr w:type="spellStart"/>
+      <w:r>
+        <w:rPr>
+          <w:szCs w:val="24"/>
+        </w:rPr>
+        <w:t>Manifest</w:t>
+      </w:r>
+      <w:proofErr w:type="spellEnd"/>
+      <w:r>
+        <w:rPr>
+          <w:szCs w:val="24"/>
+        </w:rPr>
+        <w:t xml:space="preserve"> e os ajustes de layout necessários para garantir </w:t>
+      </w:r>
+      <w:proofErr w:type="spellStart"/>
+      <w:r>
+        <w:rPr>
+          <w:szCs w:val="24"/>
+        </w:rPr>
+        <w:t>boa</w:t>
+      </w:r>
+      <w:proofErr w:type="spellEnd"/>
+      <w:r>
+        <w:rPr>
+          <w:szCs w:val="24"/>
+        </w:rPr>
+        <w:t xml:space="preserve"> usabilidade em telas menores.</w:t>
       </w:r>
     </w:p>
     <w:p>
@@ -8334,53 +9607,8 @@
           <w:szCs w:val="24"/>
         </w:rPr>
         <w:tab/>
-        <w:t xml:space="preserve">A apresentação final do Trabalho de Conclusão de Curso </w:t>
-      </w:r>
-      <w:r>
-        <w:rPr>
-          <w:szCs w:val="24"/>
-        </w:rPr>
-        <w:t>está prevista entre o final de novembro e o início</w:t>
-      </w:r>
-      <w:r>
-        <w:rPr>
-          <w:szCs w:val="24"/>
-        </w:rPr>
-        <w:t xml:space="preserve"> de dezembro de 2026.</w:t>
-      </w:r>
-    </w:p>
-    <w:p>
-      <w:pPr>
-        <w:spacing w:line="360" w:lineRule="auto"/>
-        <w:jc w:val="both"/>
-        <w:rPr>
-          <w:b/>
-          <w:bCs/>
-          <w:szCs w:val="24"/>
-        </w:rPr>
-      </w:pPr>
-    </w:p>
-    <w:p>
-      <w:pPr>
-        <w:spacing w:line="360" w:lineRule="auto"/>
-        <w:jc w:val="both"/>
-        <w:rPr>
-          <w:b/>
-          <w:bCs/>
-          <w:szCs w:val="24"/>
-        </w:rPr>
-      </w:pPr>
-    </w:p>
-    <w:p>
-      <w:pPr>
-        <w:spacing w:line="360" w:lineRule="auto"/>
-        <w:jc w:val="both"/>
-        <w:rPr>
-          <w:b/>
-          <w:bCs/>
-          <w:szCs w:val="24"/>
-        </w:rPr>
-      </w:pPr>
+        <w:t>A apresentação final do Trabalho de Conclusão de Curso está prevista entre o final de novembro e o início de dezembro de 2026.</w:t>
+      </w:r>
     </w:p>
     <w:p>
       <w:pPr>
@@ -8481,6 +9709,11 @@
           <w:szCs w:val="24"/>
         </w:rPr>
         <w:tab/>
+      </w:r>
+      <w:r>
+        <w:rPr>
+          <w:szCs w:val="24"/>
+        </w:rPr>
         <w:t>A identidade visual do SIGEPI foi desenvolvida com o objetivo de transmitir confiabilidade, organização e clareza, características essenciais para um sistema voltado ao ambiente corporativo e à segurança do trabalho.</w:t>
       </w:r>
     </w:p>
@@ -8497,7 +9730,35 @@
           <w:szCs w:val="24"/>
         </w:rPr>
         <w:tab/>
-        <w:t>A paleta de cores foi definida com base em quatro cores principais. O verde claro é a cor de destaque do sistema, associado à segurança e à aprovação de itens. O azul claro é utilizado nos elementos estruturais da interface, como menus, cabeçalhos e botões de ação, transmitindo seriedade e profissionalismo. O branco predomina nos fundos das telas, garantindo legibilidade e um visual limpo. O vermelho e o amarelo são reservados exclusivamente para indicadores de alerta, como EPIs com validade vencida, estoque baixo do mínimo ou solicitações pendentes.</w:t>
+        <w:t>A paleta de cores foi definida com base em seis cores com funções específicas. O azul (#3c98bd) é a cor de background do sistema, utilizado no cabeçalho e fundo das páginas. O verde-água (#5bcfb5) é a cor dos botões de ação e destaque do logo, associado à aprovação e segurança. O branco (#</w:t>
+      </w:r>
+      <w:proofErr w:type="spellStart"/>
+      <w:r>
+        <w:rPr>
+          <w:szCs w:val="24"/>
+        </w:rPr>
+        <w:t>ffffff</w:t>
+      </w:r>
+      <w:proofErr w:type="spellEnd"/>
+      <w:r>
+        <w:rPr>
+          <w:szCs w:val="24"/>
+        </w:rPr>
+        <w:t xml:space="preserve">) predomina nos fundos dos </w:t>
+      </w:r>
+      <w:proofErr w:type="spellStart"/>
+      <w:r>
+        <w:rPr>
+          <w:szCs w:val="24"/>
+        </w:rPr>
+        <w:t>cards</w:t>
+      </w:r>
+      <w:proofErr w:type="spellEnd"/>
+      <w:r>
+        <w:rPr>
+          <w:szCs w:val="24"/>
+        </w:rPr>
+        <w:t>, garantindo legibilidade e visual limpo. O vermelho (#e53935) é reservado para alertas críticos, como EPIs com validade vencida ou estoque abaixo do mínimo. O amarelo (#f5a623) indica alertas moderados, como EPIs próximos ao vencimento ou solicitações pendentes. O azul-escuro (#1a3a50) é utilizado no texto do logo e em elementos textuais de destaque.</w:t>
       </w:r>
     </w:p>
     <w:p>
@@ -8529,13 +9790,91 @@
           <w:szCs w:val="24"/>
         </w:rPr>
         <w:tab/>
-        <w:t xml:space="preserve">O sistema conta com um logotipo próprio, desenvolvido para representar visualmente a </w:t>
-      </w:r>
-      <w:r>
-        <w:rPr>
-          <w:szCs w:val="24"/>
-        </w:rPr>
-        <w:t>proposta do SIGEPI. O logo será exibido na tela de login, no menu superior e nos relatórios pelo sistema.</w:t>
+        <w:t xml:space="preserve">A tipografia adotada é a família </w:t>
+      </w:r>
+      <w:proofErr w:type="spellStart"/>
+      <w:r>
+        <w:rPr>
+          <w:szCs w:val="24"/>
+        </w:rPr>
+        <w:t>Poppins</w:t>
+      </w:r>
+      <w:proofErr w:type="spellEnd"/>
+      <w:r>
+        <w:rPr>
+          <w:szCs w:val="24"/>
+        </w:rPr>
+        <w:t xml:space="preserve">, importada do Google </w:t>
+      </w:r>
+      <w:proofErr w:type="spellStart"/>
+      <w:r>
+        <w:rPr>
+          <w:szCs w:val="24"/>
+        </w:rPr>
+        <w:t>Fonts</w:t>
+      </w:r>
+      <w:proofErr w:type="spellEnd"/>
+      <w:r>
+        <w:rPr>
+          <w:szCs w:val="24"/>
+        </w:rPr>
+        <w:t xml:space="preserve">, com três pesos distintos: </w:t>
+      </w:r>
+      <w:proofErr w:type="spellStart"/>
+      <w:r>
+        <w:rPr>
+          <w:szCs w:val="24"/>
+        </w:rPr>
+        <w:t>Semibold</w:t>
+      </w:r>
+      <w:proofErr w:type="spellEnd"/>
+      <w:r>
+        <w:rPr>
+          <w:szCs w:val="24"/>
+        </w:rPr>
+        <w:t xml:space="preserve"> (títulos e botões), Regular (corpo de texto e </w:t>
+      </w:r>
+      <w:proofErr w:type="spellStart"/>
+      <w:r>
+        <w:rPr>
+          <w:szCs w:val="24"/>
+        </w:rPr>
+        <w:t>labels</w:t>
+      </w:r>
+      <w:proofErr w:type="spellEnd"/>
+      <w:r>
+        <w:rPr>
+          <w:szCs w:val="24"/>
+        </w:rPr>
+        <w:t>) e Light (</w:t>
+      </w:r>
+      <w:proofErr w:type="spellStart"/>
+      <w:r>
+        <w:rPr>
+          <w:szCs w:val="24"/>
+        </w:rPr>
+        <w:t>placeholders</w:t>
+      </w:r>
+      <w:proofErr w:type="spellEnd"/>
+      <w:r>
+        <w:rPr>
+          <w:szCs w:val="24"/>
+        </w:rPr>
+        <w:t xml:space="preserve"> e textos secundários). Os tamanhos seguem uma hierarquia de 36px para títulos de página, 24px para subtítulos, 16px para corpo de texto, 14px para </w:t>
+      </w:r>
+      <w:proofErr w:type="spellStart"/>
+      <w:r>
+        <w:rPr>
+          <w:szCs w:val="24"/>
+        </w:rPr>
+        <w:t>labels</w:t>
+      </w:r>
+      <w:proofErr w:type="spellEnd"/>
+      <w:r>
+        <w:rPr>
+          <w:szCs w:val="24"/>
+        </w:rPr>
+        <w:t xml:space="preserve"> e 12px para textos secundários.</w:t>
       </w:r>
     </w:p>
     <w:p>
@@ -8551,7 +9890,35 @@
           <w:szCs w:val="24"/>
         </w:rPr>
         <w:tab/>
-        <w:t>O layout das telas segue um padrão consistente em todas as páginas: menu superior fixo para navegação entre as seções (dashboard, EPIs, funcionários, relatórios), cabeçalho com identificação do usuário logado e área de conteúdo central. Essa estrutura padronizada reduz o tempo de aprendizado do sistema e melhora a experiência do usuário.</w:t>
+        <w:t>O layout das telas segue um padrão consistente em todas as páginas: menu superior fixo para navegação entre as seções (</w:t>
+      </w:r>
+      <w:proofErr w:type="spellStart"/>
+      <w:r>
+        <w:rPr>
+          <w:szCs w:val="24"/>
+        </w:rPr>
+        <w:t>dashboard</w:t>
+      </w:r>
+      <w:proofErr w:type="spellEnd"/>
+      <w:r>
+        <w:rPr>
+          <w:szCs w:val="24"/>
+        </w:rPr>
+        <w:t xml:space="preserve">, EPIs, funcionários, relatórios), cabeçalho com identificação do usuário </w:t>
+      </w:r>
+      <w:proofErr w:type="spellStart"/>
+      <w:r>
+        <w:rPr>
+          <w:szCs w:val="24"/>
+        </w:rPr>
+        <w:t>logado</w:t>
+      </w:r>
+      <w:proofErr w:type="spellEnd"/>
+      <w:r>
+        <w:rPr>
+          <w:szCs w:val="24"/>
+        </w:rPr>
+        <w:t xml:space="preserve"> e área de conteúdo central. Essa estrutura padronizada reduz o tempo de aprendizado do sistema e melhora a experiência do usuário.</w:t>
       </w:r>
     </w:p>
     <w:p>
@@ -8624,50 +9991,6 @@
           <w:szCs w:val="24"/>
         </w:rPr>
       </w:pPr>
-    </w:p>
-    <w:p>
-      <w:pPr>
-        <w:spacing w:line="360" w:lineRule="auto"/>
-        <w:jc w:val="both"/>
-        <w:rPr>
-          <w:b/>
-          <w:bCs/>
-          <w:szCs w:val="24"/>
-        </w:rPr>
-      </w:pPr>
-    </w:p>
-    <w:p>
-      <w:pPr>
-        <w:spacing w:line="360" w:lineRule="auto"/>
-        <w:jc w:val="both"/>
-        <w:rPr>
-          <w:b/>
-          <w:bCs/>
-          <w:szCs w:val="24"/>
-        </w:rPr>
-      </w:pPr>
-    </w:p>
-    <w:p>
-      <w:pPr>
-        <w:spacing w:line="360" w:lineRule="auto"/>
-        <w:jc w:val="both"/>
-        <w:rPr>
-          <w:b/>
-          <w:bCs/>
-          <w:szCs w:val="24"/>
-        </w:rPr>
-      </w:pPr>
-    </w:p>
-    <w:p>
-      <w:pPr>
-        <w:spacing w:line="360" w:lineRule="auto"/>
-        <w:jc w:val="both"/>
-        <w:rPr>
-          <w:b/>
-          <w:bCs/>
-          <w:szCs w:val="24"/>
-        </w:rPr>
-      </w:pPr>
       <w:r>
         <w:rPr>
           <w:b/>
@@ -8677,6 +10000,14 @@
         <w:lastRenderedPageBreak/>
         <w:t>12 WIREFRAMES</w:t>
       </w:r>
+      <w:r>
+        <w:rPr>
+          <w:b/>
+          <w:bCs/>
+          <w:szCs w:val="24"/>
+        </w:rPr>
+        <w:t xml:space="preserve"> E PROTOTIPAÇÃO</w:t>
+      </w:r>
     </w:p>
     <w:p>
       <w:pPr>
@@ -8691,7 +10022,68 @@
           <w:szCs w:val="24"/>
         </w:rPr>
         <w:tab/>
-        <w:t>Antes do início do desenvolvimento, a equipe elaborou os wireframes faz principais telas do SIGEPI usando o Figma. Os wireframes apresentam a estrutura visual e o fluxo de navegação do sistema, servindo como referência durante a implementação do front-end.</w:t>
+      </w:r>
+      <w:r>
+        <w:rPr>
+          <w:szCs w:val="24"/>
+        </w:rPr>
+        <w:t xml:space="preserve">Antes do início do desenvolvimento, a equipe elaborou os </w:t>
+      </w:r>
+      <w:proofErr w:type="spellStart"/>
+      <w:r>
+        <w:rPr>
+          <w:szCs w:val="24"/>
+        </w:rPr>
+        <w:t>wireframes</w:t>
+      </w:r>
+      <w:proofErr w:type="spellEnd"/>
+      <w:r>
+        <w:rPr>
+          <w:szCs w:val="24"/>
+        </w:rPr>
+        <w:t xml:space="preserve"> das principais telas do SIGEPI utilizando o </w:t>
+      </w:r>
+      <w:proofErr w:type="spellStart"/>
+      <w:r>
+        <w:rPr>
+          <w:szCs w:val="24"/>
+        </w:rPr>
+        <w:t>Figma</w:t>
+      </w:r>
+      <w:proofErr w:type="spellEnd"/>
+      <w:r>
+        <w:rPr>
+          <w:szCs w:val="24"/>
+        </w:rPr>
+        <w:t xml:space="preserve">. Os </w:t>
+      </w:r>
+      <w:proofErr w:type="spellStart"/>
+      <w:r>
+        <w:rPr>
+          <w:szCs w:val="24"/>
+        </w:rPr>
+        <w:t>wireframes</w:t>
+      </w:r>
+      <w:proofErr w:type="spellEnd"/>
+      <w:r>
+        <w:rPr>
+          <w:szCs w:val="24"/>
+        </w:rPr>
+        <w:t xml:space="preserve"> serviram como referência inicial para validar o fluxo de navegação e a estrutura das interfaces. A partir dos </w:t>
+      </w:r>
+      <w:proofErr w:type="spellStart"/>
+      <w:r>
+        <w:rPr>
+          <w:szCs w:val="24"/>
+        </w:rPr>
+        <w:t>wireframes</w:t>
+      </w:r>
+      <w:proofErr w:type="spellEnd"/>
+      <w:r>
+        <w:rPr>
+          <w:szCs w:val="24"/>
+        </w:rPr>
+        <w:t>, foi desenvolvido o protótipo de alta fidelidade, totalmente alinhado à identidade visual definida.</w:t>
       </w:r>
     </w:p>
     <w:p>
@@ -8707,7 +10099,49 @@
           <w:szCs w:val="24"/>
         </w:rPr>
         <w:tab/>
-        <w:t>As telas prototipadas incluem: tela de login com campo de e-mail, senha e validação por CAPTCHA; dashboard com indicadores de estoque, EPIs mais utilizados e alertas de validade; tela de gerenciamento de EPIs com listagem, cadastro e edição; tela de funcionários com cadastro e histórico de equipamentos recebidos; tela de registro de entrega e devolução de EPIs; e tela de relatórios com exportação em PDF.</w:t>
+        <w:t xml:space="preserve">O protótipo final conta com 39 telas exportadas, cobrindo todos os fluxos do sistema: termos e condições, </w:t>
+      </w:r>
+      <w:proofErr w:type="spellStart"/>
+      <w:r>
+        <w:rPr>
+          <w:szCs w:val="24"/>
+        </w:rPr>
+        <w:t>login</w:t>
+      </w:r>
+      <w:proofErr w:type="spellEnd"/>
+      <w:r>
+        <w:rPr>
+          <w:szCs w:val="24"/>
+        </w:rPr>
+        <w:t xml:space="preserve">, cadastro, home, cadastro de empresa, setores, planos, pagamento, </w:t>
+      </w:r>
+      <w:proofErr w:type="spellStart"/>
+      <w:r>
+        <w:rPr>
+          <w:szCs w:val="24"/>
+        </w:rPr>
+        <w:t>dashboard</w:t>
+      </w:r>
+      <w:proofErr w:type="spellEnd"/>
+      <w:r>
+        <w:rPr>
+          <w:szCs w:val="24"/>
+        </w:rPr>
+        <w:t xml:space="preserve">, EPIs, funcionários, histórico, meus equipamentos, informações complementares e as seções de configuração (empresa, plano atual e setores). Cada tela foi </w:t>
+      </w:r>
+      <w:proofErr w:type="spellStart"/>
+      <w:r>
+        <w:rPr>
+          <w:szCs w:val="24"/>
+        </w:rPr>
+        <w:t>prototipada</w:t>
+      </w:r>
+      <w:proofErr w:type="spellEnd"/>
+      <w:r>
+        <w:rPr>
+          <w:szCs w:val="24"/>
+        </w:rPr>
+        <w:t xml:space="preserve"> com fidelidade à identidade visual, utilizando as cores, tipografia e componentes que foram implementados no front-end.</w:t>
       </w:r>
     </w:p>
     <w:p>
@@ -8723,52 +10157,36 @@
           <w:szCs w:val="24"/>
         </w:rPr>
         <w:tab/>
-        <w:t>O protótipo foi desenvolvido com fidelidade à identidade visual definida, utilizando as cores, tipografia e componentes que serão implementados no sistema final. Isso permitiu validar a usabilidade e o fluxo das telas antes de qualquer implementação.</w:t>
-      </w:r>
-    </w:p>
-    <w:p>
-      <w:pPr>
-        <w:spacing w:line="360" w:lineRule="auto"/>
-        <w:jc w:val="both"/>
-        <w:rPr>
-          <w:b/>
-          <w:bCs/>
-          <w:szCs w:val="24"/>
-        </w:rPr>
-      </w:pPr>
-    </w:p>
-    <w:p>
-      <w:pPr>
-        <w:spacing w:line="360" w:lineRule="auto"/>
-        <w:jc w:val="both"/>
-        <w:rPr>
-          <w:b/>
-          <w:bCs/>
-          <w:szCs w:val="24"/>
-        </w:rPr>
-      </w:pPr>
-    </w:p>
-    <w:p>
-      <w:pPr>
-        <w:spacing w:line="360" w:lineRule="auto"/>
-        <w:jc w:val="both"/>
-        <w:rPr>
-          <w:b/>
-          <w:bCs/>
-          <w:szCs w:val="24"/>
-        </w:rPr>
-      </w:pPr>
-    </w:p>
-    <w:p>
-      <w:pPr>
-        <w:spacing w:line="360" w:lineRule="auto"/>
-        <w:jc w:val="both"/>
-        <w:rPr>
-          <w:b/>
-          <w:bCs/>
-          <w:szCs w:val="24"/>
-        </w:rPr>
-      </w:pPr>
+        <w:t xml:space="preserve">O protótipo foi desenvolvido no </w:t>
+      </w:r>
+      <w:proofErr w:type="spellStart"/>
+      <w:r>
+        <w:rPr>
+          <w:szCs w:val="24"/>
+        </w:rPr>
+        <w:t>Figma</w:t>
+      </w:r>
+      <w:proofErr w:type="spellEnd"/>
+      <w:r>
+        <w:rPr>
+          <w:szCs w:val="24"/>
+        </w:rPr>
+        <w:t xml:space="preserve"> com dois fluxos distintos: o fluxo do Administrador, que engloba o cadastro da empresa, gestão de EPIs, acompanhamento de funcionários e visualização do </w:t>
+      </w:r>
+      <w:proofErr w:type="spellStart"/>
+      <w:r>
+        <w:rPr>
+          <w:szCs w:val="24"/>
+        </w:rPr>
+        <w:t>dashboard</w:t>
+      </w:r>
+      <w:proofErr w:type="spellEnd"/>
+      <w:r>
+        <w:rPr>
+          <w:szCs w:val="24"/>
+        </w:rPr>
+        <w:t>; e o fluxo do Funcionário, que cobre a entrada na empresa, visualização dos seus EPIs e solicitação de reposição. A prototipação permitiu validar a usabilidade e antecipar decisões de design antes da implementação, servindo como referência direta para o desenvolvimento do front-end.</w:t>
+      </w:r>
     </w:p>
     <w:p>
       <w:pPr>
@@ -8968,6 +10386,11 @@
           <w:szCs w:val="24"/>
         </w:rPr>
         <w:tab/>
+      </w:r>
+      <w:r>
+        <w:rPr>
+          <w:szCs w:val="24"/>
+        </w:rPr>
         <w:t>Ao final do desenvolvimento, espera-se que o SIGEPI esteja operacional como uma aplicação web responsiva, capaz de atender empresas de diferentes portes que necessitem de controle sobre seus Equipamentos de Proteção Individual.</w:t>
       </w:r>
     </w:p>
@@ -8984,12 +10407,21 @@
           <w:szCs w:val="24"/>
         </w:rPr>
         <w:tab/>
-      </w:r>
-      <w:r>
-        <w:rPr>
-          <w:szCs w:val="24"/>
-        </w:rPr>
-        <w:t>Do ponto de vista funcional, o sistema deverá ser capaz de realizar o cadastro completo de funcionários e EPIs, registrar entregas e devoluções, monitorar o estoque em tempo real e emitir alertas automáticos quando equipamentos estiverem com validade próxima do vencimento ou com quantidade abaixo do mínimo estabelecido. Além disso, o painel de dashboard deverá apresentar de forma visual os principais indicadores de gestão, como os EPIs mais utilizados e o histórico de movimentações.</w:t>
+        <w:t xml:space="preserve">Do ponto de vista funcional, o sistema deverá ser capaz de realizar o cadastro completo de funcionários e EPIs, registrar entregas e devoluções, monitorar o estoque em tempo real e emitir alertas automáticos quando equipamentos estiverem com validade próxima do vencimento ou com quantidade abaixo do mínimo estabelecido. Além disso, o painel de </w:t>
+      </w:r>
+      <w:proofErr w:type="spellStart"/>
+      <w:r>
+        <w:rPr>
+          <w:szCs w:val="24"/>
+        </w:rPr>
+        <w:t>dashboard</w:t>
+      </w:r>
+      <w:proofErr w:type="spellEnd"/>
+      <w:r>
+        <w:rPr>
+          <w:szCs w:val="24"/>
+        </w:rPr>
+        <w:t xml:space="preserve"> deverá apresentar de forma visual os principais indicadores de gestão, como os EPIs mais utilizados e o histórico de movimentações.</w:t>
       </w:r>
     </w:p>
     <w:p>
@@ -9029,6 +10461,8 @@
         <w:spacing w:line="360" w:lineRule="auto"/>
         <w:jc w:val="both"/>
         <w:rPr>
+          <w:b/>
+          <w:bCs/>
           <w:szCs w:val="24"/>
         </w:rPr>
       </w:pPr>
@@ -9215,13 +10649,21 @@
         <w:rPr>
           <w:szCs w:val="24"/>
         </w:rPr>
-        <w:t>inicial</w:t>
-      </w:r>
-      <w:r>
-        <w:rPr>
-          <w:szCs w:val="24"/>
-        </w:rPr>
-        <w:t xml:space="preserve"> concluída e o protótipo de telas desenvolvido no Figma, a equipe está preparada para iniciar a fase de desenvolvimento do sistema em abril de 2026.</w:t>
+        <w:t xml:space="preserve">inicial concluída e o protótipo de telas desenvolvido no </w:t>
+      </w:r>
+      <w:proofErr w:type="spellStart"/>
+      <w:r>
+        <w:rPr>
+          <w:szCs w:val="24"/>
+        </w:rPr>
+        <w:t>Figma</w:t>
+      </w:r>
+      <w:proofErr w:type="spellEnd"/>
+      <w:r>
+        <w:rPr>
+          <w:szCs w:val="24"/>
+        </w:rPr>
+        <w:t>, a equipe está preparada para iniciar a fase de desenvolvimento do sistema em abril de 2026.</w:t>
       </w:r>
     </w:p>
     <w:p>
@@ -9253,7 +10695,21 @@
           <w:szCs w:val="24"/>
         </w:rPr>
         <w:tab/>
-        <w:t>Em seguida, serão implementadas as funcionalidades do módulo de autenticação, incluindo login, validação de CAPTCHA e controle de perfis de acesso. Esse módulo é a porta de entrada dos sistemas e precisa estar funcional antes do desenvolvimento das demais telas.</w:t>
+        <w:t xml:space="preserve">Em seguida, serão implementadas as funcionalidades do módulo de autenticação, incluindo </w:t>
+      </w:r>
+      <w:proofErr w:type="spellStart"/>
+      <w:r>
+        <w:rPr>
+          <w:szCs w:val="24"/>
+        </w:rPr>
+        <w:t>login</w:t>
+      </w:r>
+      <w:proofErr w:type="spellEnd"/>
+      <w:r>
+        <w:rPr>
+          <w:szCs w:val="24"/>
+        </w:rPr>
+        <w:t>, validação de CAPTCHA e controle de perfis de acesso. Esse módulo é a porta de entrada dos sistemas e precisa estar funcional antes do desenvolvimento das demais telas.</w:t>
       </w:r>
     </w:p>
     <w:p>
@@ -9269,7 +10725,21 @@
           <w:szCs w:val="24"/>
         </w:rPr>
         <w:tab/>
-        <w:t>Após a autenticação, o desenvolvimento seguirá a ordem de prioridade definida nos requisitos: cadastro de funcionários e EPIs, controle de estoque, registro de entregas e devoluções, e por fim o dashboard e geração de relatórios. Cada funcionalidade será testada individualmente antes de avançar para a próxima.</w:t>
+        <w:t xml:space="preserve">Após a autenticação, o desenvolvimento seguirá a ordem de prioridade definida nos requisitos: cadastro de funcionários e EPIs, controle de estoque, registro de entregas e devoluções, e por fim o </w:t>
+      </w:r>
+      <w:proofErr w:type="spellStart"/>
+      <w:r>
+        <w:rPr>
+          <w:szCs w:val="24"/>
+        </w:rPr>
+        <w:t>dashboard</w:t>
+      </w:r>
+      <w:proofErr w:type="spellEnd"/>
+      <w:r>
+        <w:rPr>
+          <w:szCs w:val="24"/>
+        </w:rPr>
+        <w:t xml:space="preserve"> e geração de relatórios. Cada funcionalidade será testada individualmente antes de avançar para a próxima.</w:t>
       </w:r>
     </w:p>
     <w:p>
@@ -9301,41 +10771,19 @@
           <w:szCs w:val="24"/>
         </w:rPr>
         <w:tab/>
-        <w:t xml:space="preserve">Após a conclusão da versão web, prevista para </w:t>
-      </w:r>
-      <w:r>
-        <w:rPr>
-          <w:szCs w:val="24"/>
-        </w:rPr>
-        <w:t>julho</w:t>
-      </w:r>
-      <w:r>
-        <w:rPr>
-          <w:szCs w:val="24"/>
-        </w:rPr>
-        <w:t xml:space="preserve"> de 2026, será iniciada a adaptação para PWA e os testes finais de usabilidade e segurança. A apresentação final do projeto </w:t>
-      </w:r>
-      <w:r>
-        <w:rPr>
-          <w:szCs w:val="24"/>
-        </w:rPr>
-        <w:t>está agendada entre o meio de novembro e o início</w:t>
-      </w:r>
-      <w:r>
-        <w:rPr>
-          <w:szCs w:val="24"/>
-        </w:rPr>
-        <w:t xml:space="preserve"> de dezembro de 2026.</w:t>
-      </w:r>
-    </w:p>
-    <w:p>
-      <w:pPr>
-        <w:spacing w:line="360" w:lineRule="auto"/>
-        <w:jc w:val="both"/>
-        <w:rPr>
-          <w:szCs w:val="24"/>
-        </w:rPr>
-      </w:pPr>
+        <w:t>Após a conclusão da versão web, prevista para julho de 2026, será iniciada a adaptação para PWA e os testes finais de usabilidade e segurança. A apresentação final do projeto está agendada entre o meio de novembro e o início de dezembro de 2026.</w:t>
+      </w:r>
+    </w:p>
+    <w:p>
+      <w:pPr>
+        <w:spacing w:line="360" w:lineRule="auto"/>
+        <w:jc w:val="both"/>
+        <w:rPr>
+          <w:szCs w:val="24"/>
+        </w:rPr>
+      </w:pPr>
+      <w:bookmarkStart w:id="0" w:name="_GoBack"/>
+      <w:bookmarkEnd w:id="0"/>
     </w:p>
     <w:p>
       <w:pPr>
@@ -9552,7 +11000,7 @@
 </file>
 
 <file path=word/endnotes.xml><?xml version="1.0" encoding="utf-8"?>
-<w:endnotes xmlns:wpc="http://schemas.microsoft.com/office/word/2010/wordprocessingCanvas" xmlns:cx="http://schemas.microsoft.com/office/drawing/2014/chartex" xmlns:cx1="http://schemas.microsoft.com/office/drawing/2015/9/8/chartex" xmlns:cx2="http://schemas.microsoft.com/office/drawing/2015/10/21/chartex" xmlns:cx3="http://schemas.microsoft.com/office/drawing/2016/5/9/chartex" xmlns:cx4="http://schemas.microsoft.com/office/drawing/2016/5/10/chartex" xmlns:cx5="http://schemas.microsoft.com/office/drawing/2016/5/11/chartex" xmlns:cx6="http://schemas.microsoft.com/office/drawing/2016/5/12/chartex" xmlns:cx7="http://schemas.microsoft.com/office/drawing/2016/5/13/chartex" xmlns:cx8="http://schemas.microsoft.com/office/drawing/2016/5/14/chartex" xmlns:mc="http://schemas.openxmlformats.org/markup-compatibility/2006" xmlns:aink="http://schemas.microsoft.com/office/drawing/2016/ink" xmlns:am3d="http://schemas.microsoft.com/office/drawing/2017/model3d" xmlns:o="urn:schemas-microsoft-com:office:office" xmlns:oel="http://schemas.microsoft.com/office/2019/extlst" xmlns:r="http://schemas.openxmlformats.org/officeDocument/2006/relationships" xmlns:m="http://schemas.openxmlformats.org/officeDocument/2006/math" xmlns:v="urn:schemas-microsoft-com:vml" xmlns:wp14="http://schemas.microsoft.com/office/word/2010/wordprocessingDrawing" xmlns:wp="http://schemas.openxmlformats.org/drawingml/2006/wordprocessingDrawing" xmlns:w10="urn:schemas-microsoft-com:office:word" xmlns:w="http://schemas.openxmlformats.org/wordprocessingml/2006/main" xmlns:w14="http://schemas.microsoft.com/office/word/2010/wordml" xmlns:w15="http://schemas.microsoft.com/office/word/2012/wordml" xmlns:w16cex="http://schemas.microsoft.com/office/word/2018/wordml/cex" xmlns:w16cid="http://schemas.microsoft.com/office/word/2016/wordml/cid" xmlns:w16="http://schemas.microsoft.com/office/word/2018/wordml" xmlns:w16du="http://schemas.microsoft.com/office/word/2023/wordml/word16du" xmlns:w16sdtdh="http://schemas.microsoft.com/office/word/2020/wordml/sdtdatahash" xmlns:w16sdtfl="http://schemas.microsoft.com/office/word/2024/wordml/sdtformatlock" xmlns:w16se="http://schemas.microsoft.com/office/word/2015/wordml/symex" xmlns:wpg="http://schemas.microsoft.com/office/word/2010/wordprocessingGroup" xmlns:wpi="http://schemas.microsoft.com/office/word/2010/wordprocessingInk" xmlns:wne="http://schemas.microsoft.com/office/word/2006/wordml" xmlns:wps="http://schemas.microsoft.com/office/word/2010/wordprocessingShape" mc:Ignorable="w14 w15 w16se w16cid w16 w16cex w16sdtdh w16sdtfl w16du wp14">
+<w:endnotes xmlns:wpc="http://schemas.microsoft.com/office/word/2010/wordprocessingCanvas" xmlns:cx="http://schemas.microsoft.com/office/drawing/2014/chartex" xmlns:mc="http://schemas.openxmlformats.org/markup-compatibility/2006" xmlns:o="urn:schemas-microsoft-com:office:office" xmlns:r="http://schemas.openxmlformats.org/officeDocument/2006/relationships" xmlns:m="http://schemas.openxmlformats.org/officeDocument/2006/math" xmlns:v="urn:schemas-microsoft-com:vml" xmlns:wp14="http://schemas.microsoft.com/office/word/2010/wordprocessingDrawing" xmlns:wp="http://schemas.openxmlformats.org/drawingml/2006/wordprocessingDrawing" xmlns:w10="urn:schemas-microsoft-com:office:word" xmlns:w="http://schemas.openxmlformats.org/wordprocessingml/2006/main" xmlns:w14="http://schemas.microsoft.com/office/word/2010/wordml" xmlns:w15="http://schemas.microsoft.com/office/word/2012/wordml" xmlns:w16se="http://schemas.microsoft.com/office/word/2015/wordml/symex" xmlns:wpg="http://schemas.microsoft.com/office/word/2010/wordprocessingGroup" xmlns:wpi="http://schemas.microsoft.com/office/word/2010/wordprocessingInk" xmlns:wne="http://schemas.microsoft.com/office/word/2006/wordml" xmlns:wps="http://schemas.microsoft.com/office/word/2010/wordprocessingShape" mc:Ignorable="w14 w15 w16se wp14">
   <w:endnote w:type="separator" w:id="-1">
     <w:p>
       <w:pPr>
@@ -9577,7 +11025,7 @@
 </file>
 
 <file path=word/footnotes.xml><?xml version="1.0" encoding="utf-8"?>
-<w:footnotes xmlns:wpc="http://schemas.microsoft.com/office/word/2010/wordprocessingCanvas" xmlns:cx="http://schemas.microsoft.com/office/drawing/2014/chartex" xmlns:cx1="http://schemas.microsoft.com/office/drawing/2015/9/8/chartex" xmlns:cx2="http://schemas.microsoft.com/office/drawing/2015/10/21/chartex" xmlns:cx3="http://schemas.microsoft.com/office/drawing/2016/5/9/chartex" xmlns:cx4="http://schemas.microsoft.com/office/drawing/2016/5/10/chartex" xmlns:cx5="http://schemas.microsoft.com/office/drawing/2016/5/11/chartex" xmlns:cx6="http://schemas.microsoft.com/office/drawing/2016/5/12/chartex" xmlns:cx7="http://schemas.microsoft.com/office/drawing/2016/5/13/chartex" xmlns:cx8="http://schemas.microsoft.com/office/drawing/2016/5/14/chartex" xmlns:mc="http://schemas.openxmlformats.org/markup-compatibility/2006" xmlns:aink="http://schemas.microsoft.com/office/drawing/2016/ink" xmlns:am3d="http://schemas.microsoft.com/office/drawing/2017/model3d" xmlns:o="urn:schemas-microsoft-com:office:office" xmlns:oel="http://schemas.microsoft.com/office/2019/extlst" xmlns:r="http://schemas.openxmlformats.org/officeDocument/2006/relationships" xmlns:m="http://schemas.openxmlformats.org/officeDocument/2006/math" xmlns:v="urn:schemas-microsoft-com:vml" xmlns:wp14="http://schemas.microsoft.com/office/word/2010/wordprocessingDrawing" xmlns:wp="http://schemas.openxmlformats.org/drawingml/2006/wordprocessingDrawing" xmlns:w10="urn:schemas-microsoft-com:office:word" xmlns:w="http://schemas.openxmlformats.org/wordprocessingml/2006/main" xmlns:w14="http://schemas.microsoft.com/office/word/2010/wordml" xmlns:w15="http://schemas.microsoft.com/office/word/2012/wordml" xmlns:w16cex="http://schemas.microsoft.com/office/word/2018/wordml/cex" xmlns:w16cid="http://schemas.microsoft.com/office/word/2016/wordml/cid" xmlns:w16="http://schemas.microsoft.com/office/word/2018/wordml" xmlns:w16du="http://schemas.microsoft.com/office/word/2023/wordml/word16du" xmlns:w16sdtdh="http://schemas.microsoft.com/office/word/2020/wordml/sdtdatahash" xmlns:w16sdtfl="http://schemas.microsoft.com/office/word/2024/wordml/sdtformatlock" xmlns:w16se="http://schemas.microsoft.com/office/word/2015/wordml/symex" xmlns:wpg="http://schemas.microsoft.com/office/word/2010/wordprocessingGroup" xmlns:wpi="http://schemas.microsoft.com/office/word/2010/wordprocessingInk" xmlns:wne="http://schemas.microsoft.com/office/word/2006/wordml" xmlns:wps="http://schemas.microsoft.com/office/word/2010/wordprocessingShape" mc:Ignorable="w14 w15 w16se w16cid w16 w16cex w16sdtdh w16sdtfl w16du wp14">
+<w:footnotes xmlns:wpc="http://schemas.microsoft.com/office/word/2010/wordprocessingCanvas" xmlns:cx="http://schemas.microsoft.com/office/drawing/2014/chartex" xmlns:mc="http://schemas.openxmlformats.org/markup-compatibility/2006" xmlns:o="urn:schemas-microsoft-com:office:office" xmlns:r="http://schemas.openxmlformats.org/officeDocument/2006/relationships" xmlns:m="http://schemas.openxmlformats.org/officeDocument/2006/math" xmlns:v="urn:schemas-microsoft-com:vml" xmlns:wp14="http://schemas.microsoft.com/office/word/2010/wordprocessingDrawing" xmlns:wp="http://schemas.openxmlformats.org/drawingml/2006/wordprocessingDrawing" xmlns:w10="urn:schemas-microsoft-com:office:word" xmlns:w="http://schemas.openxmlformats.org/wordprocessingml/2006/main" xmlns:w14="http://schemas.microsoft.com/office/word/2010/wordml" xmlns:w15="http://schemas.microsoft.com/office/word/2012/wordml" xmlns:w16se="http://schemas.microsoft.com/office/word/2015/wordml/symex" xmlns:wpg="http://schemas.microsoft.com/office/word/2010/wordprocessingGroup" xmlns:wpi="http://schemas.microsoft.com/office/word/2010/wordprocessingInk" xmlns:wne="http://schemas.microsoft.com/office/word/2006/wordml" xmlns:wps="http://schemas.microsoft.com/office/word/2010/wordprocessingShape" mc:Ignorable="w14 w15 w16se wp14">
   <w:footnote w:type="separator" w:id="-1">
     <w:p>
       <w:pPr>
@@ -9602,7 +11050,7 @@
 </file>
 
 <file path=word/header1.xml><?xml version="1.0" encoding="utf-8"?>
-<w:hdr xmlns:wpc="http://schemas.microsoft.com/office/word/2010/wordprocessingCanvas" xmlns:cx="http://schemas.microsoft.com/office/drawing/2014/chartex" xmlns:cx1="http://schemas.microsoft.com/office/drawing/2015/9/8/chartex" xmlns:cx2="http://schemas.microsoft.com/office/drawing/2015/10/21/chartex" xmlns:cx3="http://schemas.microsoft.com/office/drawing/2016/5/9/chartex" xmlns:cx4="http://schemas.microsoft.com/office/drawing/2016/5/10/chartex" xmlns:cx5="http://schemas.microsoft.com/office/drawing/2016/5/11/chartex" xmlns:cx6="http://schemas.microsoft.com/office/drawing/2016/5/12/chartex" xmlns:cx7="http://schemas.microsoft.com/office/drawing/2016/5/13/chartex" xmlns:cx8="http://schemas.microsoft.com/office/drawing/2016/5/14/chartex" xmlns:mc="http://schemas.openxmlformats.org/markup-compatibility/2006" xmlns:aink="http://schemas.microsoft.com/office/drawing/2016/ink" xmlns:am3d="http://schemas.microsoft.com/office/drawing/2017/model3d" xmlns:o="urn:schemas-microsoft-com:office:office" xmlns:oel="http://schemas.microsoft.com/office/2019/extlst" xmlns:r="http://schemas.openxmlformats.org/officeDocument/2006/relationships" xmlns:m="http://schemas.openxmlformats.org/officeDocument/2006/math" xmlns:v="urn:schemas-microsoft-com:vml" xmlns:wp14="http://schemas.microsoft.com/office/word/2010/wordprocessingDrawing" xmlns:wp="http://schemas.openxmlformats.org/drawingml/2006/wordprocessingDrawing" xmlns:w10="urn:schemas-microsoft-com:office:word" xmlns:w="http://schemas.openxmlformats.org/wordprocessingml/2006/main" xmlns:w14="http://schemas.microsoft.com/office/word/2010/wordml" xmlns:w15="http://schemas.microsoft.com/office/word/2012/wordml" xmlns:w16cex="http://schemas.microsoft.com/office/word/2018/wordml/cex" xmlns:w16cid="http://schemas.microsoft.com/office/word/2016/wordml/cid" xmlns:w16="http://schemas.microsoft.com/office/word/2018/wordml" xmlns:w16du="http://schemas.microsoft.com/office/word/2023/wordml/word16du" xmlns:w16sdtdh="http://schemas.microsoft.com/office/word/2020/wordml/sdtdatahash" xmlns:w16sdtfl="http://schemas.microsoft.com/office/word/2024/wordml/sdtformatlock" xmlns:w16se="http://schemas.microsoft.com/office/word/2015/wordml/symex" xmlns:wpg="http://schemas.microsoft.com/office/word/2010/wordprocessingGroup" xmlns:wpi="http://schemas.microsoft.com/office/word/2010/wordprocessingInk" xmlns:wne="http://schemas.microsoft.com/office/word/2006/wordml" xmlns:wps="http://schemas.microsoft.com/office/word/2010/wordprocessingShape" mc:Ignorable="w14 w15 w16se w16cid w16 w16cex w16sdtdh w16sdtfl w16du wp14">
+<w:hdr xmlns:wpc="http://schemas.microsoft.com/office/word/2010/wordprocessingCanvas" xmlns:cx="http://schemas.microsoft.com/office/drawing/2014/chartex" xmlns:mc="http://schemas.openxmlformats.org/markup-compatibility/2006" xmlns:o="urn:schemas-microsoft-com:office:office" xmlns:r="http://schemas.openxmlformats.org/officeDocument/2006/relationships" xmlns:m="http://schemas.openxmlformats.org/officeDocument/2006/math" xmlns:v="urn:schemas-microsoft-com:vml" xmlns:wp14="http://schemas.microsoft.com/office/word/2010/wordprocessingDrawing" xmlns:wp="http://schemas.openxmlformats.org/drawingml/2006/wordprocessingDrawing" xmlns:w10="urn:schemas-microsoft-com:office:word" xmlns:w="http://schemas.openxmlformats.org/wordprocessingml/2006/main" xmlns:w14="http://schemas.microsoft.com/office/word/2010/wordml" xmlns:w15="http://schemas.microsoft.com/office/word/2012/wordml" xmlns:w16se="http://schemas.microsoft.com/office/word/2015/wordml/symex" xmlns:wpg="http://schemas.microsoft.com/office/word/2010/wordprocessingGroup" xmlns:wpi="http://schemas.microsoft.com/office/word/2010/wordprocessingInk" xmlns:wne="http://schemas.microsoft.com/office/word/2006/wordml" xmlns:wps="http://schemas.microsoft.com/office/word/2010/wordprocessingShape" mc:Ignorable="w14 w15 w16se wp14">
   <w:sdt>
     <w:sdtPr>
       <w:id w:val="-2110197828"/>
@@ -9611,6 +11059,7 @@
         <w:docPartUnique/>
       </w:docPartObj>
     </w:sdtPr>
+    <w:sdtEndPr/>
     <w:sdtContent>
       <w:p>
         <w:pPr>
@@ -9630,7 +11079,7 @@
           <w:rPr>
             <w:noProof/>
           </w:rPr>
-          <w:t>19</w:t>
+          <w:t>21</w:t>
         </w:r>
         <w:r>
           <w:fldChar w:fldCharType="end"/>
@@ -9647,7 +11096,7 @@
 </file>
 
 <file path=word/numbering.xml><?xml version="1.0" encoding="utf-8"?>
-<w:numbering xmlns:wpc="http://schemas.microsoft.com/office/word/2010/wordprocessingCanvas" xmlns:cx="http://schemas.microsoft.com/office/drawing/2014/chartex" xmlns:cx1="http://schemas.microsoft.com/office/drawing/2015/9/8/chartex" xmlns:cx2="http://schemas.microsoft.com/office/drawing/2015/10/21/chartex" xmlns:cx3="http://schemas.microsoft.com/office/drawing/2016/5/9/chartex" xmlns:cx4="http://schemas.microsoft.com/office/drawing/2016/5/10/chartex" xmlns:cx5="http://schemas.microsoft.com/office/drawing/2016/5/11/chartex" xmlns:cx6="http://schemas.microsoft.com/office/drawing/2016/5/12/chartex" xmlns:cx7="http://schemas.microsoft.com/office/drawing/2016/5/13/chartex" xmlns:cx8="http://schemas.microsoft.com/office/drawing/2016/5/14/chartex" xmlns:mc="http://schemas.openxmlformats.org/markup-compatibility/2006" xmlns:aink="http://schemas.microsoft.com/office/drawing/2016/ink" xmlns:am3d="http://schemas.microsoft.com/office/drawing/2017/model3d" xmlns:o="urn:schemas-microsoft-com:office:office" xmlns:oel="http://schemas.microsoft.com/office/2019/extlst" xmlns:r="http://schemas.openxmlformats.org/officeDocument/2006/relationships" xmlns:m="http://schemas.openxmlformats.org/officeDocument/2006/math" xmlns:v="urn:schemas-microsoft-com:vml" xmlns:wp14="http://schemas.microsoft.com/office/word/2010/wordprocessingDrawing" xmlns:wp="http://schemas.openxmlformats.org/drawingml/2006/wordprocessingDrawing" xmlns:w10="urn:schemas-microsoft-com:office:word" xmlns:w="http://schemas.openxmlformats.org/wordprocessingml/2006/main" xmlns:w14="http://schemas.microsoft.com/office/word/2010/wordml" xmlns:w15="http://schemas.microsoft.com/office/word/2012/wordml" xmlns:w16cex="http://schemas.microsoft.com/office/word/2018/wordml/cex" xmlns:w16cid="http://schemas.microsoft.com/office/word/2016/wordml/cid" xmlns:w16="http://schemas.microsoft.com/office/word/2018/wordml" xmlns:w16du="http://schemas.microsoft.com/office/word/2023/wordml/word16du" xmlns:w16sdtdh="http://schemas.microsoft.com/office/word/2020/wordml/sdtdatahash" xmlns:w16sdtfl="http://schemas.microsoft.com/office/word/2024/wordml/sdtformatlock" xmlns:w16se="http://schemas.microsoft.com/office/word/2015/wordml/symex" xmlns:wpg="http://schemas.microsoft.com/office/word/2010/wordprocessingGroup" xmlns:wpi="http://schemas.microsoft.com/office/word/2010/wordprocessingInk" xmlns:wne="http://schemas.microsoft.com/office/word/2006/wordml" xmlns:wps="http://schemas.microsoft.com/office/word/2010/wordprocessingShape" mc:Ignorable="w14 w15 w16se w16cid w16 w16cex w16sdtdh w16sdtfl w16du wp14">
+<w:numbering xmlns:wpc="http://schemas.microsoft.com/office/word/2010/wordprocessingCanvas" xmlns:cx="http://schemas.microsoft.com/office/drawing/2014/chartex" xmlns:mc="http://schemas.openxmlformats.org/markup-compatibility/2006" xmlns:o="urn:schemas-microsoft-com:office:office" xmlns:r="http://schemas.openxmlformats.org/officeDocument/2006/relationships" xmlns:m="http://schemas.openxmlformats.org/officeDocument/2006/math" xmlns:v="urn:schemas-microsoft-com:vml" xmlns:wp14="http://schemas.microsoft.com/office/word/2010/wordprocessingDrawing" xmlns:wp="http://schemas.openxmlformats.org/drawingml/2006/wordprocessingDrawing" xmlns:w10="urn:schemas-microsoft-com:office:word" xmlns:w="http://schemas.openxmlformats.org/wordprocessingml/2006/main" xmlns:w14="http://schemas.microsoft.com/office/word/2010/wordml" xmlns:w15="http://schemas.microsoft.com/office/word/2012/wordml" xmlns:w16se="http://schemas.microsoft.com/office/word/2015/wordml/symex" xmlns:wpg="http://schemas.microsoft.com/office/word/2010/wordprocessingGroup" xmlns:wpi="http://schemas.microsoft.com/office/word/2010/wordprocessingInk" xmlns:wne="http://schemas.microsoft.com/office/word/2006/wordml" xmlns:wps="http://schemas.microsoft.com/office/word/2010/wordprocessingShape" mc:Ignorable="w14 w15 w16se wp14">
   <w:abstractNum w:abstractNumId="0" w15:restartNumberingAfterBreak="0">
     <w:nsid w:val="1D772148"/>
     <w:multiLevelType w:val="multilevel"/>
@@ -10231,29 +11680,29 @@
       </w:pPr>
     </w:lvl>
   </w:abstractNum>
-  <w:num w:numId="1" w16cid:durableId="672073363">
+  <w:num w:numId="1">
     <w:abstractNumId w:val="1"/>
   </w:num>
-  <w:num w:numId="2" w16cid:durableId="190412350">
+  <w:num w:numId="2">
     <w:abstractNumId w:val="5"/>
   </w:num>
-  <w:num w:numId="3" w16cid:durableId="129399481">
+  <w:num w:numId="3">
     <w:abstractNumId w:val="4"/>
   </w:num>
-  <w:num w:numId="4" w16cid:durableId="250239073">
+  <w:num w:numId="4">
     <w:abstractNumId w:val="2"/>
   </w:num>
-  <w:num w:numId="5" w16cid:durableId="1335457168">
+  <w:num w:numId="5">
     <w:abstractNumId w:val="3"/>
   </w:num>
-  <w:num w:numId="6" w16cid:durableId="1767187374">
+  <w:num w:numId="6">
     <w:abstractNumId w:val="0"/>
   </w:num>
 </w:numbering>
 </file>
 
 <file path=word/styles.xml><?xml version="1.0" encoding="utf-8"?>
-<w:styles xmlns:mc="http://schemas.openxmlformats.org/markup-compatibility/2006" xmlns:r="http://schemas.openxmlformats.org/officeDocument/2006/relationships" xmlns:w="http://schemas.openxmlformats.org/wordprocessingml/2006/main" xmlns:w14="http://schemas.microsoft.com/office/word/2010/wordml" xmlns:w15="http://schemas.microsoft.com/office/word/2012/wordml" xmlns:w16cex="http://schemas.microsoft.com/office/word/2018/wordml/cex" xmlns:w16cid="http://schemas.microsoft.com/office/word/2016/wordml/cid" xmlns:w16="http://schemas.microsoft.com/office/word/2018/wordml" xmlns:w16du="http://schemas.microsoft.com/office/word/2023/wordml/word16du" xmlns:w16sdtdh="http://schemas.microsoft.com/office/word/2020/wordml/sdtdatahash" xmlns:w16sdtfl="http://schemas.microsoft.com/office/word/2024/wordml/sdtformatlock" xmlns:w16se="http://schemas.microsoft.com/office/word/2015/wordml/symex" mc:Ignorable="w14 w15 w16se w16cid w16 w16cex w16sdtdh w16sdtfl w16du">
+<w:styles xmlns:mc="http://schemas.openxmlformats.org/markup-compatibility/2006" xmlns:r="http://schemas.openxmlformats.org/officeDocument/2006/relationships" xmlns:w="http://schemas.openxmlformats.org/wordprocessingml/2006/main" xmlns:w14="http://schemas.microsoft.com/office/word/2010/wordml" xmlns:w15="http://schemas.microsoft.com/office/word/2012/wordml" xmlns:w16se="http://schemas.microsoft.com/office/word/2015/wordml/symex" mc:Ignorable="w14 w15 w16se">
   <w:docDefaults>
     <w:rPrDefault>
       <w:rPr>
@@ -10269,7 +11718,7 @@
       </w:pPr>
     </w:pPrDefault>
   </w:docDefaults>
-  <w:latentStyles w:defLockedState="0" w:defUIPriority="99" w:defSemiHidden="0" w:defUnhideWhenUsed="0" w:defQFormat="0" w:count="376">
+  <w:latentStyles w:defLockedState="0" w:defUIPriority="99" w:defSemiHidden="0" w:defUnhideWhenUsed="0" w:defQFormat="0" w:count="371">
     <w:lsdException w:name="Normal" w:uiPriority="0"/>
     <w:lsdException w:name="heading 1" w:uiPriority="9" w:qFormat="1"/>
     <w:lsdException w:name="heading 2" w:semiHidden="1" w:uiPriority="9" w:unhideWhenUsed="1" w:qFormat="1"/>
@@ -10641,11 +12090,6 @@
     <w:lsdException w:name="List Table 5 Dark Accent 6" w:uiPriority="50"/>
     <w:lsdException w:name="List Table 6 Colorful Accent 6" w:uiPriority="51"/>
     <w:lsdException w:name="List Table 7 Colorful Accent 6" w:uiPriority="52"/>
-    <w:lsdException w:name="Mention" w:semiHidden="1" w:unhideWhenUsed="1"/>
-    <w:lsdException w:name="Smart Hyperlink" w:semiHidden="1" w:unhideWhenUsed="1"/>
-    <w:lsdException w:name="Hashtag" w:semiHidden="1" w:unhideWhenUsed="1"/>
-    <w:lsdException w:name="Unresolved Mention" w:semiHidden="1" w:unhideWhenUsed="1"/>
-    <w:lsdException w:name="Smart Link" w:semiHidden="1" w:unhideWhenUsed="1"/>
   </w:latentStyles>
   <w:style w:type="paragraph" w:default="1" w:styleId="Normal">
     <w:name w:val="Normal"/>
@@ -10902,7 +12346,7 @@
       <w:u w:val="single"/>
     </w:rPr>
   </w:style>
-  <w:style w:type="character" w:styleId="MenoPendente">
+  <w:style w:type="character" w:customStyle="1" w:styleId="UnresolvedMention">
     <w:name w:val="Unresolved Mention"/>
     <w:basedOn w:val="Fontepargpadro"/>
     <w:uiPriority w:val="99"/>

</xml_diff>

<commit_message>
Remoção do Sistema SaaS do projeto
</commit_message>
<xml_diff>
--- a/Documentação/Segunda Edição/TCC - Documentação.docx
+++ b/Documentação/Segunda Edição/TCC - Documentação.docx
@@ -3946,268 +3946,10 @@
           <w:szCs w:val="24"/>
         </w:rPr>
       </w:pPr>
-      <w:r>
-        <w:rPr>
-          <w:szCs w:val="24"/>
-        </w:rPr>
-        <w:t xml:space="preserve">O sistema adota um modelo de monetização baseado em assinatura mensal, conhecido como SaaS (Software as a Service), oferecendo três planos com diferentes </w:t>
-      </w:r>
-      <w:r>
-        <w:rPr>
-          <w:szCs w:val="24"/>
-        </w:rPr>
-        <w:lastRenderedPageBreak/>
-        <w:t xml:space="preserve">níveis de acesso e capacidade. O Plano 1, no valor de R$89,90 por mês, é voltado para pequenas empresas e permite o cadastro de até 50 funcionários e 1 administrador. O Plano 2, no valor de R$169,90 por mês, amplia os limites para até 200 funcionários e 3 administradores, incluindo funcionalidades avançadas como geração de relatórios em PDF e </w:t>
-      </w:r>
-      <w:proofErr w:type="spellStart"/>
-      <w:r>
-        <w:rPr>
-          <w:szCs w:val="24"/>
-        </w:rPr>
-        <w:t>dashboard</w:t>
-      </w:r>
-      <w:proofErr w:type="spellEnd"/>
-      <w:r>
-        <w:rPr>
-          <w:szCs w:val="24"/>
-        </w:rPr>
-        <w:t xml:space="preserve"> completo. O Plano 3, no valor de R$210,90 por mês, oferece acesso ilimitado a todas as funcionalidades do sistema, sem restrição de funcionários ou administradores. Essa estrutura de planos garante a sustentabilidade financeira do projeto após sua implantação, sem comprometer a acessibilidade para empresas de menor porte.</w:t>
-      </w:r>
-    </w:p>
-    <w:p>
-      <w:pPr>
-        <w:spacing w:line="360" w:lineRule="auto"/>
-        <w:ind w:firstLine="720"/>
-        <w:jc w:val="both"/>
-        <w:rPr>
-          <w:szCs w:val="24"/>
-        </w:rPr>
-      </w:pPr>
-    </w:p>
-    <w:p>
-      <w:pPr>
-        <w:spacing w:line="360" w:lineRule="auto"/>
-        <w:ind w:firstLine="720"/>
-        <w:jc w:val="both"/>
-        <w:rPr>
-          <w:szCs w:val="24"/>
-        </w:rPr>
-      </w:pPr>
-    </w:p>
-    <w:p>
-      <w:pPr>
-        <w:spacing w:line="360" w:lineRule="auto"/>
-        <w:ind w:firstLine="720"/>
-        <w:jc w:val="both"/>
-        <w:rPr>
-          <w:szCs w:val="24"/>
-        </w:rPr>
-      </w:pPr>
-    </w:p>
-    <w:p>
-      <w:pPr>
-        <w:spacing w:line="360" w:lineRule="auto"/>
-        <w:ind w:firstLine="720"/>
-        <w:jc w:val="both"/>
-        <w:rPr>
-          <w:szCs w:val="24"/>
-        </w:rPr>
-      </w:pPr>
-    </w:p>
-    <w:p>
-      <w:pPr>
-        <w:spacing w:line="360" w:lineRule="auto"/>
-        <w:ind w:firstLine="720"/>
-        <w:jc w:val="both"/>
-        <w:rPr>
-          <w:szCs w:val="24"/>
-        </w:rPr>
-      </w:pPr>
-    </w:p>
-    <w:p>
-      <w:pPr>
-        <w:spacing w:line="360" w:lineRule="auto"/>
-        <w:ind w:firstLine="720"/>
-        <w:jc w:val="both"/>
-        <w:rPr>
-          <w:szCs w:val="24"/>
-        </w:rPr>
-      </w:pPr>
-    </w:p>
-    <w:p>
-      <w:pPr>
-        <w:spacing w:line="360" w:lineRule="auto"/>
-        <w:ind w:firstLine="720"/>
-        <w:jc w:val="both"/>
-        <w:rPr>
-          <w:szCs w:val="24"/>
-        </w:rPr>
-      </w:pPr>
-    </w:p>
-    <w:p>
-      <w:pPr>
-        <w:spacing w:line="360" w:lineRule="auto"/>
-        <w:ind w:firstLine="720"/>
-        <w:jc w:val="both"/>
-        <w:rPr>
-          <w:szCs w:val="24"/>
-        </w:rPr>
-      </w:pPr>
-    </w:p>
-    <w:p>
-      <w:pPr>
-        <w:spacing w:line="360" w:lineRule="auto"/>
-        <w:ind w:firstLine="720"/>
-        <w:jc w:val="both"/>
-        <w:rPr>
-          <w:szCs w:val="24"/>
-        </w:rPr>
-      </w:pPr>
-    </w:p>
-    <w:p>
-      <w:pPr>
-        <w:spacing w:line="360" w:lineRule="auto"/>
-        <w:ind w:firstLine="720"/>
-        <w:jc w:val="both"/>
-        <w:rPr>
-          <w:szCs w:val="24"/>
-        </w:rPr>
-      </w:pPr>
-    </w:p>
-    <w:p>
-      <w:pPr>
-        <w:spacing w:line="360" w:lineRule="auto"/>
-        <w:ind w:firstLine="720"/>
-        <w:jc w:val="both"/>
-        <w:rPr>
-          <w:szCs w:val="24"/>
-        </w:rPr>
-      </w:pPr>
-    </w:p>
-    <w:p>
-      <w:pPr>
-        <w:spacing w:line="360" w:lineRule="auto"/>
-        <w:ind w:firstLine="720"/>
-        <w:jc w:val="both"/>
-        <w:rPr>
-          <w:szCs w:val="24"/>
-        </w:rPr>
-      </w:pPr>
-    </w:p>
-    <w:p>
-      <w:pPr>
-        <w:spacing w:line="360" w:lineRule="auto"/>
-        <w:ind w:firstLine="720"/>
-        <w:jc w:val="both"/>
-        <w:rPr>
-          <w:szCs w:val="24"/>
-        </w:rPr>
-      </w:pPr>
-    </w:p>
-    <w:p>
-      <w:pPr>
-        <w:spacing w:line="360" w:lineRule="auto"/>
-        <w:ind w:firstLine="720"/>
-        <w:jc w:val="both"/>
-        <w:rPr>
-          <w:szCs w:val="24"/>
-        </w:rPr>
-      </w:pPr>
-    </w:p>
-    <w:p>
-      <w:pPr>
-        <w:spacing w:line="360" w:lineRule="auto"/>
-        <w:ind w:firstLine="720"/>
-        <w:jc w:val="both"/>
-        <w:rPr>
-          <w:szCs w:val="24"/>
-        </w:rPr>
-      </w:pPr>
-    </w:p>
-    <w:p>
-      <w:pPr>
-        <w:spacing w:line="360" w:lineRule="auto"/>
-        <w:ind w:firstLine="720"/>
-        <w:jc w:val="both"/>
-        <w:rPr>
-          <w:szCs w:val="24"/>
-        </w:rPr>
-      </w:pPr>
-    </w:p>
-    <w:p>
-      <w:pPr>
-        <w:spacing w:line="360" w:lineRule="auto"/>
-        <w:ind w:firstLine="720"/>
-        <w:jc w:val="both"/>
-        <w:rPr>
-          <w:szCs w:val="24"/>
-        </w:rPr>
-      </w:pPr>
-    </w:p>
-    <w:p>
-      <w:pPr>
-        <w:spacing w:line="360" w:lineRule="auto"/>
-        <w:ind w:firstLine="720"/>
-        <w:jc w:val="both"/>
-        <w:rPr>
-          <w:szCs w:val="24"/>
-        </w:rPr>
-      </w:pPr>
-    </w:p>
-    <w:p>
-      <w:pPr>
-        <w:spacing w:line="360" w:lineRule="auto"/>
-        <w:ind w:firstLine="720"/>
-        <w:jc w:val="both"/>
-        <w:rPr>
-          <w:szCs w:val="24"/>
-        </w:rPr>
-      </w:pPr>
-    </w:p>
-    <w:p>
-      <w:pPr>
-        <w:spacing w:line="360" w:lineRule="auto"/>
-        <w:ind w:firstLine="720"/>
-        <w:jc w:val="both"/>
-        <w:rPr>
-          <w:szCs w:val="24"/>
-        </w:rPr>
-      </w:pPr>
-    </w:p>
-    <w:p>
-      <w:pPr>
-        <w:spacing w:line="360" w:lineRule="auto"/>
-        <w:ind w:firstLine="720"/>
-        <w:jc w:val="both"/>
-        <w:rPr>
-          <w:szCs w:val="24"/>
-        </w:rPr>
-      </w:pPr>
-    </w:p>
-    <w:p>
-      <w:pPr>
-        <w:spacing w:line="360" w:lineRule="auto"/>
-        <w:ind w:firstLine="720"/>
-        <w:jc w:val="both"/>
-        <w:rPr>
-          <w:szCs w:val="24"/>
-        </w:rPr>
-      </w:pPr>
-    </w:p>
-    <w:p>
-      <w:pPr>
-        <w:spacing w:line="360" w:lineRule="auto"/>
-        <w:ind w:firstLine="720"/>
-        <w:jc w:val="both"/>
-        <w:rPr>
-          <w:szCs w:val="24"/>
-        </w:rPr>
-      </w:pPr>
-    </w:p>
-    <w:p>
-      <w:pPr>
-        <w:spacing w:line="360" w:lineRule="auto"/>
-        <w:ind w:firstLine="720"/>
+    </w:p>
+    <w:p>
+      <w:pPr>
+        <w:spacing w:line="360" w:lineRule="auto"/>
         <w:jc w:val="both"/>
         <w:rPr>
           <w:szCs w:val="24"/>
@@ -9561,20 +9303,32 @@
         </w:rPr>
         <w:t xml:space="preserve"> e os ajustes de layout necessários para garantir </w:t>
       </w:r>
-      <w:proofErr w:type="spellStart"/>
-      <w:r>
-        <w:rPr>
-          <w:szCs w:val="24"/>
-        </w:rPr>
-        <w:t>boa</w:t>
-      </w:r>
-      <w:proofErr w:type="spellEnd"/>
-      <w:r>
-        <w:rPr>
-          <w:szCs w:val="24"/>
-        </w:rPr>
-        <w:t xml:space="preserve"> usabilidade em telas menores.</w:t>
-      </w:r>
+      <w:r>
+        <w:rPr>
+          <w:szCs w:val="24"/>
+        </w:rPr>
+        <w:t>boas</w:t>
+      </w:r>
+      <w:r>
+        <w:rPr>
+          <w:szCs w:val="24"/>
+        </w:rPr>
+        <w:t xml:space="preserve"> usabilidade</w:t>
+      </w:r>
+      <w:r>
+        <w:rPr>
+          <w:szCs w:val="24"/>
+        </w:rPr>
+        <w:t>s</w:t>
+      </w:r>
+      <w:r>
+        <w:rPr>
+          <w:szCs w:val="24"/>
+        </w:rPr>
+        <w:t xml:space="preserve"> em telas menores.</w:t>
+      </w:r>
+      <w:bookmarkStart w:id="0" w:name="_GoBack"/>
+      <w:bookmarkEnd w:id="0"/>
     </w:p>
     <w:p>
       <w:pPr>
@@ -10782,8 +10536,6 @@
           <w:szCs w:val="24"/>
         </w:rPr>
       </w:pPr>
-      <w:bookmarkStart w:id="0" w:name="_GoBack"/>
-      <w:bookmarkEnd w:id="0"/>
     </w:p>
     <w:p>
       <w:pPr>
@@ -11079,7 +10831,7 @@
           <w:rPr>
             <w:noProof/>
           </w:rPr>
-          <w:t>21</w:t>
+          <w:t>19</w:t>
         </w:r>
         <w:r>
           <w:fldChar w:fldCharType="end"/>

</xml_diff>

<commit_message>
Ajustes na remoção de planos
</commit_message>
<xml_diff>
--- a/Documentação/Segunda Edição/TCC - Documentação.docx
+++ b/Documentação/Segunda Edição/TCC - Documentação.docx
@@ -614,35 +614,7 @@
         <w:rPr>
           <w:szCs w:val="24"/>
         </w:rPr>
-        <w:t xml:space="preserve"> Escola Técnica Estadual </w:t>
-      </w:r>
-      <w:proofErr w:type="spellStart"/>
-      <w:r>
-        <w:rPr>
-          <w:szCs w:val="24"/>
-        </w:rPr>
-        <w:t>Ilza</w:t>
-      </w:r>
-      <w:proofErr w:type="spellEnd"/>
-      <w:r>
-        <w:rPr>
-          <w:szCs w:val="24"/>
-        </w:rPr>
-        <w:t xml:space="preserve"> Nascimento </w:t>
-      </w:r>
-      <w:proofErr w:type="spellStart"/>
-      <w:r>
-        <w:rPr>
-          <w:szCs w:val="24"/>
-        </w:rPr>
-        <w:t>Pintus</w:t>
-      </w:r>
-      <w:proofErr w:type="spellEnd"/>
-      <w:r>
-        <w:rPr>
-          <w:szCs w:val="24"/>
-        </w:rPr>
-        <w:t xml:space="preserve"> como requisito para conclusão do curso de Desenvolvimento de Sistemas</w:t>
+        <w:t xml:space="preserve"> Escola Técnica Estadual Ilza Nascimento Pintus como requisito para conclusão do curso de Desenvolvimento de Sistemas</w:t>
       </w:r>
     </w:p>
     <w:p>
@@ -666,21 +638,7 @@
         <w:rPr>
           <w:szCs w:val="24"/>
         </w:rPr>
-        <w:t xml:space="preserve">Orientador: Prof. Cláudio Lopes </w:t>
-      </w:r>
-      <w:proofErr w:type="spellStart"/>
-      <w:r>
-        <w:rPr>
-          <w:szCs w:val="24"/>
-        </w:rPr>
-        <w:t>Ferrini</w:t>
-      </w:r>
-      <w:proofErr w:type="spellEnd"/>
-      <w:r>
-        <w:rPr>
-          <w:szCs w:val="24"/>
-        </w:rPr>
-        <w:t xml:space="preserve"> Garcia</w:t>
+        <w:t>Orientador: Prof. Cláudio Lopes Ferrini Garcia</w:t>
       </w:r>
     </w:p>
     <w:p>
@@ -921,49 +879,7 @@
         <w:rPr>
           <w:szCs w:val="24"/>
         </w:rPr>
-        <w:t xml:space="preserve">o exploratório, o descritivo e o aplicado, combinando pesquisas bibliográficas com o desenvolvimento incremental do sistema. O projeto adota tecnologias como Node.js com Express.js no </w:t>
-      </w:r>
-      <w:proofErr w:type="spellStart"/>
-      <w:r>
-        <w:rPr>
-          <w:szCs w:val="24"/>
-        </w:rPr>
-        <w:t>back-end</w:t>
-      </w:r>
-      <w:proofErr w:type="spellEnd"/>
-      <w:r>
-        <w:rPr>
-          <w:szCs w:val="24"/>
-        </w:rPr>
-        <w:t xml:space="preserve">, HTML, CSS e </w:t>
-      </w:r>
-      <w:proofErr w:type="spellStart"/>
-      <w:r>
-        <w:rPr>
-          <w:szCs w:val="24"/>
-        </w:rPr>
-        <w:t>JavaScript</w:t>
-      </w:r>
-      <w:proofErr w:type="spellEnd"/>
-      <w:r>
-        <w:rPr>
-          <w:szCs w:val="24"/>
-        </w:rPr>
-        <w:t xml:space="preserve"> no front-</w:t>
-      </w:r>
-      <w:proofErr w:type="spellStart"/>
-      <w:r>
-        <w:rPr>
-          <w:szCs w:val="24"/>
-        </w:rPr>
-        <w:t>end</w:t>
-      </w:r>
-      <w:proofErr w:type="spellEnd"/>
-      <w:r>
-        <w:rPr>
-          <w:szCs w:val="24"/>
-        </w:rPr>
-        <w:t xml:space="preserve">, e MySQL como banco de dados. </w:t>
+        <w:t xml:space="preserve">o exploratório, o descritivo e o aplicado, combinando pesquisas bibliográficas com o desenvolvimento incremental do sistema. O projeto adota tecnologias como Node.js com Express.js no back-end, HTML, CSS e JavaScript no front-end, e MySQL como banco de dados. </w:t>
       </w:r>
       <w:r>
         <w:rPr>
@@ -2227,35 +2143,7 @@
         <w:rPr>
           <w:szCs w:val="24"/>
         </w:rPr>
-        <w:t xml:space="preserve">O sistema foi idealizado para substituir os processos manuais por uma solução digital acessível, segura e de fácil utilização. Além da versão web, está prevista a adaptação da aplicação para dispositivos móveis por meio do conceito de </w:t>
-      </w:r>
-      <w:proofErr w:type="spellStart"/>
-      <w:r>
-        <w:rPr>
-          <w:szCs w:val="24"/>
-        </w:rPr>
-        <w:t>Progressive</w:t>
-      </w:r>
-      <w:proofErr w:type="spellEnd"/>
-      <w:r>
-        <w:rPr>
-          <w:szCs w:val="24"/>
-        </w:rPr>
-        <w:t xml:space="preserve"> Web </w:t>
-      </w:r>
-      <w:proofErr w:type="spellStart"/>
-      <w:r>
-        <w:rPr>
-          <w:szCs w:val="24"/>
-        </w:rPr>
-        <w:t>App</w:t>
-      </w:r>
-      <w:proofErr w:type="spellEnd"/>
-      <w:r>
-        <w:rPr>
-          <w:szCs w:val="24"/>
-        </w:rPr>
-        <w:t xml:space="preserve"> (PWA), tornando o sistema ainda mais acessível para equipes que atuam em campo.</w:t>
+        <w:t>O sistema foi idealizado para substituir os processos manuais por uma solução digital acessível, segura e de fácil utilização. Além da versão web, está prevista a adaptação da aplicação para dispositivos móveis por meio do conceito de Progressive Web App (PWA), tornando o sistema ainda mais acessível para equipes que atuam em campo.</w:t>
       </w:r>
     </w:p>
     <w:p>
@@ -2385,35 +2273,7 @@
         <w:rPr>
           <w:szCs w:val="24"/>
         </w:rPr>
-        <w:t xml:space="preserve">Davi </w:t>
-      </w:r>
-      <w:proofErr w:type="spellStart"/>
-      <w:r>
-        <w:rPr>
-          <w:szCs w:val="24"/>
-        </w:rPr>
-        <w:t>Delmondes</w:t>
-      </w:r>
-      <w:proofErr w:type="spellEnd"/>
-      <w:r>
-        <w:rPr>
-          <w:szCs w:val="24"/>
-        </w:rPr>
-        <w:t xml:space="preserve"> Machado - </w:t>
-      </w:r>
-      <w:proofErr w:type="spellStart"/>
-      <w:r>
-        <w:rPr>
-          <w:szCs w:val="24"/>
-        </w:rPr>
-        <w:t>Scrum</w:t>
-      </w:r>
-      <w:proofErr w:type="spellEnd"/>
-      <w:r>
-        <w:rPr>
-          <w:szCs w:val="24"/>
-        </w:rPr>
-        <w:t xml:space="preserve"> Master</w:t>
+        <w:t>Davi Delmondes Machado - Scrum Master</w:t>
       </w:r>
     </w:p>
     <w:p>
@@ -2453,16 +2313,8 @@
         <w:rPr>
           <w:szCs w:val="24"/>
         </w:rPr>
-        <w:t xml:space="preserve">Igor de Oliveira Bernardo - </w:t>
-      </w:r>
-      <w:proofErr w:type="spellStart"/>
-      <w:r>
-        <w:rPr>
-          <w:szCs w:val="24"/>
-        </w:rPr>
-        <w:t>Developer</w:t>
-      </w:r>
-      <w:proofErr w:type="spellEnd"/>
+        <w:t>Igor de Oliveira Bernardo - Developer</w:t>
+      </w:r>
     </w:p>
     <w:p>
       <w:pPr>
@@ -2513,30 +2365,14 @@
         <w:rPr>
           <w:szCs w:val="24"/>
         </w:rPr>
-        <w:t xml:space="preserve">- </w:t>
-      </w:r>
-      <w:proofErr w:type="spellStart"/>
-      <w:r>
-        <w:rPr>
-          <w:szCs w:val="24"/>
-        </w:rPr>
-        <w:t>Product</w:t>
-      </w:r>
-      <w:proofErr w:type="spellEnd"/>
-      <w:r>
-        <w:rPr>
-          <w:szCs w:val="24"/>
-        </w:rPr>
-        <w:t xml:space="preserve"> </w:t>
-      </w:r>
-      <w:proofErr w:type="spellStart"/>
-      <w:r>
-        <w:rPr>
-          <w:szCs w:val="24"/>
-        </w:rPr>
-        <w:t>Owner</w:t>
-      </w:r>
-      <w:proofErr w:type="spellEnd"/>
+        <w:t>- Product</w:t>
+      </w:r>
+      <w:r>
+        <w:rPr>
+          <w:szCs w:val="24"/>
+        </w:rPr>
+        <w:t xml:space="preserve"> Owner</w:t>
+      </w:r>
     </w:p>
     <w:p>
       <w:pPr>
@@ -2551,54 +2387,32 @@
         <w:rPr>
           <w:szCs w:val="24"/>
         </w:rPr>
-        <w:t>Responsável pela criação do protótipo, participação ativa no desenvolvimento front-</w:t>
-      </w:r>
-      <w:proofErr w:type="spellStart"/>
-      <w:r>
-        <w:rPr>
-          <w:szCs w:val="24"/>
-        </w:rPr>
-        <w:t>end</w:t>
-      </w:r>
-      <w:proofErr w:type="spellEnd"/>
-      <w:r>
-        <w:rPr>
-          <w:szCs w:val="24"/>
-        </w:rPr>
-        <w:t xml:space="preserve"> da aplicação web e mobile, além de realizar pesquisas sobre tecnologias atuais e seguras, contribuindo também na implementação de mecanismos de segurança da aplicação.</w:t>
-      </w:r>
-    </w:p>
-    <w:p>
-      <w:pPr>
-        <w:spacing w:line="360" w:lineRule="auto"/>
-        <w:jc w:val="both"/>
-        <w:rPr>
-          <w:szCs w:val="24"/>
-        </w:rPr>
-      </w:pPr>
-    </w:p>
-    <w:p>
-      <w:pPr>
-        <w:spacing w:line="360" w:lineRule="auto"/>
-        <w:jc w:val="both"/>
-        <w:rPr>
-          <w:szCs w:val="24"/>
-        </w:rPr>
-      </w:pPr>
-      <w:r>
-        <w:rPr>
-          <w:szCs w:val="24"/>
-        </w:rPr>
-        <w:t xml:space="preserve">Joaquim Pereira Lima - </w:t>
-      </w:r>
-      <w:proofErr w:type="spellStart"/>
-      <w:r>
-        <w:rPr>
-          <w:szCs w:val="24"/>
-        </w:rPr>
-        <w:t>Developer</w:t>
-      </w:r>
-      <w:proofErr w:type="spellEnd"/>
+        <w:t>Responsável pela criação do protótipo, participação ativa no desenvolvimento front-end da aplicação web e mobile, além de realizar pesquisas sobre tecnologias atuais e seguras, contribuindo também na implementação de mecanismos de segurança da aplicação.</w:t>
+      </w:r>
+    </w:p>
+    <w:p>
+      <w:pPr>
+        <w:spacing w:line="360" w:lineRule="auto"/>
+        <w:jc w:val="both"/>
+        <w:rPr>
+          <w:szCs w:val="24"/>
+        </w:rPr>
+      </w:pPr>
+    </w:p>
+    <w:p>
+      <w:pPr>
+        <w:spacing w:line="360" w:lineRule="auto"/>
+        <w:jc w:val="both"/>
+        <w:rPr>
+          <w:szCs w:val="24"/>
+        </w:rPr>
+      </w:pPr>
+      <w:r>
+        <w:rPr>
+          <w:szCs w:val="24"/>
+        </w:rPr>
+        <w:t>Joaquim Pereira Lima - Developer</w:t>
+      </w:r>
     </w:p>
     <w:p>
       <w:pPr>
@@ -2613,21 +2427,7 @@
         <w:rPr>
           <w:szCs w:val="24"/>
         </w:rPr>
-        <w:t xml:space="preserve">Responsável pelo suporte na prototipagem do sistema, participação ativa no desenvolvimento </w:t>
-      </w:r>
-      <w:proofErr w:type="spellStart"/>
-      <w:r>
-        <w:rPr>
-          <w:szCs w:val="24"/>
-        </w:rPr>
-        <w:t>back-end</w:t>
-      </w:r>
-      <w:proofErr w:type="spellEnd"/>
-      <w:r>
-        <w:rPr>
-          <w:szCs w:val="24"/>
-        </w:rPr>
-        <w:t xml:space="preserve"> da aplicação web e mobile, implementação de recursos de segurança da aplicação, além da elaboração dos slides para a apresentação do TCC.</w:t>
+        <w:t>Responsável pelo suporte na prototipagem do sistema, participação ativa no desenvolvimento back-end da aplicação web e mobile, implementação de recursos de segurança da aplicação, além da elaboração dos slides para a apresentação do TCC.</w:t>
       </w:r>
     </w:p>
     <w:p>
@@ -3099,21 +2899,7 @@
         <w:rPr>
           <w:szCs w:val="24"/>
         </w:rPr>
-        <w:t>Desenvolver um painel administrativo (</w:t>
-      </w:r>
-      <w:proofErr w:type="spellStart"/>
-      <w:r>
-        <w:rPr>
-          <w:szCs w:val="24"/>
-        </w:rPr>
-        <w:t>dashboard</w:t>
-      </w:r>
-      <w:proofErr w:type="spellEnd"/>
-      <w:r>
-        <w:rPr>
-          <w:szCs w:val="24"/>
-        </w:rPr>
-        <w:t>) que apresente informações relevantes, como EPIs mais utilizados, EPIs com necessidade de reposição e status de validade dos equipamentos.</w:t>
+        <w:t>Desenvolver um painel administrativo (dashboard) que apresente informações relevantes, como EPIs mais utilizados, EPIs com necessidade de reposição e status de validade dos equipamentos.</w:t>
       </w:r>
     </w:p>
     <w:p>
@@ -3194,35 +2980,7 @@
         <w:rPr>
           <w:szCs w:val="24"/>
         </w:rPr>
-        <w:t xml:space="preserve">Desenvolver o sistema de forma responsiva, permitindo sua utilização em dispositivos móveis por meio de </w:t>
-      </w:r>
-      <w:proofErr w:type="spellStart"/>
-      <w:r>
-        <w:rPr>
-          <w:szCs w:val="24"/>
-        </w:rPr>
-        <w:t>Progressive</w:t>
-      </w:r>
-      <w:proofErr w:type="spellEnd"/>
-      <w:r>
-        <w:rPr>
-          <w:szCs w:val="24"/>
-        </w:rPr>
-        <w:t xml:space="preserve"> Web </w:t>
-      </w:r>
-      <w:proofErr w:type="spellStart"/>
-      <w:r>
-        <w:rPr>
-          <w:szCs w:val="24"/>
-        </w:rPr>
-        <w:t>App</w:t>
-      </w:r>
-      <w:proofErr w:type="spellEnd"/>
-      <w:r>
-        <w:rPr>
-          <w:szCs w:val="24"/>
-        </w:rPr>
-        <w:t xml:space="preserve"> (PWA).</w:t>
+        <w:t>Desenvolver o sistema de forma responsiva, permitindo sua utilização em dispositivos móveis por meio de Progressive Web App (PWA).</w:t>
       </w:r>
     </w:p>
     <w:p>
@@ -3347,21 +3105,7 @@
         <w:rPr>
           <w:szCs w:val="24"/>
         </w:rPr>
-        <w:t xml:space="preserve">O projeto SIGEPI será desenvolvido com base em metodologias ágeis, com foco na estrutura do </w:t>
-      </w:r>
-      <w:proofErr w:type="spellStart"/>
-      <w:r>
-        <w:rPr>
-          <w:szCs w:val="24"/>
-        </w:rPr>
-        <w:t>Scrum</w:t>
-      </w:r>
-      <w:proofErr w:type="spellEnd"/>
-      <w:r>
-        <w:rPr>
-          <w:szCs w:val="24"/>
-        </w:rPr>
-        <w:t>. Essa escolha se justifica pela necessidade de organizar as atividades entre quatro integrantes com funções distintas e de acompanhar o progresso do desenvolvimento de forma transparente, com entregas incrementais e revisões contínuas.</w:t>
+        <w:t>O projeto SIGEPI será desenvolvido com base em metodologias ágeis, com foco na estrutura do Scrum. Essa escolha se justifica pela necessidade de organizar as atividades entre quatro integrantes com funções distintas e de acompanhar o progresso do desenvolvimento de forma transparente, com entregas incrementais e revisões contínuas.</w:t>
       </w:r>
     </w:p>
     <w:p>
@@ -3377,49 +3121,7 @@
         <w:rPr>
           <w:szCs w:val="24"/>
         </w:rPr>
-        <w:t xml:space="preserve">No </w:t>
-      </w:r>
-      <w:proofErr w:type="spellStart"/>
-      <w:r>
-        <w:rPr>
-          <w:szCs w:val="24"/>
-        </w:rPr>
-        <w:t>Scrum</w:t>
-      </w:r>
-      <w:proofErr w:type="spellEnd"/>
-      <w:r>
-        <w:rPr>
-          <w:szCs w:val="24"/>
-        </w:rPr>
-        <w:t xml:space="preserve">, as atividades são divididas em </w:t>
-      </w:r>
-      <w:proofErr w:type="spellStart"/>
-      <w:r>
-        <w:rPr>
-          <w:szCs w:val="24"/>
-        </w:rPr>
-        <w:t>sprints</w:t>
-      </w:r>
-      <w:proofErr w:type="spellEnd"/>
-      <w:r>
-        <w:rPr>
-          <w:szCs w:val="24"/>
-        </w:rPr>
-        <w:t xml:space="preserve">, que são ciclos curtos de desenvolvimento com objetivos definidos. Ao final de cada </w:t>
-      </w:r>
-      <w:proofErr w:type="spellStart"/>
-      <w:r>
-        <w:rPr>
-          <w:szCs w:val="24"/>
-        </w:rPr>
-        <w:t>sprint</w:t>
-      </w:r>
-      <w:proofErr w:type="spellEnd"/>
-      <w:r>
-        <w:rPr>
-          <w:szCs w:val="24"/>
-        </w:rPr>
-        <w:t>, a equipe revisa o que foi produzido, identifica melhorias e define as tarefas do ciclo seguinte. Essa dinâmica foi adotada para garantir que o sistema seja construído de forma organizada, reduzindo o risco de retrabalho e mantendo o alinhamento entre os membros da equipe.</w:t>
+        <w:t>No Scrum, as atividades são divididas em sprints, que são ciclos curtos de desenvolvimento com objetivos definidos. Ao final de cada sprint, a equipe revisa o que foi produzido, identifica melhorias e define as tarefas do ciclo seguinte. Essa dinâmica foi adotada para garantir que o sistema seja construído de forma organizada, reduzindo o risco de retrabalho e mantendo o alinhamento entre os membros da equipe.</w:t>
       </w:r>
     </w:p>
     <w:p>
@@ -3435,35 +3137,13 @@
         <w:rPr>
           <w:szCs w:val="24"/>
         </w:rPr>
-        <w:t xml:space="preserve">Antes do início do desenvolvimento, foi realizada a etapa de prototipação das telas do </w:t>
-      </w:r>
-      <w:proofErr w:type="spellStart"/>
-      <w:r>
-        <w:rPr>
-          <w:szCs w:val="24"/>
-        </w:rPr>
-        <w:t>Figma</w:t>
-      </w:r>
-      <w:proofErr w:type="spellEnd"/>
-      <w:r>
-        <w:rPr>
-          <w:szCs w:val="24"/>
-        </w:rPr>
-        <w:t>. Essa ferramenta permitiu visualizar a estrutura da interface e validar o fluxo de navegação do sistema antes de qualquer visual durante o desenvolvimento front-</w:t>
-      </w:r>
-      <w:proofErr w:type="spellStart"/>
-      <w:r>
-        <w:rPr>
-          <w:szCs w:val="24"/>
-        </w:rPr>
-        <w:t>end</w:t>
-      </w:r>
-      <w:proofErr w:type="spellEnd"/>
-      <w:r>
-        <w:rPr>
-          <w:szCs w:val="24"/>
-        </w:rPr>
-        <w:t>, facilitando a implementação ao design planejado.</w:t>
+        <w:t>Antes do início do desenvolvimento, foi realizada a etapa de prototipação das telas do Figma</w:t>
+      </w:r>
+      <w:r>
+        <w:rPr>
+          <w:szCs w:val="24"/>
+        </w:rPr>
+        <w:t>. Essa ferramenta permitiu visualizar a estrutura da interface e validar o fluxo de navegação do sistema antes de qualquer visual durante o desenvolvimento front-end, facilitando a implementação ao design planejado.</w:t>
       </w:r>
     </w:p>
     <w:p>
@@ -3479,21 +3159,7 @@
         <w:rPr>
           <w:szCs w:val="24"/>
         </w:rPr>
-        <w:t xml:space="preserve">O desenvolvimento será realizado de forma incremental, começando pelas funcionalidades mais essenciais do sistema, como o </w:t>
-      </w:r>
-      <w:proofErr w:type="spellStart"/>
-      <w:r>
-        <w:rPr>
-          <w:szCs w:val="24"/>
-        </w:rPr>
-        <w:t>login</w:t>
-      </w:r>
-      <w:proofErr w:type="spellEnd"/>
-      <w:r>
-        <w:rPr>
-          <w:szCs w:val="24"/>
-        </w:rPr>
-        <w:t xml:space="preserve">, o cadastro de funcionários e EPIs e o controle de estoque. À medida que essas funcionalidades forem concluídas e testadas, novas </w:t>
+        <w:t xml:space="preserve">O desenvolvimento será realizado de forma incremental, começando pelas funcionalidades mais essenciais do sistema, como o login, o cadastro de funcionários e EPIs e o controle de estoque. À medida que essas funcionalidades forem concluídas e testadas, novas </w:t>
       </w:r>
       <w:r>
         <w:rPr>
@@ -3505,21 +3171,7 @@
         <w:rPr>
           <w:szCs w:val="24"/>
         </w:rPr>
-        <w:t xml:space="preserve"> serão implementadas, como o painel de </w:t>
-      </w:r>
-      <w:proofErr w:type="spellStart"/>
-      <w:r>
-        <w:rPr>
-          <w:szCs w:val="24"/>
-        </w:rPr>
-        <w:t>dashboard</w:t>
-      </w:r>
-      <w:proofErr w:type="spellEnd"/>
-      <w:r>
-        <w:rPr>
-          <w:szCs w:val="24"/>
-        </w:rPr>
-        <w:t>, geração de relatórios e os alertas de validade.</w:t>
+        <w:t xml:space="preserve"> serão implementadas, como o painel de dashboard, geração de relatórios e os alertas de validade.</w:t>
       </w:r>
     </w:p>
     <w:p>
@@ -3660,35 +3312,7 @@
         <w:rPr>
           <w:szCs w:val="24"/>
         </w:rPr>
-        <w:t>. No front-</w:t>
-      </w:r>
-      <w:proofErr w:type="spellStart"/>
-      <w:r>
-        <w:rPr>
-          <w:szCs w:val="24"/>
-        </w:rPr>
-        <w:t>end</w:t>
-      </w:r>
-      <w:proofErr w:type="spellEnd"/>
-      <w:r>
-        <w:rPr>
-          <w:szCs w:val="24"/>
-        </w:rPr>
-        <w:t xml:space="preserve">, serão utilizados HTML, CSS e </w:t>
-      </w:r>
-      <w:proofErr w:type="spellStart"/>
-      <w:r>
-        <w:rPr>
-          <w:szCs w:val="24"/>
-        </w:rPr>
-        <w:t>JavaScript</w:t>
-      </w:r>
-      <w:proofErr w:type="spellEnd"/>
-      <w:r>
-        <w:rPr>
-          <w:szCs w:val="24"/>
-        </w:rPr>
-        <w:t>, linguagens que a equipe já domina e que são amplamente suportadas por todos os navegadores modernos.</w:t>
+        <w:t>. No front-end, serão utilizados HTML, CSS e JavaScript, linguagens que a equipe já domina e que são amplamente suportadas por todos os navegadores modernos.</w:t>
       </w:r>
     </w:p>
     <w:p>
@@ -3704,21 +3328,7 @@
         <w:rPr>
           <w:szCs w:val="24"/>
         </w:rPr>
-        <w:t xml:space="preserve">No </w:t>
-      </w:r>
-      <w:proofErr w:type="spellStart"/>
-      <w:r>
-        <w:rPr>
-          <w:szCs w:val="24"/>
-        </w:rPr>
-        <w:t>back-end</w:t>
-      </w:r>
-      <w:proofErr w:type="spellEnd"/>
-      <w:r>
-        <w:rPr>
-          <w:szCs w:val="24"/>
-        </w:rPr>
-        <w:t>, será utilizado</w:t>
+        <w:t>No back-end, será utilizado</w:t>
       </w:r>
       <w:r>
         <w:rPr>
@@ -3756,49 +3366,7 @@
         <w:rPr>
           <w:szCs w:val="24"/>
         </w:rPr>
-        <w:t xml:space="preserve">Além disso, a equipe utilizará ferramentas consolidadas no mercado de desenvolvimento, como o Visual Studio </w:t>
-      </w:r>
-      <w:proofErr w:type="spellStart"/>
-      <w:r>
-        <w:rPr>
-          <w:szCs w:val="24"/>
-        </w:rPr>
-        <w:t>Code</w:t>
-      </w:r>
-      <w:proofErr w:type="spellEnd"/>
-      <w:r>
-        <w:rPr>
-          <w:szCs w:val="24"/>
-        </w:rPr>
-        <w:t xml:space="preserve"> como editor de código, o </w:t>
-      </w:r>
-      <w:proofErr w:type="spellStart"/>
-      <w:r>
-        <w:rPr>
-          <w:szCs w:val="24"/>
-        </w:rPr>
-        <w:t>Figma</w:t>
-      </w:r>
-      <w:proofErr w:type="spellEnd"/>
-      <w:r>
-        <w:rPr>
-          <w:szCs w:val="24"/>
-        </w:rPr>
-        <w:t xml:space="preserve"> para prototipação de telas e o </w:t>
-      </w:r>
-      <w:proofErr w:type="spellStart"/>
-      <w:r>
-        <w:rPr>
-          <w:szCs w:val="24"/>
-        </w:rPr>
-        <w:t>Postman</w:t>
-      </w:r>
-      <w:proofErr w:type="spellEnd"/>
-      <w:r>
-        <w:rPr>
-          <w:szCs w:val="24"/>
-        </w:rPr>
-        <w:t xml:space="preserve"> para testes de rotas de API. Esse conjunto de ferramentas é gratuito, bem documentado e já utilizado pela equipe em atividades anteriores do curso, o que reduz a curva de aprendizado e favorece a produtividade.</w:t>
+        <w:t>Além disso, a equipe utilizará ferramentas consolidadas no mercado de desenvolvimento, como o Visual Studio Code como editor de código, o Figma para prototipação de telas e o Postman para testes de rotas de API. Esse conjunto de ferramentas é gratuito, bem documentado e já utilizado pela equipe em atividades anteriores do curso, o que reduz a curva de aprendizado e favorece a produtividade.</w:t>
       </w:r>
     </w:p>
     <w:p>
@@ -3842,63 +3410,7 @@
         <w:rPr>
           <w:szCs w:val="24"/>
         </w:rPr>
-        <w:t xml:space="preserve">O projeto apresenta alta viabilidade financeira. Todas as tecnologias e ferramentas previstas para o desenvolvimento são gratuitas ou de código aberto: Node.js, Express.js, MySQL, Visual Studio </w:t>
-      </w:r>
-      <w:proofErr w:type="spellStart"/>
-      <w:r>
-        <w:rPr>
-          <w:szCs w:val="24"/>
-        </w:rPr>
-        <w:t>Code</w:t>
-      </w:r>
-      <w:proofErr w:type="spellEnd"/>
-      <w:r>
-        <w:rPr>
-          <w:szCs w:val="24"/>
-        </w:rPr>
-        <w:t xml:space="preserve">, </w:t>
-      </w:r>
-      <w:proofErr w:type="spellStart"/>
-      <w:r>
-        <w:rPr>
-          <w:szCs w:val="24"/>
-        </w:rPr>
-        <w:t>Figma</w:t>
-      </w:r>
-      <w:proofErr w:type="spellEnd"/>
-      <w:r>
-        <w:rPr>
-          <w:szCs w:val="24"/>
-        </w:rPr>
-        <w:t xml:space="preserve"> (</w:t>
-      </w:r>
-      <w:bookmarkStart w:id="0" w:name="_GoBack"/>
-      <w:r>
-        <w:rPr>
-          <w:szCs w:val="24"/>
-        </w:rPr>
-        <w:t>plano</w:t>
-      </w:r>
-      <w:bookmarkEnd w:id="0"/>
-      <w:r>
-        <w:rPr>
-          <w:szCs w:val="24"/>
-        </w:rPr>
-        <w:t xml:space="preserve"> gratuito) e </w:t>
-      </w:r>
-      <w:proofErr w:type="spellStart"/>
-      <w:r>
-        <w:rPr>
-          <w:szCs w:val="24"/>
-        </w:rPr>
-        <w:t>Postman</w:t>
-      </w:r>
-      <w:proofErr w:type="spellEnd"/>
-      <w:r>
-        <w:rPr>
-          <w:szCs w:val="24"/>
-        </w:rPr>
-        <w:t xml:space="preserve"> são exemplos disso.</w:t>
+        <w:t>O projeto apresenta alta viabilidade financeira. Todas as tecnologias e ferramentas previstas para o desenvolvimento são gratuitas ou de código aberto: Node.js, Express.js, MySQL, Visual Studio Code, Figma (plano gratuito) e Postman são exemplos disso.</w:t>
       </w:r>
     </w:p>
     <w:p>
@@ -4070,16 +3582,8 @@
               <w:rPr>
                 <w:szCs w:val="24"/>
               </w:rPr>
-              <w:t xml:space="preserve">Efetuar </w:t>
-            </w:r>
-            <w:proofErr w:type="spellStart"/>
-            <w:r>
-              <w:rPr>
-                <w:szCs w:val="24"/>
-              </w:rPr>
-              <w:t>Login</w:t>
-            </w:r>
-            <w:proofErr w:type="spellEnd"/>
+              <w:t>Efetuar Login</w:t>
+            </w:r>
           </w:p>
         </w:tc>
       </w:tr>
@@ -4275,23 +3779,13 @@
                 <w:szCs w:val="24"/>
               </w:rPr>
             </w:pPr>
-            <w:proofErr w:type="spellStart"/>
-            <w:r>
-              <w:rPr>
-                <w:b/>
-                <w:bCs/>
-                <w:szCs w:val="24"/>
-              </w:rPr>
-              <w:t>Cód</w:t>
-            </w:r>
-            <w:proofErr w:type="spellEnd"/>
-            <w:r>
-              <w:rPr>
-                <w:b/>
-                <w:bCs/>
-                <w:szCs w:val="24"/>
-              </w:rPr>
-              <w:t>-Nome</w:t>
+            <w:r>
+              <w:rPr>
+                <w:b/>
+                <w:bCs/>
+                <w:szCs w:val="24"/>
+              </w:rPr>
+              <w:t>Cód-Nome</w:t>
             </w:r>
           </w:p>
         </w:tc>
@@ -4427,16 +3921,8 @@
               <w:rPr>
                 <w:szCs w:val="24"/>
               </w:rPr>
-              <w:t xml:space="preserve">NF1.2 Validar </w:t>
-            </w:r>
-            <w:proofErr w:type="spellStart"/>
-            <w:r>
-              <w:rPr>
-                <w:szCs w:val="24"/>
-              </w:rPr>
-              <w:t>Captcha</w:t>
-            </w:r>
-            <w:proofErr w:type="spellEnd"/>
+              <w:t>NF1.2 Validar Captcha</w:t>
+            </w:r>
           </w:p>
         </w:tc>
         <w:tc>
@@ -4454,21 +3940,7 @@
               <w:rPr>
                 <w:szCs w:val="24"/>
               </w:rPr>
-              <w:t xml:space="preserve">O usuário deve confirmar </w:t>
-            </w:r>
-            <w:proofErr w:type="spellStart"/>
-            <w:r>
-              <w:rPr>
-                <w:szCs w:val="24"/>
-              </w:rPr>
-              <w:t>captcha</w:t>
-            </w:r>
-            <w:proofErr w:type="spellEnd"/>
-            <w:r>
-              <w:rPr>
-                <w:szCs w:val="24"/>
-              </w:rPr>
-              <w:t xml:space="preserve"> para evitar acessos automatizados/robôs</w:t>
+              <w:t>O usuário deve confirmar captcha para evitar acessos automatizados/robôs</w:t>
             </w:r>
             <w:r>
               <w:rPr>
@@ -4839,23 +4311,13 @@
                 <w:szCs w:val="24"/>
               </w:rPr>
             </w:pPr>
-            <w:proofErr w:type="spellStart"/>
-            <w:r>
-              <w:rPr>
-                <w:b/>
-                <w:bCs/>
-                <w:szCs w:val="24"/>
-              </w:rPr>
-              <w:t>Cód</w:t>
-            </w:r>
-            <w:proofErr w:type="spellEnd"/>
-            <w:r>
-              <w:rPr>
-                <w:b/>
-                <w:bCs/>
-                <w:szCs w:val="24"/>
-              </w:rPr>
-              <w:t>-Nome</w:t>
+            <w:r>
+              <w:rPr>
+                <w:b/>
+                <w:bCs/>
+                <w:szCs w:val="24"/>
+              </w:rPr>
+              <w:t>Cód-Nome</w:t>
             </w:r>
           </w:p>
         </w:tc>
@@ -5317,23 +4779,13 @@
                 <w:szCs w:val="24"/>
               </w:rPr>
             </w:pPr>
-            <w:proofErr w:type="spellStart"/>
-            <w:r>
-              <w:rPr>
-                <w:b/>
-                <w:bCs/>
-                <w:szCs w:val="24"/>
-              </w:rPr>
-              <w:t>Cód</w:t>
-            </w:r>
-            <w:proofErr w:type="spellEnd"/>
-            <w:r>
-              <w:rPr>
-                <w:b/>
-                <w:bCs/>
-                <w:szCs w:val="24"/>
-              </w:rPr>
-              <w:t>-Nome</w:t>
+            <w:r>
+              <w:rPr>
+                <w:b/>
+                <w:bCs/>
+                <w:szCs w:val="24"/>
+              </w:rPr>
+              <w:t>Cód-Nome</w:t>
             </w:r>
           </w:p>
         </w:tc>
@@ -5791,23 +5243,13 @@
                 <w:szCs w:val="24"/>
               </w:rPr>
             </w:pPr>
-            <w:proofErr w:type="spellStart"/>
-            <w:r>
-              <w:rPr>
-                <w:b/>
-                <w:bCs/>
-                <w:szCs w:val="24"/>
-              </w:rPr>
-              <w:t>Cód</w:t>
-            </w:r>
-            <w:proofErr w:type="spellEnd"/>
-            <w:r>
-              <w:rPr>
-                <w:b/>
-                <w:bCs/>
-                <w:szCs w:val="24"/>
-              </w:rPr>
-              <w:t>-Nome</w:t>
+            <w:r>
+              <w:rPr>
+                <w:b/>
+                <w:bCs/>
+                <w:szCs w:val="24"/>
+              </w:rPr>
+              <w:t>Cód-Nome</w:t>
             </w:r>
           </w:p>
         </w:tc>
@@ -6323,23 +5765,13 @@
                 <w:szCs w:val="24"/>
               </w:rPr>
             </w:pPr>
-            <w:proofErr w:type="spellStart"/>
-            <w:r>
-              <w:rPr>
-                <w:b/>
-                <w:bCs/>
-                <w:szCs w:val="24"/>
-              </w:rPr>
-              <w:t>Cód</w:t>
-            </w:r>
-            <w:proofErr w:type="spellEnd"/>
-            <w:r>
-              <w:rPr>
-                <w:b/>
-                <w:bCs/>
-                <w:szCs w:val="24"/>
-              </w:rPr>
-              <w:t>-Nome</w:t>
+            <w:r>
+              <w:rPr>
+                <w:b/>
+                <w:bCs/>
+                <w:szCs w:val="24"/>
+              </w:rPr>
+              <w:t>Cód-Nome</w:t>
             </w:r>
           </w:p>
         </w:tc>
@@ -6801,23 +6233,13 @@
                 <w:szCs w:val="24"/>
               </w:rPr>
             </w:pPr>
-            <w:proofErr w:type="spellStart"/>
-            <w:r>
-              <w:rPr>
-                <w:b/>
-                <w:bCs/>
-                <w:szCs w:val="24"/>
-              </w:rPr>
-              <w:t>Cód</w:t>
-            </w:r>
-            <w:proofErr w:type="spellEnd"/>
-            <w:r>
-              <w:rPr>
-                <w:b/>
-                <w:bCs/>
-                <w:szCs w:val="24"/>
-              </w:rPr>
-              <w:t>-Nome</w:t>
+            <w:r>
+              <w:rPr>
+                <w:b/>
+                <w:bCs/>
+                <w:szCs w:val="24"/>
+              </w:rPr>
+              <w:t>Cód-Nome</w:t>
             </w:r>
           </w:p>
         </w:tc>
@@ -7314,23 +6736,13 @@
                 <w:szCs w:val="24"/>
               </w:rPr>
             </w:pPr>
-            <w:proofErr w:type="spellStart"/>
-            <w:r>
-              <w:rPr>
-                <w:b/>
-                <w:bCs/>
-                <w:szCs w:val="24"/>
-              </w:rPr>
-              <w:t>Cód</w:t>
-            </w:r>
-            <w:proofErr w:type="spellEnd"/>
-            <w:r>
-              <w:rPr>
-                <w:b/>
-                <w:bCs/>
-                <w:szCs w:val="24"/>
-              </w:rPr>
-              <w:t>-Nome</w:t>
+            <w:r>
+              <w:rPr>
+                <w:b/>
+                <w:bCs/>
+                <w:szCs w:val="24"/>
+              </w:rPr>
+              <w:t>Cód-Nome</w:t>
             </w:r>
           </w:p>
         </w:tc>
@@ -8043,18 +7455,8 @@
           <w:bCs/>
           <w:szCs w:val="24"/>
         </w:rPr>
-        <w:t>Front-</w:t>
-      </w:r>
-      <w:proofErr w:type="spellStart"/>
-      <w:r>
-        <w:rPr>
-          <w:b/>
-          <w:bCs/>
-          <w:szCs w:val="24"/>
-        </w:rPr>
-        <w:t>end</w:t>
-      </w:r>
-      <w:proofErr w:type="spellEnd"/>
+        <w:t>Front-end</w:t>
+      </w:r>
     </w:p>
     <w:p>
       <w:pPr>
@@ -8075,88 +7477,36 @@
         <w:rPr>
           <w:szCs w:val="24"/>
         </w:rPr>
-        <w:t xml:space="preserve">será construída com HTML, CSS e </w:t>
-      </w:r>
-      <w:proofErr w:type="spellStart"/>
-      <w:r>
-        <w:rPr>
-          <w:szCs w:val="24"/>
-        </w:rPr>
-        <w:t>JavaScript</w:t>
-      </w:r>
-      <w:proofErr w:type="spellEnd"/>
-      <w:r>
-        <w:rPr>
-          <w:szCs w:val="24"/>
-        </w:rPr>
-        <w:t xml:space="preserve"> puro. Essa combinação foi escolhida por ser a base do desenvolvimento web e por já ter sido trabalhada pela equipe durante o curso. O </w:t>
-      </w:r>
-      <w:proofErr w:type="spellStart"/>
-      <w:r>
-        <w:rPr>
-          <w:szCs w:val="24"/>
-        </w:rPr>
-        <w:t>JavaScript</w:t>
-      </w:r>
-      <w:proofErr w:type="spellEnd"/>
-      <w:r>
-        <w:rPr>
-          <w:szCs w:val="24"/>
-        </w:rPr>
-        <w:t xml:space="preserve"> será utilizado para a manipulação dinâmica da interface e para a comunicação com a API do </w:t>
-      </w:r>
-      <w:proofErr w:type="spellStart"/>
-      <w:r>
-        <w:rPr>
-          <w:szCs w:val="24"/>
-        </w:rPr>
-        <w:t>back-end</w:t>
-      </w:r>
-      <w:proofErr w:type="spellEnd"/>
-      <w:r>
-        <w:rPr>
-          <w:szCs w:val="24"/>
-        </w:rPr>
-        <w:t xml:space="preserve"> por meio de requisições assíncronas.</w:t>
-      </w:r>
-    </w:p>
-    <w:p>
-      <w:pPr>
-        <w:spacing w:line="360" w:lineRule="auto"/>
-        <w:jc w:val="both"/>
-        <w:rPr>
-          <w:szCs w:val="24"/>
-        </w:rPr>
-      </w:pPr>
-    </w:p>
-    <w:p>
-      <w:pPr>
-        <w:spacing w:line="360" w:lineRule="auto"/>
-        <w:jc w:val="both"/>
-        <w:rPr>
-          <w:b/>
-          <w:bCs/>
-          <w:szCs w:val="24"/>
-        </w:rPr>
-      </w:pPr>
-      <w:r>
-        <w:rPr>
-          <w:b/>
-          <w:bCs/>
-          <w:szCs w:val="24"/>
-        </w:rPr>
-        <w:t>Back-</w:t>
-      </w:r>
-      <w:proofErr w:type="spellStart"/>
-      <w:r>
-        <w:rPr>
-          <w:b/>
-          <w:bCs/>
-          <w:szCs w:val="24"/>
-        </w:rPr>
-        <w:t>end</w:t>
-      </w:r>
-      <w:proofErr w:type="spellEnd"/>
+        <w:t>será construída com HTML, CSS e JavaScript puro. Essa combinação foi escolhida por ser a base do desenvolvimento web e por já ter sido trabalhada pela equipe durante o curso. O JavaScript será utilizado para a manipulação dinâmica da interface e para a comunicação com a API do back-end por meio de requisições assíncronas.</w:t>
+      </w:r>
+    </w:p>
+    <w:p>
+      <w:pPr>
+        <w:spacing w:line="360" w:lineRule="auto"/>
+        <w:jc w:val="both"/>
+        <w:rPr>
+          <w:szCs w:val="24"/>
+        </w:rPr>
+      </w:pPr>
+    </w:p>
+    <w:p>
+      <w:pPr>
+        <w:spacing w:line="360" w:lineRule="auto"/>
+        <w:jc w:val="both"/>
+        <w:rPr>
+          <w:b/>
+          <w:bCs/>
+          <w:szCs w:val="24"/>
+        </w:rPr>
+      </w:pPr>
+      <w:r>
+        <w:rPr>
+          <w:b/>
+          <w:bCs/>
+          <w:szCs w:val="24"/>
+        </w:rPr>
+        <w:t>Back-end</w:t>
+      </w:r>
     </w:p>
     <w:p>
       <w:pPr>
@@ -8171,83 +7521,13 @@
         <w:rPr>
           <w:szCs w:val="24"/>
         </w:rPr>
-        <w:t xml:space="preserve">O </w:t>
-      </w:r>
-      <w:proofErr w:type="spellStart"/>
-      <w:r>
-        <w:rPr>
-          <w:szCs w:val="24"/>
-        </w:rPr>
-        <w:t>back-end</w:t>
-      </w:r>
-      <w:proofErr w:type="spellEnd"/>
-      <w:r>
-        <w:rPr>
-          <w:szCs w:val="24"/>
-        </w:rPr>
-        <w:t xml:space="preserve"> da aplicação será desenvolvida</w:t>
-      </w:r>
-      <w:r>
-        <w:rPr>
-          <w:szCs w:val="24"/>
-        </w:rPr>
-        <w:t xml:space="preserve"> com Node.js, uma plataforma que permite executar </w:t>
-      </w:r>
-      <w:proofErr w:type="spellStart"/>
-      <w:r>
-        <w:rPr>
-          <w:szCs w:val="24"/>
-        </w:rPr>
-        <w:t>JavaScript</w:t>
-      </w:r>
-      <w:proofErr w:type="spellEnd"/>
-      <w:r>
-        <w:rPr>
-          <w:szCs w:val="24"/>
-        </w:rPr>
-        <w:t xml:space="preserve"> no servidor, e o framework Express.js, que simplifica a criação de </w:t>
-      </w:r>
-      <w:proofErr w:type="spellStart"/>
-      <w:r>
-        <w:rPr>
-          <w:szCs w:val="24"/>
-        </w:rPr>
-        <w:t>APIs</w:t>
-      </w:r>
-      <w:proofErr w:type="spellEnd"/>
-      <w:r>
-        <w:rPr>
-          <w:szCs w:val="24"/>
-        </w:rPr>
-        <w:t xml:space="preserve">. O Express.js foi escolhido por sua leveza, flexibilidade e pela grande quantidade de bibliotecas disponíveis no ecossistema Node.js, como </w:t>
-      </w:r>
-      <w:proofErr w:type="spellStart"/>
-      <w:r>
-        <w:rPr>
-          <w:szCs w:val="24"/>
-        </w:rPr>
-        <w:t>bcrypt</w:t>
-      </w:r>
-      <w:proofErr w:type="spellEnd"/>
-      <w:r>
-        <w:rPr>
-          <w:szCs w:val="24"/>
-        </w:rPr>
-        <w:t xml:space="preserve"> para criptografia de senhas e </w:t>
-      </w:r>
-      <w:proofErr w:type="spellStart"/>
-      <w:r>
-        <w:rPr>
-          <w:szCs w:val="24"/>
-        </w:rPr>
-        <w:t>jsonwebtoken</w:t>
-      </w:r>
-      <w:proofErr w:type="spellEnd"/>
-      <w:r>
-        <w:rPr>
-          <w:szCs w:val="24"/>
-        </w:rPr>
-        <w:t xml:space="preserve"> para autenticação.</w:t>
+        <w:t>O back-end da aplicação será desenvolvida</w:t>
+      </w:r>
+      <w:r>
+        <w:rPr>
+          <w:szCs w:val="24"/>
+        </w:rPr>
+        <w:t xml:space="preserve"> com Node.js, uma plataforma que permite executar JavaScript no servidor, e o framework Express.js, que simplifica a criação de APIs. O Express.js foi escolhido por sua leveza, flexibilidade e pela grande quantidade de bibliotecas disponíveis no ecossistema Node.js, como bcrypt para criptografia de senhas e jsonwebtoken para autenticação.</w:t>
       </w:r>
     </w:p>
     <w:p>
@@ -8335,62 +7615,19 @@
           <w:szCs w:val="24"/>
         </w:rPr>
         <w:tab/>
-        <w:t xml:space="preserve">Para o desenvolvimento do código, a equipe utilizará o Visual Studio </w:t>
-      </w:r>
-      <w:proofErr w:type="spellStart"/>
-      <w:r>
-        <w:rPr>
-          <w:szCs w:val="24"/>
-        </w:rPr>
-        <w:t>Code</w:t>
-      </w:r>
-      <w:proofErr w:type="spellEnd"/>
-      <w:r>
-        <w:rPr>
-          <w:szCs w:val="24"/>
-        </w:rPr>
-        <w:t xml:space="preserve">, editor gratuito e amplamente adotado na indústria. A prototipação das telas foi realizada no </w:t>
-      </w:r>
-      <w:proofErr w:type="spellStart"/>
-      <w:r>
-        <w:rPr>
-          <w:szCs w:val="24"/>
-        </w:rPr>
-        <w:t>Figma</w:t>
-      </w:r>
-      <w:proofErr w:type="spellEnd"/>
-      <w:r>
-        <w:rPr>
-          <w:szCs w:val="24"/>
-        </w:rPr>
-        <w:t xml:space="preserve">, que permitiu criar e validar as interfaces antes do desenvolvimento. Para testes de rotas da API, será utilizado o </w:t>
-      </w:r>
-      <w:proofErr w:type="spellStart"/>
-      <w:r>
-        <w:rPr>
-          <w:szCs w:val="24"/>
-        </w:rPr>
-        <w:t>Postman</w:t>
-      </w:r>
-      <w:proofErr w:type="spellEnd"/>
-      <w:r>
-        <w:rPr>
-          <w:szCs w:val="24"/>
-        </w:rPr>
-        <w:t>, ferramenta que facilita o envio de requisições HTTP e a verificação das respostas do servidor.</w:t>
-      </w:r>
-    </w:p>
-    <w:p>
-      <w:pPr>
-        <w:spacing w:line="360" w:lineRule="auto"/>
-        <w:jc w:val="both"/>
-        <w:rPr>
-          <w:b/>
-          <w:bCs/>
-          <w:szCs w:val="24"/>
-        </w:rPr>
-      </w:pPr>
-      <w:proofErr w:type="spellStart"/>
+        <w:t>Para o desenvolvimento do código, a equipe utilizará o Visual Studio Code, editor gratuito e amplamente adotado na indústria. A prototipação das telas foi realizada no Figma, que permitiu criar e validar as interfaces antes do desenvolvimento. Para testes de rotas da API, será utilizado o Postman, ferramenta que facilita o envio de requisições HTTP e a verificação das respostas do servidor.</w:t>
+      </w:r>
+    </w:p>
+    <w:p>
+      <w:pPr>
+        <w:spacing w:line="360" w:lineRule="auto"/>
+        <w:jc w:val="both"/>
+        <w:rPr>
+          <w:b/>
+          <w:bCs/>
+          <w:szCs w:val="24"/>
+        </w:rPr>
+      </w:pPr>
       <w:r>
         <w:rPr>
           <w:b/>
@@ -8398,34 +7635,7 @@
           <w:szCs w:val="24"/>
         </w:rPr>
         <w:lastRenderedPageBreak/>
-        <w:t>Progressive</w:t>
-      </w:r>
-      <w:proofErr w:type="spellEnd"/>
-      <w:r>
-        <w:rPr>
-          <w:b/>
-          <w:bCs/>
-          <w:szCs w:val="24"/>
-        </w:rPr>
-        <w:t xml:space="preserve"> Web </w:t>
-      </w:r>
-      <w:proofErr w:type="spellStart"/>
-      <w:r>
-        <w:rPr>
-          <w:b/>
-          <w:bCs/>
-          <w:szCs w:val="24"/>
-        </w:rPr>
-        <w:t>App</w:t>
-      </w:r>
-      <w:proofErr w:type="spellEnd"/>
-      <w:r>
-        <w:rPr>
-          <w:b/>
-          <w:bCs/>
-          <w:szCs w:val="24"/>
-        </w:rPr>
-        <w:t xml:space="preserve"> (PWA)</w:t>
+        <w:t>Progressive Web App (PWA)</w:t>
       </w:r>
     </w:p>
     <w:p>
@@ -8441,105 +7651,7 @@
           <w:szCs w:val="24"/>
         </w:rPr>
         <w:tab/>
-        <w:t xml:space="preserve">Após a conclusão da versão web, o sistema será adaptado para funcionar como um </w:t>
-      </w:r>
-      <w:proofErr w:type="spellStart"/>
-      <w:r>
-        <w:rPr>
-          <w:szCs w:val="24"/>
-        </w:rPr>
-        <w:t>Progressive</w:t>
-      </w:r>
-      <w:proofErr w:type="spellEnd"/>
-      <w:r>
-        <w:rPr>
-          <w:szCs w:val="24"/>
-        </w:rPr>
-        <w:t xml:space="preserve"> Web </w:t>
-      </w:r>
-      <w:proofErr w:type="spellStart"/>
-      <w:r>
-        <w:rPr>
-          <w:szCs w:val="24"/>
-        </w:rPr>
-        <w:t>App</w:t>
-      </w:r>
-      <w:proofErr w:type="spellEnd"/>
-      <w:r>
-        <w:rPr>
-          <w:szCs w:val="24"/>
-        </w:rPr>
-        <w:t xml:space="preserve">. Essa abordagem permite que o SIGEPI seja instalado em dispositivos móveis como se fosse um aplicativo nativo, sem a necessidade de publicação de lojas como Google Play ou </w:t>
-      </w:r>
-      <w:proofErr w:type="spellStart"/>
-      <w:r>
-        <w:rPr>
-          <w:szCs w:val="24"/>
-        </w:rPr>
-        <w:t>App</w:t>
-      </w:r>
-      <w:proofErr w:type="spellEnd"/>
-      <w:r>
-        <w:rPr>
-          <w:szCs w:val="24"/>
-        </w:rPr>
-        <w:t xml:space="preserve"> </w:t>
-      </w:r>
-      <w:proofErr w:type="spellStart"/>
-      <w:r>
-        <w:rPr>
-          <w:szCs w:val="24"/>
-        </w:rPr>
-        <w:t>Store</w:t>
-      </w:r>
-      <w:proofErr w:type="spellEnd"/>
-      <w:r>
-        <w:rPr>
-          <w:szCs w:val="24"/>
-        </w:rPr>
-        <w:t xml:space="preserve">. O PWA utiliza recursos como Service </w:t>
-      </w:r>
-      <w:proofErr w:type="spellStart"/>
-      <w:r>
-        <w:rPr>
-          <w:szCs w:val="24"/>
-        </w:rPr>
-        <w:t>Workers</w:t>
-      </w:r>
-      <w:proofErr w:type="spellEnd"/>
-      <w:r>
-        <w:rPr>
-          <w:szCs w:val="24"/>
-        </w:rPr>
-        <w:t xml:space="preserve"> e Web </w:t>
-      </w:r>
-      <w:proofErr w:type="spellStart"/>
-      <w:r>
-        <w:rPr>
-          <w:szCs w:val="24"/>
-        </w:rPr>
-        <w:t>App</w:t>
-      </w:r>
-      <w:proofErr w:type="spellEnd"/>
-      <w:r>
-        <w:rPr>
-          <w:szCs w:val="24"/>
-        </w:rPr>
-        <w:t xml:space="preserve"> </w:t>
-      </w:r>
-      <w:proofErr w:type="spellStart"/>
-      <w:r>
-        <w:rPr>
-          <w:szCs w:val="24"/>
-        </w:rPr>
-        <w:t>Manifest</w:t>
-      </w:r>
-      <w:proofErr w:type="spellEnd"/>
-      <w:r>
-        <w:rPr>
-          <w:szCs w:val="24"/>
-        </w:rPr>
-        <w:t xml:space="preserve"> para oferecer uma experiência próxima à de um aplicativo móvel, mantendo a mesma base de código da versão web.</w:t>
+        <w:t>Após a conclusão da versão web, o sistema será adaptado para funcionar como um Progressive Web App. Essa abordagem permite que o SIGEPI seja instalado em dispositivos móveis como se fosse um aplicativo nativo, sem a necessidade de publicação de lojas como Google Play ou App Store. O PWA utiliza recursos como Service Workers e Web App Manifest para oferecer uma experiência próxima à de um aplicativo móvel, mantendo a mesma base de código da versão web.</w:t>
       </w:r>
     </w:p>
     <w:p>
@@ -9057,21 +8169,7 @@
           <w:szCs w:val="24"/>
         </w:rPr>
         <w:tab/>
-        <w:t xml:space="preserve">Entre fevereiro e março de 2026, a equipe concentrou esforços na fase de planejamento: levantamento de requisitos, definição das regras de negócio, elaboração da documentação inicial e criação do protótipo das telas do </w:t>
-      </w:r>
-      <w:proofErr w:type="spellStart"/>
-      <w:r>
-        <w:rPr>
-          <w:szCs w:val="24"/>
-        </w:rPr>
-        <w:t>Figma</w:t>
-      </w:r>
-      <w:proofErr w:type="spellEnd"/>
-      <w:r>
-        <w:rPr>
-          <w:szCs w:val="24"/>
-        </w:rPr>
-        <w:t>. Esta etapa já foi concluída.</w:t>
+        <w:t>Entre fevereiro e março de 2026, a equipe concentrou esforços na fase de planejamento: levantamento de requisitos, definição das regras de negócio, elaboração da documentação inicial e criação do protótipo das telas do Figma. Esta etapa já foi concluída.</w:t>
       </w:r>
     </w:p>
     <w:p>
@@ -9087,105 +8185,7 @@
           <w:szCs w:val="24"/>
         </w:rPr>
         <w:tab/>
-        <w:t>Em abril de 2026, teve início o desenvolvimento prático do sistema. A equipe concluiu o desenvolvimento de todas as 18 telas do front-</w:t>
-      </w:r>
-      <w:proofErr w:type="spellStart"/>
-      <w:r>
-        <w:rPr>
-          <w:szCs w:val="24"/>
-        </w:rPr>
-        <w:t>end</w:t>
-      </w:r>
-      <w:proofErr w:type="spellEnd"/>
-      <w:r>
-        <w:rPr>
-          <w:szCs w:val="24"/>
-        </w:rPr>
-        <w:t xml:space="preserve">, com base no protótipo do </w:t>
-      </w:r>
-      <w:proofErr w:type="spellStart"/>
-      <w:r>
-        <w:rPr>
-          <w:szCs w:val="24"/>
-        </w:rPr>
-        <w:t>Figma</w:t>
-      </w:r>
-      <w:proofErr w:type="spellEnd"/>
-      <w:r>
-        <w:rPr>
-          <w:szCs w:val="24"/>
-        </w:rPr>
-        <w:t xml:space="preserve">, sem uso de CSS </w:t>
-      </w:r>
-      <w:proofErr w:type="spellStart"/>
-      <w:r>
-        <w:rPr>
-          <w:szCs w:val="24"/>
-        </w:rPr>
-        <w:t>inline</w:t>
-      </w:r>
-      <w:proofErr w:type="spellEnd"/>
-      <w:r>
-        <w:rPr>
-          <w:szCs w:val="24"/>
-        </w:rPr>
-        <w:t xml:space="preserve"> e com script externo unificado. Em paralelo, foi iniciado o desenvolvimento do </w:t>
-      </w:r>
-      <w:proofErr w:type="spellStart"/>
-      <w:r>
-        <w:rPr>
-          <w:szCs w:val="24"/>
-        </w:rPr>
-        <w:t>back-end</w:t>
-      </w:r>
-      <w:proofErr w:type="spellEnd"/>
-      <w:r>
-        <w:rPr>
-          <w:szCs w:val="24"/>
-        </w:rPr>
-        <w:t xml:space="preserve"> com Node.js e Express.js, com as rotas de autenticação (cadastro e </w:t>
-      </w:r>
-      <w:proofErr w:type="spellStart"/>
-      <w:r>
-        <w:rPr>
-          <w:szCs w:val="24"/>
-        </w:rPr>
-        <w:t>login</w:t>
-      </w:r>
-      <w:proofErr w:type="spellEnd"/>
-      <w:r>
-        <w:rPr>
-          <w:szCs w:val="24"/>
-        </w:rPr>
-        <w:t xml:space="preserve"> com JWT e </w:t>
-      </w:r>
-      <w:proofErr w:type="spellStart"/>
-      <w:r>
-        <w:rPr>
-          <w:szCs w:val="24"/>
-        </w:rPr>
-        <w:t>bcrypt</w:t>
-      </w:r>
-      <w:proofErr w:type="spellEnd"/>
-      <w:r>
-        <w:rPr>
-          <w:szCs w:val="24"/>
-        </w:rPr>
-        <w:t xml:space="preserve">) e cadastro de empresa já implementadas e testadas via </w:t>
-      </w:r>
-      <w:proofErr w:type="spellStart"/>
-      <w:r>
-        <w:rPr>
-          <w:szCs w:val="24"/>
-        </w:rPr>
-        <w:t>Postman</w:t>
-      </w:r>
-      <w:proofErr w:type="spellEnd"/>
-      <w:r>
-        <w:rPr>
-          <w:szCs w:val="24"/>
-        </w:rPr>
-        <w:t>.</w:t>
+        <w:t>Em abril de 2026, teve início o desenvolvimento prático do sistema. A equipe concluiu o desenvolvimento de todas as 18 telas do front-end, com base no protótipo do Figma, sem uso de CSS inline e com script externo unificado. Em paralelo, foi iniciado o desenvolvimento do back-end com Node.js e Express.js, com as rotas de autenticação (cadastro e login com JWT e bcrypt) e cadastro de empresa já implementadas e testadas via Postman.</w:t>
       </w:r>
     </w:p>
     <w:p>
@@ -9201,35 +8201,7 @@
           <w:szCs w:val="24"/>
         </w:rPr>
         <w:tab/>
-        <w:t xml:space="preserve">Entre maio e julho de 2026, estão sendo implementadas as funcionalidades restantes do </w:t>
-      </w:r>
-      <w:proofErr w:type="spellStart"/>
-      <w:r>
-        <w:rPr>
-          <w:szCs w:val="24"/>
-        </w:rPr>
-        <w:t>back-end</w:t>
-      </w:r>
-      <w:proofErr w:type="spellEnd"/>
-      <w:r>
-        <w:rPr>
-          <w:szCs w:val="24"/>
-        </w:rPr>
-        <w:t xml:space="preserve">: cadastro de setores, vinculação de funcionários à empresa, cadastro de EPIs, registro de entregas e devoluções, painel de </w:t>
-      </w:r>
-      <w:proofErr w:type="spellStart"/>
-      <w:r>
-        <w:rPr>
-          <w:szCs w:val="24"/>
-        </w:rPr>
-        <w:t>dashboard</w:t>
-      </w:r>
-      <w:proofErr w:type="spellEnd"/>
-      <w:r>
-        <w:rPr>
-          <w:szCs w:val="24"/>
-        </w:rPr>
-        <w:t xml:space="preserve"> e geração de relatórios em PDF. O banco de dados relacional foi finalizado com 14 tabelas, trigger de atualização automática de estoque (FIFO) e código SQL completo.</w:t>
+        <w:t>Entre maio e julho de 2026, estão sendo implementadas as funcionalidades restantes do back-end: cadastro de setores, vinculação de funcionários à empresa, cadastro de EPIs, registro de entregas e devoluções, painel de dashboard e geração de relatórios em PDF. O banco de dados relacional foi finalizado com 14 tabelas, trigger de atualização automática de estoque (FIFO) e código SQL completo.</w:t>
       </w:r>
     </w:p>
     <w:p>
@@ -9245,77 +8217,7 @@
           <w:szCs w:val="24"/>
         </w:rPr>
         <w:tab/>
-        <w:t xml:space="preserve">Em agosto de 2026, será iniciada a adaptação para dispositivos móveis por meio do </w:t>
-      </w:r>
-      <w:proofErr w:type="spellStart"/>
-      <w:r>
-        <w:rPr>
-          <w:szCs w:val="24"/>
-        </w:rPr>
-        <w:t>Progressive</w:t>
-      </w:r>
-      <w:proofErr w:type="spellEnd"/>
-      <w:r>
-        <w:rPr>
-          <w:szCs w:val="24"/>
-        </w:rPr>
-        <w:t xml:space="preserve"> Web </w:t>
-      </w:r>
-      <w:proofErr w:type="spellStart"/>
-      <w:r>
-        <w:rPr>
-          <w:szCs w:val="24"/>
-        </w:rPr>
-        <w:t>App</w:t>
-      </w:r>
-      <w:proofErr w:type="spellEnd"/>
-      <w:r>
-        <w:rPr>
-          <w:szCs w:val="24"/>
-        </w:rPr>
-        <w:t xml:space="preserve"> (PWA). Essa fase incluirá a configuração do Service </w:t>
-      </w:r>
-      <w:proofErr w:type="spellStart"/>
-      <w:r>
-        <w:rPr>
-          <w:szCs w:val="24"/>
-        </w:rPr>
-        <w:t>Worker</w:t>
-      </w:r>
-      <w:proofErr w:type="spellEnd"/>
-      <w:r>
-        <w:rPr>
-          <w:szCs w:val="24"/>
-        </w:rPr>
-        <w:t xml:space="preserve">, do Web </w:t>
-      </w:r>
-      <w:proofErr w:type="spellStart"/>
-      <w:r>
-        <w:rPr>
-          <w:szCs w:val="24"/>
-        </w:rPr>
-        <w:t>App</w:t>
-      </w:r>
-      <w:proofErr w:type="spellEnd"/>
-      <w:r>
-        <w:rPr>
-          <w:szCs w:val="24"/>
-        </w:rPr>
-        <w:t xml:space="preserve"> </w:t>
-      </w:r>
-      <w:proofErr w:type="spellStart"/>
-      <w:r>
-        <w:rPr>
-          <w:szCs w:val="24"/>
-        </w:rPr>
-        <w:t>Manifest</w:t>
-      </w:r>
-      <w:proofErr w:type="spellEnd"/>
-      <w:r>
-        <w:rPr>
-          <w:szCs w:val="24"/>
-        </w:rPr>
-        <w:t xml:space="preserve"> e os ajustes de layout necessários para garantir </w:t>
+        <w:t xml:space="preserve">Em agosto de 2026, será iniciada a adaptação para dispositivos móveis por meio do Progressive Web App (PWA). Essa fase incluirá a configuração do Service Worker, do Web App Manifest e os ajustes de layout necessários para garantir </w:t>
       </w:r>
       <w:r>
         <w:rPr>
@@ -9496,35 +8398,7 @@
           <w:szCs w:val="24"/>
         </w:rPr>
         <w:tab/>
-        <w:t>A paleta de cores foi definida com base em seis cores com funções específicas. O azul (#3c98bd) é a cor de background do sistema, utilizado no cabeçalho e fundo das páginas. O verde-água (#5bcfb5) é a cor dos botões de ação e destaque do logo, associado à aprovação e segurança. O branco (#</w:t>
-      </w:r>
-      <w:proofErr w:type="spellStart"/>
-      <w:r>
-        <w:rPr>
-          <w:szCs w:val="24"/>
-        </w:rPr>
-        <w:t>ffffff</w:t>
-      </w:r>
-      <w:proofErr w:type="spellEnd"/>
-      <w:r>
-        <w:rPr>
-          <w:szCs w:val="24"/>
-        </w:rPr>
-        <w:t xml:space="preserve">) predomina nos fundos dos </w:t>
-      </w:r>
-      <w:proofErr w:type="spellStart"/>
-      <w:r>
-        <w:rPr>
-          <w:szCs w:val="24"/>
-        </w:rPr>
-        <w:t>cards</w:t>
-      </w:r>
-      <w:proofErr w:type="spellEnd"/>
-      <w:r>
-        <w:rPr>
-          <w:szCs w:val="24"/>
-        </w:rPr>
-        <w:t>, garantindo legibilidade e visual limpo. O vermelho (#e53935) é reservado para alertas críticos, como EPIs com validade vencida ou estoque abaixo do mínimo. O amarelo (#f5a623) indica alertas moderados, como EPIs próximos ao vencimento ou solicitações pendentes. O azul-escuro (#1a3a50) é utilizado no texto do logo e em elementos textuais de destaque.</w:t>
+        <w:t>A paleta de cores foi definida com base em seis cores com funções específicas. O azul (#3c98bd) é a cor de background do sistema, utilizado no cabeçalho e fundo das páginas. O verde-água (#5bcfb5) é a cor dos botões de ação e destaque do logo, associado à aprovação e segurança. O branco (#ffffff) predomina nos fundos dos cards, garantindo legibilidade e visual limpo. O vermelho (#e53935) é reservado para alertas críticos, como EPIs com validade vencida ou estoque abaixo do mínimo. O amarelo (#f5a623) indica alertas moderados, como EPIs próximos ao vencimento ou solicitações pendentes. O azul-escuro (#1a3a50) é utilizado no texto do logo e em elementos textuais de destaque.</w:t>
       </w:r>
     </w:p>
     <w:p>
@@ -9556,91 +8430,7 @@
           <w:szCs w:val="24"/>
         </w:rPr>
         <w:tab/>
-        <w:t xml:space="preserve">A tipografia adotada é a família </w:t>
-      </w:r>
-      <w:proofErr w:type="spellStart"/>
-      <w:r>
-        <w:rPr>
-          <w:szCs w:val="24"/>
-        </w:rPr>
-        <w:t>Poppins</w:t>
-      </w:r>
-      <w:proofErr w:type="spellEnd"/>
-      <w:r>
-        <w:rPr>
-          <w:szCs w:val="24"/>
-        </w:rPr>
-        <w:t xml:space="preserve">, importada do Google </w:t>
-      </w:r>
-      <w:proofErr w:type="spellStart"/>
-      <w:r>
-        <w:rPr>
-          <w:szCs w:val="24"/>
-        </w:rPr>
-        <w:t>Fonts</w:t>
-      </w:r>
-      <w:proofErr w:type="spellEnd"/>
-      <w:r>
-        <w:rPr>
-          <w:szCs w:val="24"/>
-        </w:rPr>
-        <w:t xml:space="preserve">, com três pesos distintos: </w:t>
-      </w:r>
-      <w:proofErr w:type="spellStart"/>
-      <w:r>
-        <w:rPr>
-          <w:szCs w:val="24"/>
-        </w:rPr>
-        <w:t>Semibold</w:t>
-      </w:r>
-      <w:proofErr w:type="spellEnd"/>
-      <w:r>
-        <w:rPr>
-          <w:szCs w:val="24"/>
-        </w:rPr>
-        <w:t xml:space="preserve"> (títulos e botões), Regular (corpo de texto e </w:t>
-      </w:r>
-      <w:proofErr w:type="spellStart"/>
-      <w:r>
-        <w:rPr>
-          <w:szCs w:val="24"/>
-        </w:rPr>
-        <w:t>labels</w:t>
-      </w:r>
-      <w:proofErr w:type="spellEnd"/>
-      <w:r>
-        <w:rPr>
-          <w:szCs w:val="24"/>
-        </w:rPr>
-        <w:t>) e Light (</w:t>
-      </w:r>
-      <w:proofErr w:type="spellStart"/>
-      <w:r>
-        <w:rPr>
-          <w:szCs w:val="24"/>
-        </w:rPr>
-        <w:t>placeholders</w:t>
-      </w:r>
-      <w:proofErr w:type="spellEnd"/>
-      <w:r>
-        <w:rPr>
-          <w:szCs w:val="24"/>
-        </w:rPr>
-        <w:t xml:space="preserve"> e textos secundários). Os tamanhos seguem uma hierarquia de 36px para títulos de página, 24px para subtítulos, 16px para corpo de texto, 14px para </w:t>
-      </w:r>
-      <w:proofErr w:type="spellStart"/>
-      <w:r>
-        <w:rPr>
-          <w:szCs w:val="24"/>
-        </w:rPr>
-        <w:t>labels</w:t>
-      </w:r>
-      <w:proofErr w:type="spellEnd"/>
-      <w:r>
-        <w:rPr>
-          <w:szCs w:val="24"/>
-        </w:rPr>
-        <w:t xml:space="preserve"> e 12px para textos secundários.</w:t>
+        <w:t>A tipografia adotada é a família Poppins, importada do Google Fonts, com três pesos distintos: Semibold (títulos e botões), Regular (corpo de texto e labels) e Light (placeholders e textos secundários). Os tamanhos seguem uma hierarquia de 36px para títulos de página, 24px para subtítulos, 16px para corpo de texto, 14px para labels e 12px para textos secundários.</w:t>
       </w:r>
     </w:p>
     <w:p>
@@ -9656,35 +8446,7 @@
           <w:szCs w:val="24"/>
         </w:rPr>
         <w:tab/>
-        <w:t>O layout das telas segue um padrão consistente em todas as páginas: menu superior fixo para navegação entre as seções (</w:t>
-      </w:r>
-      <w:proofErr w:type="spellStart"/>
-      <w:r>
-        <w:rPr>
-          <w:szCs w:val="24"/>
-        </w:rPr>
-        <w:t>dashboard</w:t>
-      </w:r>
-      <w:proofErr w:type="spellEnd"/>
-      <w:r>
-        <w:rPr>
-          <w:szCs w:val="24"/>
-        </w:rPr>
-        <w:t xml:space="preserve">, EPIs, funcionários, relatórios), cabeçalho com identificação do usuário </w:t>
-      </w:r>
-      <w:proofErr w:type="spellStart"/>
-      <w:r>
-        <w:rPr>
-          <w:szCs w:val="24"/>
-        </w:rPr>
-        <w:t>logado</w:t>
-      </w:r>
-      <w:proofErr w:type="spellEnd"/>
-      <w:r>
-        <w:rPr>
-          <w:szCs w:val="24"/>
-        </w:rPr>
-        <w:t xml:space="preserve"> e área de conteúdo central. Essa estrutura padronizada reduz o tempo de aprendizado do sistema e melhora a experiência do usuário.</w:t>
+        <w:t>O layout das telas segue um padrão consistente em todas as páginas: menu superior fixo para navegação entre as seções (dashboard, EPIs, funcionários, relatórios), cabeçalho com identificação do usuário logado e área de conteúdo central. Essa estrutura padronizada reduz o tempo de aprendizado do sistema e melhora a experiência do usuário.</w:t>
       </w:r>
     </w:p>
     <w:p>
@@ -9793,63 +8555,7 @@
         <w:rPr>
           <w:szCs w:val="24"/>
         </w:rPr>
-        <w:t xml:space="preserve">Antes do início do desenvolvimento, a equipe elaborou os </w:t>
-      </w:r>
-      <w:proofErr w:type="spellStart"/>
-      <w:r>
-        <w:rPr>
-          <w:szCs w:val="24"/>
-        </w:rPr>
-        <w:t>wireframes</w:t>
-      </w:r>
-      <w:proofErr w:type="spellEnd"/>
-      <w:r>
-        <w:rPr>
-          <w:szCs w:val="24"/>
-        </w:rPr>
-        <w:t xml:space="preserve"> das principais telas do SIGEPI utilizando o </w:t>
-      </w:r>
-      <w:proofErr w:type="spellStart"/>
-      <w:r>
-        <w:rPr>
-          <w:szCs w:val="24"/>
-        </w:rPr>
-        <w:t>Figma</w:t>
-      </w:r>
-      <w:proofErr w:type="spellEnd"/>
-      <w:r>
-        <w:rPr>
-          <w:szCs w:val="24"/>
-        </w:rPr>
-        <w:t xml:space="preserve">. Os </w:t>
-      </w:r>
-      <w:proofErr w:type="spellStart"/>
-      <w:r>
-        <w:rPr>
-          <w:szCs w:val="24"/>
-        </w:rPr>
-        <w:t>wireframes</w:t>
-      </w:r>
-      <w:proofErr w:type="spellEnd"/>
-      <w:r>
-        <w:rPr>
-          <w:szCs w:val="24"/>
-        </w:rPr>
-        <w:t xml:space="preserve"> serviram como referência inicial para validar o fluxo de navegação e a estrutura das interfaces. A partir dos </w:t>
-      </w:r>
-      <w:proofErr w:type="spellStart"/>
-      <w:r>
-        <w:rPr>
-          <w:szCs w:val="24"/>
-        </w:rPr>
-        <w:t>wireframes</w:t>
-      </w:r>
-      <w:proofErr w:type="spellEnd"/>
-      <w:r>
-        <w:rPr>
-          <w:szCs w:val="24"/>
-        </w:rPr>
-        <w:t>, foi desenvolvido o protótipo de alta fidelidade, totalmente alinhado à identidade visual definida.</w:t>
+        <w:t>Antes do início do desenvolvimento, a equipe elaborou os wireframes das principais telas do SIGEPI utilizando o Figma. Os wireframes serviram como referência inicial para validar o fluxo de navegação e a estrutura das interfaces. A partir dos wireframes, foi desenvolvido o protótipo de alta fidelidade, totalmente alinhado à identidade visual definida.</w:t>
       </w:r>
     </w:p>
     <w:p>
@@ -9865,27 +8571,15 @@
           <w:szCs w:val="24"/>
         </w:rPr>
         <w:tab/>
-        <w:t>O protótipo final conta com 38</w:t>
-      </w:r>
-      <w:r>
-        <w:rPr>
-          <w:szCs w:val="24"/>
-        </w:rPr>
-        <w:t xml:space="preserve"> telas exportadas, cobrindo todos os fluxos do sistema: termos e condições, </w:t>
-      </w:r>
-      <w:proofErr w:type="spellStart"/>
-      <w:r>
-        <w:rPr>
-          <w:szCs w:val="24"/>
-        </w:rPr>
-        <w:t>login</w:t>
-      </w:r>
-      <w:proofErr w:type="spellEnd"/>
-      <w:r>
-        <w:rPr>
-          <w:szCs w:val="24"/>
-        </w:rPr>
-        <w:t>, cadastro, home, cadas</w:t>
+        <w:t>O protótipo final conta com 37</w:t>
+      </w:r>
+      <w:bookmarkStart w:id="0" w:name="_GoBack"/>
+      <w:bookmarkEnd w:id="0"/>
+      <w:r>
+        <w:rPr>
+          <w:szCs w:val="24"/>
+        </w:rPr>
+        <w:t xml:space="preserve"> telas exportadas, cobrindo todos os fluxos do sistema: termos e condições, login, cadastro, home, cadas</w:t>
       </w:r>
       <w:r>
         <w:rPr>
@@ -9897,21 +8591,7 @@
         <w:rPr>
           <w:szCs w:val="24"/>
         </w:rPr>
-        <w:t xml:space="preserve"> pagamento, </w:t>
-      </w:r>
-      <w:proofErr w:type="spellStart"/>
-      <w:r>
-        <w:rPr>
-          <w:szCs w:val="24"/>
-        </w:rPr>
-        <w:t>dashboard</w:t>
-      </w:r>
-      <w:proofErr w:type="spellEnd"/>
-      <w:r>
-        <w:rPr>
-          <w:szCs w:val="24"/>
-        </w:rPr>
-        <w:t>, EPIs, funcionários, histórico, meus equipamentos, informações complementares e as s</w:t>
+        <w:t xml:space="preserve"> pagamento, dashboard, EPIs, funcionários, histórico, meus equipamentos, informações complementares e as s</w:t>
       </w:r>
       <w:r>
         <w:rPr>
@@ -9923,21 +8603,7 @@
         <w:rPr>
           <w:szCs w:val="24"/>
         </w:rPr>
-        <w:t xml:space="preserve">e setores). Cada tela foi </w:t>
-      </w:r>
-      <w:proofErr w:type="spellStart"/>
-      <w:r>
-        <w:rPr>
-          <w:szCs w:val="24"/>
-        </w:rPr>
-        <w:t>prototipada</w:t>
-      </w:r>
-      <w:proofErr w:type="spellEnd"/>
-      <w:r>
-        <w:rPr>
-          <w:szCs w:val="24"/>
-        </w:rPr>
-        <w:t xml:space="preserve"> com fidelidade à identidade visual, utilizando as cores, tipografia e componentes que foram implementados no front-end.</w:t>
+        <w:t>e setores). Cada tela foi prototipada com fidelidade à identidade visual, utilizando as cores, tipografia e componentes que foram implementados no front-end.</w:t>
       </w:r>
     </w:p>
     <w:p>
@@ -9953,35 +8619,7 @@
           <w:szCs w:val="24"/>
         </w:rPr>
         <w:tab/>
-        <w:t xml:space="preserve">O protótipo foi desenvolvido no </w:t>
-      </w:r>
-      <w:proofErr w:type="spellStart"/>
-      <w:r>
-        <w:rPr>
-          <w:szCs w:val="24"/>
-        </w:rPr>
-        <w:t>Figma</w:t>
-      </w:r>
-      <w:proofErr w:type="spellEnd"/>
-      <w:r>
-        <w:rPr>
-          <w:szCs w:val="24"/>
-        </w:rPr>
-        <w:t xml:space="preserve"> com dois fluxos distintos: o fluxo do Administrador, que engloba o cadastro da empresa, gestão de EPIs, acompanhamento de funcionários e visualização do </w:t>
-      </w:r>
-      <w:proofErr w:type="spellStart"/>
-      <w:r>
-        <w:rPr>
-          <w:szCs w:val="24"/>
-        </w:rPr>
-        <w:t>dashboard</w:t>
-      </w:r>
-      <w:proofErr w:type="spellEnd"/>
-      <w:r>
-        <w:rPr>
-          <w:szCs w:val="24"/>
-        </w:rPr>
-        <w:t>; e o fluxo do Funcionário, que cobre a entrada na empresa, visualização dos seus EPIs e solicitação de reposição. A prototipação permitiu validar a usabilidade e antecipar decisões de design antes da implementação, servindo como referência direta para o desenvolvimento do front-end.</w:t>
+        <w:t>O protótipo foi desenvolvido no Figma com dois fluxos distintos: o fluxo do Administrador, que engloba o cadastro da empresa, gestão de EPIs, acompanhamento de funcionários e visualização do dashboard; e o fluxo do Funcionário, que cobre a entrada na empresa, visualização dos seus EPIs e solicitação de reposição. A prototipação permitiu validar a usabilidade e antecipar decisões de design antes da implementação, servindo como referência direta para o desenvolvimento do front-end.</w:t>
       </w:r>
     </w:p>
     <w:p>
@@ -10203,21 +8841,7 @@
           <w:szCs w:val="24"/>
         </w:rPr>
         <w:tab/>
-        <w:t xml:space="preserve">Do ponto de vista funcional, o sistema deverá ser capaz de realizar o cadastro completo de funcionários e EPIs, registrar entregas e devoluções, monitorar o estoque em tempo real e emitir alertas automáticos quando equipamentos estiverem com validade próxima do vencimento ou com quantidade abaixo do mínimo estabelecido. Além disso, o painel de </w:t>
-      </w:r>
-      <w:proofErr w:type="spellStart"/>
-      <w:r>
-        <w:rPr>
-          <w:szCs w:val="24"/>
-        </w:rPr>
-        <w:t>dashboard</w:t>
-      </w:r>
-      <w:proofErr w:type="spellEnd"/>
-      <w:r>
-        <w:rPr>
-          <w:szCs w:val="24"/>
-        </w:rPr>
-        <w:t xml:space="preserve"> deverá apresentar de forma visual os principais indicadores de gestão, como os EPIs mais utilizados e o histórico de movimentações.</w:t>
+        <w:t>Do ponto de vista funcional, o sistema deverá ser capaz de realizar o cadastro completo de funcionários e EPIs, registrar entregas e devoluções, monitorar o estoque em tempo real e emitir alertas automáticos quando equipamentos estiverem com validade próxima do vencimento ou com quantidade abaixo do mínimo estabelecido. Além disso, o painel de dashboard deverá apresentar de forma visual os principais indicadores de gestão, como os EPIs mais utilizados e o histórico de movimentações.</w:t>
       </w:r>
     </w:p>
     <w:p>
@@ -10445,21 +9069,7 @@
         <w:rPr>
           <w:szCs w:val="24"/>
         </w:rPr>
-        <w:t xml:space="preserve">inicial concluída e o protótipo de telas desenvolvido no </w:t>
-      </w:r>
-      <w:proofErr w:type="spellStart"/>
-      <w:r>
-        <w:rPr>
-          <w:szCs w:val="24"/>
-        </w:rPr>
-        <w:t>Figma</w:t>
-      </w:r>
-      <w:proofErr w:type="spellEnd"/>
-      <w:r>
-        <w:rPr>
-          <w:szCs w:val="24"/>
-        </w:rPr>
-        <w:t>, a equipe está preparada para iniciar a fase de desenvolvimento do sistema em abril de 2026.</w:t>
+        <w:t>inicial concluída e o protótipo de telas desenvolvido no Figma, a equipe está preparada para iniciar a fase de desenvolvimento do sistema em abril de 2026.</w:t>
       </w:r>
     </w:p>
     <w:p>
@@ -10491,21 +9101,7 @@
           <w:szCs w:val="24"/>
         </w:rPr>
         <w:tab/>
-        <w:t xml:space="preserve">Em seguida, serão implementadas as funcionalidades do módulo de autenticação, incluindo </w:t>
-      </w:r>
-      <w:proofErr w:type="spellStart"/>
-      <w:r>
-        <w:rPr>
-          <w:szCs w:val="24"/>
-        </w:rPr>
-        <w:t>login</w:t>
-      </w:r>
-      <w:proofErr w:type="spellEnd"/>
-      <w:r>
-        <w:rPr>
-          <w:szCs w:val="24"/>
-        </w:rPr>
-        <w:t>, validação de CAPTCHA e controle de perfis de acesso. Esse módulo é a porta de entrada dos sistemas e precisa estar funcional antes do desenvolvimento das demais telas.</w:t>
+        <w:t>Em seguida, serão implementadas as funcionalidades do módulo de autenticação, incluindo login, validação de CAPTCHA e controle de perfis de acesso. Esse módulo é a porta de entrada dos sistemas e precisa estar funcional antes do desenvolvimento das demais telas.</w:t>
       </w:r>
     </w:p>
     <w:p>
@@ -10521,21 +9117,7 @@
           <w:szCs w:val="24"/>
         </w:rPr>
         <w:tab/>
-        <w:t xml:space="preserve">Após a autenticação, o desenvolvimento seguirá a ordem de prioridade definida nos requisitos: cadastro de funcionários e EPIs, controle de estoque, registro de entregas e devoluções, e por fim o </w:t>
-      </w:r>
-      <w:proofErr w:type="spellStart"/>
-      <w:r>
-        <w:rPr>
-          <w:szCs w:val="24"/>
-        </w:rPr>
-        <w:t>dashboard</w:t>
-      </w:r>
-      <w:proofErr w:type="spellEnd"/>
-      <w:r>
-        <w:rPr>
-          <w:szCs w:val="24"/>
-        </w:rPr>
-        <w:t xml:space="preserve"> e geração de relatórios. Cada funcionalidade será testada individualmente antes de avançar para a próxima.</w:t>
+        <w:t>Após a autenticação, o desenvolvimento seguirá a ordem de prioridade definida nos requisitos: cadastro de funcionários e EPIs, controle de estoque, registro de entregas e devoluções, e por fim o dashboard e geração de relatórios. Cada funcionalidade será testada individualmente antes de avançar para a próxima.</w:t>
       </w:r>
     </w:p>
     <w:p>
@@ -10873,7 +9455,7 @@
           <w:rPr>
             <w:noProof/>
           </w:rPr>
-          <w:t>7</w:t>
+          <w:t>17</w:t>
         </w:r>
         <w:r>
           <w:fldChar w:fldCharType="end"/>

</xml_diff>

<commit_message>
Atualização da Segunda Edição da Documentação e Criação do PDF
</commit_message>
<xml_diff>
--- a/Documentação/Segunda Edição/TCC - Documentação.docx
+++ b/Documentação/Segunda Edição/TCC - Documentação.docx
@@ -1890,6 +1890,14 @@
           <w:szCs w:val="24"/>
         </w:rPr>
         <w:t>13 WIREFRAMES</w:t>
+      </w:r>
+      <w:r>
+        <w:rPr>
+          <w:b/>
+          <w:bCs/>
+          <w:szCs w:val="24"/>
+        </w:rPr>
+        <w:t xml:space="preserve"> E PROTOTIPAÇÃO</w:t>
       </w:r>
       <w:r>
         <w:rPr>
@@ -8769,13 +8777,12 @@
           <w:szCs w:val="24"/>
         </w:rPr>
         <w:tab/>
-        <w:t xml:space="preserve">Em abril de 2026, está previsto o início do desenvolvimento prático do sistema. A equipe começará pelo </w:t>
-      </w:r>
-      <w:r>
-        <w:rPr>
-          <w:szCs w:val="24"/>
-        </w:rPr>
-        <w:t>desenvolvimento das telas do front-</w:t>
+      </w:r>
+      <w:r>
+        <w:rPr>
+          <w:szCs w:val="24"/>
+        </w:rPr>
+        <w:t>Em abril de 2026, teve início o desenvolvimento prático do sistema. A equipe concluiu o desenvolvimento de todas as 18 telas do front-</w:t>
       </w:r>
       <w:proofErr w:type="spellStart"/>
       <w:r>
@@ -8803,13 +8810,27 @@
         <w:rPr>
           <w:szCs w:val="24"/>
         </w:rPr>
-        <w:t xml:space="preserve">. Paralelamente, com o desenvolvimento do </w:t>
+        <w:t xml:space="preserve">, sem uso de CSS </w:t>
       </w:r>
       <w:proofErr w:type="spellStart"/>
       <w:r>
         <w:rPr>
           <w:szCs w:val="24"/>
         </w:rPr>
+        <w:t>inline</w:t>
+      </w:r>
+      <w:proofErr w:type="spellEnd"/>
+      <w:r>
+        <w:rPr>
+          <w:szCs w:val="24"/>
+        </w:rPr>
+        <w:t xml:space="preserve"> e com script externo unificado. Em paralelo, foi iniciado o desenvolvimento do </w:t>
+      </w:r>
+      <w:proofErr w:type="spellStart"/>
+      <w:r>
+        <w:rPr>
+          <w:szCs w:val="24"/>
+        </w:rPr>
         <w:t>back-end</w:t>
       </w:r>
       <w:proofErr w:type="spellEnd"/>
@@ -8817,7 +8838,35 @@
         <w:rPr>
           <w:szCs w:val="24"/>
         </w:rPr>
-        <w:t>, com a implementação das rotas de autenticação, cadastro de funcionários e EPIs, e controle de estoque.</w:t>
+        <w:t xml:space="preserve"> com Node.js e Express.js, com as rotas de autenticação (cadastro e login com JWT e </w:t>
+      </w:r>
+      <w:proofErr w:type="spellStart"/>
+      <w:r>
+        <w:rPr>
+          <w:szCs w:val="24"/>
+        </w:rPr>
+        <w:t>bcrypt</w:t>
+      </w:r>
+      <w:proofErr w:type="spellEnd"/>
+      <w:r>
+        <w:rPr>
+          <w:szCs w:val="24"/>
+        </w:rPr>
+        <w:t xml:space="preserve">) e cadastro de empresa já implementadas e testadas via </w:t>
+      </w:r>
+      <w:proofErr w:type="spellStart"/>
+      <w:r>
+        <w:rPr>
+          <w:szCs w:val="24"/>
+        </w:rPr>
+        <w:t>Postman</w:t>
+      </w:r>
+      <w:proofErr w:type="spellEnd"/>
+      <w:r>
+        <w:rPr>
+          <w:szCs w:val="24"/>
+        </w:rPr>
+        <w:t>.</w:t>
       </w:r>
     </w:p>
     <w:p>
@@ -8833,7 +8882,26 @@
           <w:szCs w:val="24"/>
         </w:rPr>
         <w:tab/>
-        <w:t>Entre maio e julho de 2026, serão implementadas as funcionalidades restantes da versão web: registro de entregas e devoluções, painel de dashboard, geração de relatórios em PDF e sistemas de alertas para EPIs com validade próxima do vencimento. Ao final desse período, a versão web do sistema deverá estar funcional.</w:t>
+      </w:r>
+      <w:r>
+        <w:rPr>
+          <w:szCs w:val="24"/>
+        </w:rPr>
+        <w:t xml:space="preserve">Entre maio e julho de 2026, estão sendo implementadas as funcionalidades restantes do </w:t>
+      </w:r>
+      <w:proofErr w:type="spellStart"/>
+      <w:r>
+        <w:rPr>
+          <w:szCs w:val="24"/>
+        </w:rPr>
+        <w:t>back-end</w:t>
+      </w:r>
+      <w:proofErr w:type="spellEnd"/>
+      <w:r>
+        <w:rPr>
+          <w:szCs w:val="24"/>
+        </w:rPr>
+        <w:t>: cadastro de setores, vinculação de funcionários à empresa, cadastro de EPIs, registro de entregas e devoluções, painel de dashboard e geração de relatórios em PDF. O banco de dados relacional foi finalizado com 14 tabelas, trigger de atualização automática de estoque com lógica FIFO e código SQL completo.</w:t>
       </w:r>
     </w:p>
     <w:p>
@@ -9013,28 +9081,6 @@
           <w:szCs w:val="24"/>
         </w:rPr>
       </w:pPr>
-    </w:p>
-    <w:p>
-      <w:pPr>
-        <w:spacing w:line="360" w:lineRule="auto"/>
-        <w:jc w:val="both"/>
-        <w:rPr>
-          <w:b/>
-          <w:bCs/>
-          <w:szCs w:val="24"/>
-        </w:rPr>
-      </w:pPr>
-    </w:p>
-    <w:p>
-      <w:pPr>
-        <w:spacing w:line="360" w:lineRule="auto"/>
-        <w:jc w:val="both"/>
-        <w:rPr>
-          <w:b/>
-          <w:bCs/>
-          <w:szCs w:val="24"/>
-        </w:rPr>
-      </w:pPr>
       <w:r>
         <w:rPr>
           <w:b/>
@@ -9058,12 +9104,283 @@
           <w:szCs w:val="24"/>
         </w:rPr>
         <w:tab/>
+      </w:r>
+      <w:r>
+        <w:rPr>
+          <w:szCs w:val="24"/>
+        </w:rPr>
         <w:t>A identidade visual do SIGEPI foi desenvolvida com o objetivo de transmitir confiabilidade, organização e clareza, características essenciais para um sistema voltado ao ambiente corporativo e à segurança do trabalho.</w:t>
       </w:r>
     </w:p>
     <w:p>
       <w:pPr>
         <w:spacing w:line="360" w:lineRule="auto"/>
+        <w:ind w:firstLine="720"/>
+        <w:jc w:val="both"/>
+        <w:rPr>
+          <w:szCs w:val="24"/>
+        </w:rPr>
+      </w:pPr>
+      <w:r>
+        <w:rPr>
+          <w:szCs w:val="24"/>
+        </w:rPr>
+        <w:t>A paleta de cores foi definida com base em seis cores com funções específicas. O azul (#3c98bd) é a cor de background do sistema, utilizado no cabeçalho e fundo das páginas. O verde-água (#5bcfb5) é a cor dos botões de ação e destaque do logo, associado à aprovação e segurança. O branco (#ffffff) predomina nos fundos dos cards, garantindo legibilidade e visual limpo. O vermelho (#e53935) é reservado para alertas críticos, como EPIs com validade vencida ou estoque abaixo do mínimo. O amarelo (#f5a623) indica alertas moderados, como EPIs próximos ao vencimento ou solicitações pendentes. O azul-escuro (#1a3a50) é utilizado no texto do logo e em elementos textuais de destaque.</w:t>
+      </w:r>
+    </w:p>
+    <w:p>
+      <w:pPr>
+        <w:spacing w:line="360" w:lineRule="auto"/>
+        <w:ind w:firstLine="720"/>
+        <w:jc w:val="both"/>
+        <w:rPr>
+          <w:szCs w:val="24"/>
+        </w:rPr>
+      </w:pPr>
+      <w:r>
+        <w:rPr>
+          <w:szCs w:val="24"/>
+        </w:rPr>
+        <w:t xml:space="preserve">A tipografia adotada é a família Poppins, importada do Google </w:t>
+      </w:r>
+      <w:proofErr w:type="spellStart"/>
+      <w:r>
+        <w:rPr>
+          <w:szCs w:val="24"/>
+        </w:rPr>
+        <w:t>Fonts</w:t>
+      </w:r>
+      <w:proofErr w:type="spellEnd"/>
+      <w:r>
+        <w:rPr>
+          <w:szCs w:val="24"/>
+        </w:rPr>
+        <w:t xml:space="preserve">, com três pesos distintos: </w:t>
+      </w:r>
+      <w:proofErr w:type="spellStart"/>
+      <w:r>
+        <w:rPr>
+          <w:szCs w:val="24"/>
+        </w:rPr>
+        <w:t>Semibold</w:t>
+      </w:r>
+      <w:proofErr w:type="spellEnd"/>
+      <w:r>
+        <w:rPr>
+          <w:szCs w:val="24"/>
+        </w:rPr>
+        <w:t xml:space="preserve"> (títulos e botões), Regular (corpo de texto e </w:t>
+      </w:r>
+      <w:proofErr w:type="spellStart"/>
+      <w:r>
+        <w:rPr>
+          <w:szCs w:val="24"/>
+        </w:rPr>
+        <w:t>labels</w:t>
+      </w:r>
+      <w:proofErr w:type="spellEnd"/>
+      <w:r>
+        <w:rPr>
+          <w:szCs w:val="24"/>
+        </w:rPr>
+        <w:t>) e Light (</w:t>
+      </w:r>
+      <w:proofErr w:type="spellStart"/>
+      <w:r>
+        <w:rPr>
+          <w:szCs w:val="24"/>
+        </w:rPr>
+        <w:t>placeholders</w:t>
+      </w:r>
+      <w:proofErr w:type="spellEnd"/>
+      <w:r>
+        <w:rPr>
+          <w:szCs w:val="24"/>
+        </w:rPr>
+        <w:t xml:space="preserve"> e textos secundários). Os tamanhos seguem uma hierarquia de 36px para títulos de página, 24px para subtítulos, 16px para corpo de texto, 14px para </w:t>
+      </w:r>
+      <w:proofErr w:type="spellStart"/>
+      <w:r>
+        <w:rPr>
+          <w:szCs w:val="24"/>
+        </w:rPr>
+        <w:t>labels</w:t>
+      </w:r>
+      <w:proofErr w:type="spellEnd"/>
+      <w:r>
+        <w:rPr>
+          <w:szCs w:val="24"/>
+        </w:rPr>
+        <w:t xml:space="preserve"> e 12px para textos secundários.</w:t>
+      </w:r>
+    </w:p>
+    <w:p>
+      <w:pPr>
+        <w:spacing w:line="360" w:lineRule="auto"/>
+        <w:ind w:firstLine="720"/>
+        <w:jc w:val="both"/>
+        <w:rPr>
+          <w:szCs w:val="24"/>
+        </w:rPr>
+      </w:pPr>
+      <w:r>
+        <w:rPr>
+          <w:szCs w:val="24"/>
+        </w:rPr>
+        <w:t>O layout das telas segue um padrão consistente em todas as páginas: menu superior fixo para navegação entre as seções, cabeçalho com identificação do usuário logado e área de conteúdo central. Essa estrutura padronizada reduz o tempo de aprendizado do sistema e melhora a experiência do usuário.</w:t>
+      </w:r>
+    </w:p>
+    <w:p>
+      <w:pPr>
+        <w:spacing w:line="360" w:lineRule="auto"/>
+        <w:ind w:firstLine="720"/>
+        <w:jc w:val="both"/>
+        <w:rPr>
+          <w:szCs w:val="24"/>
+        </w:rPr>
+      </w:pPr>
+      <w:r>
+        <w:rPr>
+          <w:szCs w:val="24"/>
+        </w:rPr>
+        <w:t>A interface foi projetada para ser totalmente responsiva, adaptando-se a diferentes tamanhos de tela. Em dispositivos móveis, o sistema será acessível por meio do Progressive Web App (PWA), mantendo a mesma identidade visual da versão web.</w:t>
+      </w:r>
+    </w:p>
+    <w:p>
+      <w:pPr>
+        <w:spacing w:line="360" w:lineRule="auto"/>
+        <w:jc w:val="both"/>
+        <w:rPr>
+          <w:b/>
+          <w:bCs/>
+          <w:szCs w:val="24"/>
+        </w:rPr>
+      </w:pPr>
+    </w:p>
+    <w:p>
+      <w:pPr>
+        <w:spacing w:line="360" w:lineRule="auto"/>
+        <w:jc w:val="both"/>
+        <w:rPr>
+          <w:b/>
+          <w:bCs/>
+          <w:szCs w:val="24"/>
+        </w:rPr>
+      </w:pPr>
+    </w:p>
+    <w:p>
+      <w:pPr>
+        <w:spacing w:line="360" w:lineRule="auto"/>
+        <w:jc w:val="both"/>
+        <w:rPr>
+          <w:b/>
+          <w:bCs/>
+          <w:szCs w:val="24"/>
+        </w:rPr>
+      </w:pPr>
+    </w:p>
+    <w:p>
+      <w:pPr>
+        <w:spacing w:line="360" w:lineRule="auto"/>
+        <w:jc w:val="both"/>
+        <w:rPr>
+          <w:b/>
+          <w:bCs/>
+          <w:szCs w:val="24"/>
+        </w:rPr>
+      </w:pPr>
+    </w:p>
+    <w:p>
+      <w:pPr>
+        <w:spacing w:line="360" w:lineRule="auto"/>
+        <w:jc w:val="both"/>
+        <w:rPr>
+          <w:b/>
+          <w:bCs/>
+          <w:szCs w:val="24"/>
+        </w:rPr>
+      </w:pPr>
+    </w:p>
+    <w:p>
+      <w:pPr>
+        <w:spacing w:line="360" w:lineRule="auto"/>
+        <w:jc w:val="both"/>
+        <w:rPr>
+          <w:b/>
+          <w:bCs/>
+          <w:szCs w:val="24"/>
+        </w:rPr>
+      </w:pPr>
+    </w:p>
+    <w:p>
+      <w:pPr>
+        <w:spacing w:line="360" w:lineRule="auto"/>
+        <w:jc w:val="both"/>
+        <w:rPr>
+          <w:b/>
+          <w:bCs/>
+          <w:szCs w:val="24"/>
+        </w:rPr>
+      </w:pPr>
+    </w:p>
+    <w:p>
+      <w:pPr>
+        <w:spacing w:line="360" w:lineRule="auto"/>
+        <w:jc w:val="both"/>
+        <w:rPr>
+          <w:b/>
+          <w:bCs/>
+          <w:szCs w:val="24"/>
+        </w:rPr>
+      </w:pPr>
+    </w:p>
+    <w:p>
+      <w:pPr>
+        <w:spacing w:line="360" w:lineRule="auto"/>
+        <w:jc w:val="both"/>
+        <w:rPr>
+          <w:b/>
+          <w:bCs/>
+          <w:szCs w:val="24"/>
+        </w:rPr>
+      </w:pPr>
+      <w:r>
+        <w:rPr>
+          <w:b/>
+          <w:bCs/>
+          <w:szCs w:val="24"/>
+        </w:rPr>
+        <w:lastRenderedPageBreak/>
+        <w:t>1</w:t>
+      </w:r>
+      <w:r>
+        <w:rPr>
+          <w:b/>
+          <w:bCs/>
+          <w:szCs w:val="24"/>
+        </w:rPr>
+        <w:t>3</w:t>
+      </w:r>
+      <w:r>
+        <w:rPr>
+          <w:b/>
+          <w:bCs/>
+          <w:szCs w:val="24"/>
+        </w:rPr>
+        <w:t xml:space="preserve"> WIREFRAMES</w:t>
+      </w:r>
+      <w:r>
+        <w:rPr>
+          <w:b/>
+          <w:bCs/>
+          <w:szCs w:val="24"/>
+        </w:rPr>
+        <w:t xml:space="preserve"> E PROTOTIPAÇÃO</w:t>
+      </w:r>
+    </w:p>
+    <w:p>
+      <w:pPr>
+        <w:spacing w:line="360" w:lineRule="auto"/>
         <w:jc w:val="both"/>
         <w:rPr>
           <w:szCs w:val="24"/>
@@ -9074,78 +9391,206 @@
           <w:szCs w:val="24"/>
         </w:rPr>
         <w:tab/>
-        <w:t>A paleta de cores foi definida com base em quatro cores principais. O verde claro é a cor de destaque do sistema, associado à segurança e à aprovação de itens. O azul claro é utilizado nos elementos estruturais da interface, como menus, cabeçalhos e botões de ação, transmitindo seriedade e profissionalismo. O branco predomina nos fundos das telas, garantindo legibilidade e um visual limpo. O vermelho e o amarelo são reservados exclusivamente para indicadores de alerta, como EPIs com validade vencida, estoque baixo do mínimo ou solicitações pendentes.</w:t>
-      </w:r>
-    </w:p>
-    <w:p>
-      <w:pPr>
-        <w:spacing w:line="360" w:lineRule="auto"/>
-        <w:jc w:val="both"/>
-        <w:rPr>
-          <w:szCs w:val="24"/>
-        </w:rPr>
-      </w:pPr>
-      <w:r>
-        <w:rPr>
-          <w:szCs w:val="24"/>
-        </w:rPr>
-        <w:tab/>
-        <w:t>Essa combinação de cores cria uma hierarquia visual clara: o usuário consegue identificar rapidamente o que é informação, o que é ação, o que é alerta, sem precisar ler textos longos ou explicativos.</w:t>
-      </w:r>
-    </w:p>
-    <w:p>
-      <w:pPr>
-        <w:spacing w:line="360" w:lineRule="auto"/>
-        <w:jc w:val="both"/>
-        <w:rPr>
-          <w:szCs w:val="24"/>
-        </w:rPr>
-      </w:pPr>
-      <w:r>
-        <w:rPr>
-          <w:szCs w:val="24"/>
-        </w:rPr>
-        <w:tab/>
-        <w:t xml:space="preserve">O sistema conta com um logotipo próprio, desenvolvido para representar visualmente a </w:t>
-      </w:r>
-      <w:r>
-        <w:rPr>
-          <w:szCs w:val="24"/>
-        </w:rPr>
-        <w:t>proposta do SIGEPI. O logo será exibido na tela de login, no menu superior e nos relatórios pelo sistema.</w:t>
-      </w:r>
-    </w:p>
-    <w:p>
-      <w:pPr>
-        <w:spacing w:line="360" w:lineRule="auto"/>
-        <w:jc w:val="both"/>
-        <w:rPr>
-          <w:szCs w:val="24"/>
-        </w:rPr>
-      </w:pPr>
-      <w:r>
-        <w:rPr>
-          <w:szCs w:val="24"/>
-        </w:rPr>
-        <w:tab/>
-        <w:t>O layout das telas segue um padrão consistente em todas as páginas: menu superior fixo para navegação entre as seções (dashboard, EPIs, funcionários, relatórios), cabeçalho com identificação do usuário logado e área de conteúdo central. Essa estrutura padronizada reduz o tempo de aprendizado do sistema e melhora a experiência do usuário.</w:t>
-      </w:r>
-    </w:p>
-    <w:p>
-      <w:pPr>
-        <w:spacing w:line="360" w:lineRule="auto"/>
-        <w:jc w:val="both"/>
-        <w:rPr>
-          <w:szCs w:val="24"/>
-        </w:rPr>
-      </w:pPr>
-      <w:r>
-        <w:rPr>
-          <w:szCs w:val="24"/>
-        </w:rPr>
-        <w:tab/>
-        <w:t>A interface foi projetada para ser totalmente responsiva, adaptando-se a diferentes tamanhos de tela. Em dispositivos móveis, o menu superior é substituído por um menu inferior, seguindo as convenções de navegação mais comuns em aplicativos móveis. Essa adaptação será especialmente na versão PWA do sistema.</w:t>
-      </w:r>
+      </w:r>
+      <w:r>
+        <w:rPr>
+          <w:szCs w:val="24"/>
+        </w:rPr>
+        <w:t xml:space="preserve">Antes do início do desenvolvimento, a equipe elaborou os </w:t>
+      </w:r>
+      <w:proofErr w:type="spellStart"/>
+      <w:r>
+        <w:rPr>
+          <w:szCs w:val="24"/>
+        </w:rPr>
+        <w:t>wireframes</w:t>
+      </w:r>
+      <w:proofErr w:type="spellEnd"/>
+      <w:r>
+        <w:rPr>
+          <w:szCs w:val="24"/>
+        </w:rPr>
+        <w:t xml:space="preserve"> das principais telas do SIGEPI utilizando o </w:t>
+      </w:r>
+      <w:proofErr w:type="spellStart"/>
+      <w:r>
+        <w:rPr>
+          <w:szCs w:val="24"/>
+        </w:rPr>
+        <w:t>Figma</w:t>
+      </w:r>
+      <w:proofErr w:type="spellEnd"/>
+      <w:r>
+        <w:rPr>
+          <w:szCs w:val="24"/>
+        </w:rPr>
+        <w:t xml:space="preserve">. Os </w:t>
+      </w:r>
+      <w:proofErr w:type="spellStart"/>
+      <w:r>
+        <w:rPr>
+          <w:szCs w:val="24"/>
+        </w:rPr>
+        <w:t>wireframes</w:t>
+      </w:r>
+      <w:proofErr w:type="spellEnd"/>
+      <w:r>
+        <w:rPr>
+          <w:szCs w:val="24"/>
+        </w:rPr>
+        <w:t xml:space="preserve"> serviram como referência inicial para validar o fluxo de navegação e a estrutura das interfaces. A partir dos </w:t>
+      </w:r>
+      <w:proofErr w:type="spellStart"/>
+      <w:r>
+        <w:rPr>
+          <w:szCs w:val="24"/>
+        </w:rPr>
+        <w:t>wireframes</w:t>
+      </w:r>
+      <w:proofErr w:type="spellEnd"/>
+      <w:r>
+        <w:rPr>
+          <w:szCs w:val="24"/>
+        </w:rPr>
+        <w:t>, foi desenvolvido o protótipo de alta fidelidade, totalmente alinhado à identidade visual definida.</w:t>
+      </w:r>
+    </w:p>
+    <w:p>
+      <w:pPr>
+        <w:spacing w:line="360" w:lineRule="auto"/>
+        <w:ind w:firstLine="720"/>
+        <w:jc w:val="both"/>
+        <w:rPr>
+          <w:szCs w:val="24"/>
+        </w:rPr>
+      </w:pPr>
+      <w:r>
+        <w:rPr>
+          <w:szCs w:val="24"/>
+        </w:rPr>
+        <w:t xml:space="preserve">O protótipo final conta com 39 telas exportadas, cobrindo todos os fluxos do sistema: termos e condições, login, cadastro, home, cadastro de empresa, setores, dashboard, EPIs, funcionários, histórico, meus equipamentos, informações complementares e as seções de configuração de empresa e setores. Cada tela foi </w:t>
+      </w:r>
+      <w:proofErr w:type="spellStart"/>
+      <w:r>
+        <w:rPr>
+          <w:szCs w:val="24"/>
+        </w:rPr>
+        <w:t>prototipada</w:t>
+      </w:r>
+      <w:proofErr w:type="spellEnd"/>
+      <w:r>
+        <w:rPr>
+          <w:szCs w:val="24"/>
+        </w:rPr>
+        <w:t xml:space="preserve"> com fidelidade à identidade visual, utilizando as cores, tipografia e componentes que foram implementados no front-end.</w:t>
+      </w:r>
+    </w:p>
+    <w:p>
+      <w:pPr>
+        <w:spacing w:line="360" w:lineRule="auto"/>
+        <w:ind w:firstLine="720"/>
+        <w:jc w:val="both"/>
+        <w:rPr>
+          <w:szCs w:val="24"/>
+        </w:rPr>
+      </w:pPr>
+      <w:r>
+        <w:rPr>
+          <w:szCs w:val="24"/>
+        </w:rPr>
+        <w:t xml:space="preserve">O protótipo foi desenvolvido no </w:t>
+      </w:r>
+      <w:proofErr w:type="spellStart"/>
+      <w:r>
+        <w:rPr>
+          <w:szCs w:val="24"/>
+        </w:rPr>
+        <w:t>Figma</w:t>
+      </w:r>
+      <w:proofErr w:type="spellEnd"/>
+      <w:r>
+        <w:rPr>
+          <w:szCs w:val="24"/>
+        </w:rPr>
+        <w:t xml:space="preserve"> com dois fluxos distintos: o fluxo do Administrador, que engloba o cadastro da empresa, gestão de EPIs, acompanhamento de funcionários e visualização do dashboard; e o fluxo do Funcionário, que cobre a entrada na empresa, visualização dos seus EPIs e solicitação de reposição. A prototipação permitiu validar a usabilidade e antecipar decisões de design antes da implementação, servindo como referência direta para o desenvolvimento do front-end.</w:t>
+      </w:r>
+    </w:p>
+    <w:p>
+      <w:pPr>
+        <w:spacing w:line="360" w:lineRule="auto"/>
+        <w:jc w:val="both"/>
+        <w:rPr>
+          <w:b/>
+          <w:bCs/>
+          <w:szCs w:val="24"/>
+        </w:rPr>
+      </w:pPr>
+    </w:p>
+    <w:p>
+      <w:pPr>
+        <w:spacing w:line="360" w:lineRule="auto"/>
+        <w:jc w:val="both"/>
+        <w:rPr>
+          <w:b/>
+          <w:bCs/>
+          <w:szCs w:val="24"/>
+        </w:rPr>
+      </w:pPr>
+    </w:p>
+    <w:p>
+      <w:pPr>
+        <w:spacing w:line="360" w:lineRule="auto"/>
+        <w:jc w:val="both"/>
+        <w:rPr>
+          <w:b/>
+          <w:bCs/>
+          <w:szCs w:val="24"/>
+        </w:rPr>
+      </w:pPr>
+    </w:p>
+    <w:p>
+      <w:pPr>
+        <w:spacing w:line="360" w:lineRule="auto"/>
+        <w:jc w:val="both"/>
+        <w:rPr>
+          <w:b/>
+          <w:bCs/>
+          <w:szCs w:val="24"/>
+        </w:rPr>
+      </w:pPr>
+    </w:p>
+    <w:p>
+      <w:pPr>
+        <w:spacing w:line="360" w:lineRule="auto"/>
+        <w:jc w:val="both"/>
+        <w:rPr>
+          <w:b/>
+          <w:bCs/>
+          <w:szCs w:val="24"/>
+        </w:rPr>
+      </w:pPr>
+    </w:p>
+    <w:p>
+      <w:pPr>
+        <w:spacing w:line="360" w:lineRule="auto"/>
+        <w:jc w:val="both"/>
+        <w:rPr>
+          <w:b/>
+          <w:bCs/>
+          <w:szCs w:val="24"/>
+        </w:rPr>
+      </w:pPr>
+    </w:p>
+    <w:p>
+      <w:pPr>
+        <w:spacing w:line="360" w:lineRule="auto"/>
+        <w:jc w:val="both"/>
+        <w:rPr>
+          <w:b/>
+          <w:bCs/>
+          <w:szCs w:val="24"/>
+        </w:rPr>
+      </w:pPr>
     </w:p>
     <w:p>
       <w:pPr>
@@ -9252,340 +9697,23 @@
           <w:szCs w:val="24"/>
         </w:rPr>
         <w:lastRenderedPageBreak/>
-        <w:t>12 WIREFRAMES</w:t>
-      </w:r>
-    </w:p>
-    <w:p>
-      <w:pPr>
-        <w:spacing w:line="360" w:lineRule="auto"/>
-        <w:jc w:val="both"/>
-        <w:rPr>
-          <w:szCs w:val="24"/>
-        </w:rPr>
-      </w:pPr>
-      <w:r>
-        <w:rPr>
-          <w:szCs w:val="24"/>
-        </w:rPr>
-        <w:tab/>
-        <w:t xml:space="preserve">Antes do início do desenvolvimento, a equipe elaborou os </w:t>
-      </w:r>
-      <w:proofErr w:type="spellStart"/>
-      <w:r>
-        <w:rPr>
-          <w:szCs w:val="24"/>
-        </w:rPr>
-        <w:t>wireframes</w:t>
-      </w:r>
-      <w:proofErr w:type="spellEnd"/>
-      <w:r>
-        <w:rPr>
-          <w:szCs w:val="24"/>
-        </w:rPr>
-        <w:t xml:space="preserve"> faz principais telas do SIGEPI usando o </w:t>
-      </w:r>
-      <w:proofErr w:type="spellStart"/>
-      <w:r>
-        <w:rPr>
-          <w:szCs w:val="24"/>
-        </w:rPr>
-        <w:t>Figma</w:t>
-      </w:r>
-      <w:proofErr w:type="spellEnd"/>
-      <w:r>
-        <w:rPr>
-          <w:szCs w:val="24"/>
-        </w:rPr>
-        <w:t xml:space="preserve">. Os </w:t>
-      </w:r>
-      <w:proofErr w:type="spellStart"/>
-      <w:r>
-        <w:rPr>
-          <w:szCs w:val="24"/>
-        </w:rPr>
-        <w:t>wireframes</w:t>
-      </w:r>
-      <w:proofErr w:type="spellEnd"/>
-      <w:r>
-        <w:rPr>
-          <w:szCs w:val="24"/>
-        </w:rPr>
-        <w:t xml:space="preserve"> apresentam a estrutura visual e o fluxo de navegação do sistema, servindo como referência durante a implementação do front-end.</w:t>
-      </w:r>
-    </w:p>
-    <w:p>
-      <w:pPr>
-        <w:spacing w:line="360" w:lineRule="auto"/>
-        <w:jc w:val="both"/>
-        <w:rPr>
-          <w:szCs w:val="24"/>
-        </w:rPr>
-      </w:pPr>
-      <w:r>
-        <w:rPr>
-          <w:szCs w:val="24"/>
-        </w:rPr>
-        <w:tab/>
-        <w:t xml:space="preserve">As telas </w:t>
-      </w:r>
-      <w:proofErr w:type="spellStart"/>
-      <w:r>
-        <w:rPr>
-          <w:szCs w:val="24"/>
-        </w:rPr>
-        <w:t>prototipadas</w:t>
-      </w:r>
-      <w:proofErr w:type="spellEnd"/>
-      <w:r>
-        <w:rPr>
-          <w:szCs w:val="24"/>
-        </w:rPr>
-        <w:t xml:space="preserve"> incluem: tela de login com campo de e-mail, senha e validação por CAPTCHA; dashboard com indicadores de estoque, EPIs mais utilizados e alertas de validade; tela de gerenciamento de EPIs com listagem, cadastro e edição; tela de funcionários com cadastro e histórico de equipamentos recebidos; tela de registro de entrega e devolução de EPIs; e tela de relatórios com exportação em PDF.</w:t>
-      </w:r>
-    </w:p>
-    <w:p>
-      <w:pPr>
-        <w:spacing w:line="360" w:lineRule="auto"/>
-        <w:jc w:val="both"/>
-        <w:rPr>
-          <w:szCs w:val="24"/>
-        </w:rPr>
-      </w:pPr>
-      <w:r>
-        <w:rPr>
-          <w:szCs w:val="24"/>
-        </w:rPr>
-        <w:tab/>
-        <w:t>O protótipo foi desenvolvido com fidelidade à identidade visual definida, utilizando as cores, tipografia e componentes que serão implementados no sistema final. Isso permitiu validar a usabilidade e o fluxo das telas antes de qualquer implementação.</w:t>
-      </w:r>
-    </w:p>
-    <w:p>
-      <w:pPr>
-        <w:spacing w:line="360" w:lineRule="auto"/>
-        <w:jc w:val="both"/>
-        <w:rPr>
-          <w:b/>
-          <w:bCs/>
-          <w:szCs w:val="24"/>
-        </w:rPr>
-      </w:pPr>
-    </w:p>
-    <w:p>
-      <w:pPr>
-        <w:spacing w:line="360" w:lineRule="auto"/>
-        <w:jc w:val="both"/>
-        <w:rPr>
-          <w:b/>
-          <w:bCs/>
-          <w:szCs w:val="24"/>
-        </w:rPr>
-      </w:pPr>
-    </w:p>
-    <w:p>
-      <w:pPr>
-        <w:spacing w:line="360" w:lineRule="auto"/>
-        <w:jc w:val="both"/>
-        <w:rPr>
-          <w:b/>
-          <w:bCs/>
-          <w:szCs w:val="24"/>
-        </w:rPr>
-      </w:pPr>
-    </w:p>
-    <w:p>
-      <w:pPr>
-        <w:spacing w:line="360" w:lineRule="auto"/>
-        <w:jc w:val="both"/>
-        <w:rPr>
-          <w:b/>
-          <w:bCs/>
-          <w:szCs w:val="24"/>
-        </w:rPr>
-      </w:pPr>
-    </w:p>
-    <w:p>
-      <w:pPr>
-        <w:spacing w:line="360" w:lineRule="auto"/>
-        <w:jc w:val="both"/>
-        <w:rPr>
-          <w:b/>
-          <w:bCs/>
-          <w:szCs w:val="24"/>
-        </w:rPr>
-      </w:pPr>
-    </w:p>
-    <w:p>
-      <w:pPr>
-        <w:spacing w:line="360" w:lineRule="auto"/>
-        <w:jc w:val="both"/>
-        <w:rPr>
-          <w:b/>
-          <w:bCs/>
-          <w:szCs w:val="24"/>
-        </w:rPr>
-      </w:pPr>
-    </w:p>
-    <w:p>
-      <w:pPr>
-        <w:spacing w:line="360" w:lineRule="auto"/>
-        <w:jc w:val="both"/>
-        <w:rPr>
-          <w:b/>
-          <w:bCs/>
-          <w:szCs w:val="24"/>
-        </w:rPr>
-      </w:pPr>
-    </w:p>
-    <w:p>
-      <w:pPr>
-        <w:spacing w:line="360" w:lineRule="auto"/>
-        <w:jc w:val="both"/>
-        <w:rPr>
-          <w:b/>
-          <w:bCs/>
-          <w:szCs w:val="24"/>
-        </w:rPr>
-      </w:pPr>
-    </w:p>
-    <w:p>
-      <w:pPr>
-        <w:spacing w:line="360" w:lineRule="auto"/>
-        <w:jc w:val="both"/>
-        <w:rPr>
-          <w:b/>
-          <w:bCs/>
-          <w:szCs w:val="24"/>
-        </w:rPr>
-      </w:pPr>
-    </w:p>
-    <w:p>
-      <w:pPr>
-        <w:spacing w:line="360" w:lineRule="auto"/>
-        <w:jc w:val="both"/>
-        <w:rPr>
-          <w:b/>
-          <w:bCs/>
-          <w:szCs w:val="24"/>
-        </w:rPr>
-      </w:pPr>
-    </w:p>
-    <w:p>
-      <w:pPr>
-        <w:spacing w:line="360" w:lineRule="auto"/>
-        <w:jc w:val="both"/>
-        <w:rPr>
-          <w:b/>
-          <w:bCs/>
-          <w:szCs w:val="24"/>
-        </w:rPr>
-      </w:pPr>
-    </w:p>
-    <w:p>
-      <w:pPr>
-        <w:spacing w:line="360" w:lineRule="auto"/>
-        <w:jc w:val="both"/>
-        <w:rPr>
-          <w:b/>
-          <w:bCs/>
-          <w:szCs w:val="24"/>
-        </w:rPr>
-      </w:pPr>
-    </w:p>
-    <w:p>
-      <w:pPr>
-        <w:spacing w:line="360" w:lineRule="auto"/>
-        <w:jc w:val="both"/>
-        <w:rPr>
-          <w:b/>
-          <w:bCs/>
-          <w:szCs w:val="24"/>
-        </w:rPr>
-      </w:pPr>
-    </w:p>
-    <w:p>
-      <w:pPr>
-        <w:spacing w:line="360" w:lineRule="auto"/>
-        <w:jc w:val="both"/>
-        <w:rPr>
-          <w:b/>
-          <w:bCs/>
-          <w:szCs w:val="24"/>
-        </w:rPr>
-      </w:pPr>
-    </w:p>
-    <w:p>
-      <w:pPr>
-        <w:spacing w:line="360" w:lineRule="auto"/>
-        <w:jc w:val="both"/>
-        <w:rPr>
-          <w:b/>
-          <w:bCs/>
-          <w:szCs w:val="24"/>
-        </w:rPr>
-      </w:pPr>
-    </w:p>
-    <w:p>
-      <w:pPr>
-        <w:spacing w:line="360" w:lineRule="auto"/>
-        <w:jc w:val="both"/>
-        <w:rPr>
-          <w:b/>
-          <w:bCs/>
-          <w:szCs w:val="24"/>
-        </w:rPr>
-      </w:pPr>
-    </w:p>
-    <w:p>
-      <w:pPr>
-        <w:spacing w:line="360" w:lineRule="auto"/>
-        <w:jc w:val="both"/>
-        <w:rPr>
-          <w:b/>
-          <w:bCs/>
-          <w:szCs w:val="24"/>
-        </w:rPr>
-      </w:pPr>
-    </w:p>
-    <w:p>
-      <w:pPr>
-        <w:spacing w:line="360" w:lineRule="auto"/>
-        <w:jc w:val="both"/>
-        <w:rPr>
-          <w:b/>
-          <w:bCs/>
-          <w:szCs w:val="24"/>
-        </w:rPr>
-      </w:pPr>
-    </w:p>
-    <w:p>
-      <w:pPr>
-        <w:spacing w:line="360" w:lineRule="auto"/>
-        <w:jc w:val="both"/>
-        <w:rPr>
-          <w:b/>
-          <w:bCs/>
-          <w:szCs w:val="24"/>
-        </w:rPr>
-      </w:pPr>
-    </w:p>
-    <w:p>
-      <w:pPr>
-        <w:spacing w:line="360" w:lineRule="auto"/>
-        <w:jc w:val="both"/>
-        <w:rPr>
-          <w:b/>
-          <w:bCs/>
-          <w:szCs w:val="24"/>
-        </w:rPr>
-      </w:pPr>
-      <w:r>
-        <w:rPr>
-          <w:b/>
-          <w:bCs/>
-          <w:szCs w:val="24"/>
-        </w:rPr>
-        <w:lastRenderedPageBreak/>
-        <w:t>13 RESULTADOS ESPERADOS</w:t>
+        <w:t>1</w:t>
+      </w:r>
+      <w:r>
+        <w:rPr>
+          <w:b/>
+          <w:bCs/>
+          <w:szCs w:val="24"/>
+        </w:rPr>
+        <w:t>4</w:t>
+      </w:r>
+      <w:r>
+        <w:rPr>
+          <w:b/>
+          <w:bCs/>
+          <w:szCs w:val="24"/>
+        </w:rPr>
+        <w:t xml:space="preserve"> RESULTADOS ESPERADOS</w:t>
       </w:r>
     </w:p>
     <w:p>
@@ -9811,7 +9939,23 @@
           <w:szCs w:val="24"/>
         </w:rPr>
         <w:lastRenderedPageBreak/>
-        <w:t>14 PRÓXIMOS PASSOS</w:t>
+        <w:t>1</w:t>
+      </w:r>
+      <w:r>
+        <w:rPr>
+          <w:b/>
+          <w:bCs/>
+          <w:szCs w:val="24"/>
+        </w:rPr>
+        <w:t>5</w:t>
+      </w:r>
+      <w:r>
+        <w:rPr>
+          <w:b/>
+          <w:bCs/>
+          <w:szCs w:val="24"/>
+        </w:rPr>
+        <w:t xml:space="preserve"> PRÓXIMOS PASSOS</w:t>
       </w:r>
     </w:p>
     <w:p>
@@ -10073,7 +10217,23 @@
           <w:szCs w:val="24"/>
         </w:rPr>
         <w:lastRenderedPageBreak/>
-        <w:t>16 REFERÊNCIAS</w:t>
+        <w:t>1</w:t>
+      </w:r>
+      <w:r>
+        <w:rPr>
+          <w:b/>
+          <w:bCs/>
+          <w:szCs w:val="24"/>
+        </w:rPr>
+        <w:t>6</w:t>
+      </w:r>
+      <w:r>
+        <w:rPr>
+          <w:b/>
+          <w:bCs/>
+          <w:szCs w:val="24"/>
+        </w:rPr>
+        <w:t xml:space="preserve"> REFERÊNCIAS</w:t>
       </w:r>
     </w:p>
     <w:p>
@@ -11396,7 +11556,6 @@
   <w:style w:type="character" w:default="1" w:styleId="Fontepargpadro">
     <w:name w:val="Default Paragraph Font"/>
     <w:uiPriority w:val="1"/>
-    <w:semiHidden/>
     <w:unhideWhenUsed/>
   </w:style>
   <w:style w:type="table" w:default="1" w:styleId="Tabelanormal">

</xml_diff>